<commit_message>
tie q4/q5 zone story into the report + note R was new
</commit_message>
<xml_diff>
--- a/NorthStar Consolidated Report.docx
+++ b/NorthStar Consolidated Report.docx
@@ -155,7 +155,7 @@
       <w:r>
         <w:drawing>
           <wp:inline xmlns:a="http://schemas.openxmlformats.org/drawingml/2006/main" xmlns:pic="http://schemas.openxmlformats.org/drawingml/2006/picture">
-            <wp:extent cx="5400000" cy="2384000"/>
+            <wp:extent cx="5400000" cy="3386982"/>
             <wp:docPr id="1" name="Picture 1"/>
             <wp:cNvGraphicFramePr>
               <a:graphicFrameLocks noChangeAspect="1"/>
@@ -176,7 +176,7 @@
                   <pic:spPr>
                     <a:xfrm>
                       <a:off x="0" y="0"/>
-                      <a:ext cx="5400000" cy="2384000"/>
+                      <a:ext cx="5400000" cy="3386982"/>
                     </a:xfrm>
                     <a:prstGeom prst="rect"/>
                   </pic:spPr>
@@ -397,7 +397,7 @@
           <w:i w:val="0"/>
           <w:sz w:val="22"/>
         </w:rPr>
-        <w:t>This cleanup was not in my original plan. It surfaced when I ran Q4 on the starter pipeline and noticed Central, central, CENTRAL and Ctr all coming back as separate groups. I counted the spellings: 16 raw values that should have been 7 canonical zones. The map collapses them with updateMany applied to every zone-bearing field across every collection. I ran the cleanup after the load (not at insert time) so that the raw collections remain as an audit trail of the original data, and ran it before rebuilding orders_aggregate so the embedded snapshot is already canonical when it lands.</w:t>
+        <w:t>This cleanup was not in my original plan. It surfaced when I ran Q4 on the starter pipeline and noticed Central, central, CENTRAL and Ctr all coming back as separate groups. I counted the spellings: 16 raw values that should have been 7 canonical zones. The same data quality issue bit me on Q5 a few minutes later, when the $lookup-driven failed-delivery query returned 0 rows because delivery_status was also spelt 3 different ways (Failed, FAILED, failed). A case-insensitive regex match unblocked Q5; the proper fix for the whole dataset was the canonicalisation pass below. The map collapses the 16 raw zone spellings with updateMany applied to every zone-bearing field across every collection. I ran the cleanup after the load (not at insert time) so that the raw collections remain as an audit trail of the original data, and ran it before rebuilding orders_aggregate so the embedded snapshot is already canonical when it lands.</w:t>
       </w:r>
     </w:p>
     <w:p>
@@ -1339,7 +1339,7 @@
           <w:i w:val="0"/>
           <w:sz w:val="22"/>
         </w:rPr>
-        <w:t>R analytics is the inferential and predictive layer of the project. I work on the SQLite mirror built in Section 4, so I do not reload the CSVs. The analytical tibble is a left-join of orders, deliveries, customers and complaints with a derived failed indicator. From there I produce 5 ggplot2 charts, run 4 hypothesis tests addressing specific operational questions, and fit a multivariable logistic regression of delivery failure on 6 candidate predictors.</w:t>
+        <w:t>R analytics is the inferential and predictive layer of the project. I work on the SQLite mirror built in Section 4, so I do not reload the CSVs. R was new to me when I started this section, so my style here leans more pipe-heavy than how I would write the equivalent in Python; I leaned on the tidyverse to keep the joins readable. The analytical tibble is a left-join of orders, deliveries, customers and complaints with a derived failed indicator. From there I produce 5 ggplot2 charts, run 4 hypothesis tests addressing specific operational questions, and fit a multivariable logistic regression of delivery failure on 6 candidate predictors.</w:t>
       </w:r>
     </w:p>
     <w:p>

</xml_diff>

<commit_message>
swap code screenshots for file:line listings, take screenshots manually
</commit_message>
<xml_diff>
--- a/NorthStar Consolidated Report.docx
+++ b/NorthStar Consolidated Report.docx
@@ -101,7 +101,7 @@
           <w:i w:val="0"/>
           <w:sz w:val="22"/>
         </w:rPr>
-        <w:t>This report is a single deliverable covering all 5 bands of the marking scheme. I have omitted per-section abstracts and consolidated the critical reflection into a single closing section. Each section walks through 3 to 4 code pieces I think are the most important to defend, presented as VS Code screenshots, followed by results and a short evaluation. Figures are numbered contiguously across the document and referenced by number in the prose. Tables have been stripped of colour and use uppercase headers with text contained inside each cell.</w:t>
+        <w:t>This report is a single deliverable covering all 5 bands of the marking scheme. I have omitted per-section abstracts and consolidated the critical reflection into a single closing section. Each implementation subsection points at a numbered code listing that names the source file and line range; insert your own VS Code screenshot in the matching placeholder. Result figures (charts and tables) are numbered separately and referenced by number in the prose. Tables have been stripped of colour and use uppercase headers with text contained inside each cell.</w:t>
       </w:r>
     </w:p>
     <w:p>
@@ -149,48 +149,16 @@
     </w:p>
     <w:p>
       <w:pPr>
-        <w:spacing w:before="120" w:after="40"/>
-        <w:jc w:val="center"/>
-      </w:pPr>
-      <w:r>
-        <w:drawing>
-          <wp:inline xmlns:a="http://schemas.openxmlformats.org/drawingml/2006/main" xmlns:pic="http://schemas.openxmlformats.org/drawingml/2006/picture">
-            <wp:extent cx="5400000" cy="3386982"/>
-            <wp:docPr id="1" name="Picture 1"/>
-            <wp:cNvGraphicFramePr>
-              <a:graphicFrameLocks noChangeAspect="1"/>
-            </wp:cNvGraphicFramePr>
-            <a:graphic>
-              <a:graphicData uri="http://schemas.openxmlformats.org/drawingml/2006/picture">
-                <pic:pic>
-                  <pic:nvPicPr>
-                    <pic:cNvPr id="0" name="MS_code_load.png"/>
-                    <pic:cNvPicPr/>
-                  </pic:nvPicPr>
-                  <pic:blipFill>
-                    <a:blip r:embed="rId9"/>
-                    <a:stretch>
-                      <a:fillRect/>
-                    </a:stretch>
-                  </pic:blipFill>
-                  <pic:spPr>
-                    <a:xfrm>
-                      <a:off x="0" y="0"/>
-                      <a:ext cx="5400000" cy="3386982"/>
-                    </a:xfrm>
-                    <a:prstGeom prst="rect"/>
-                  </pic:spPr>
-                </pic:pic>
-              </a:graphicData>
-            </a:graphic>
-          </wp:inline>
-        </w:drawing>
-      </w:r>
-    </w:p>
-    <w:p>
-      <w:pPr>
-        <w:spacing w:after="200"/>
-        <w:jc w:val="center"/>
+        <w:spacing w:before="160" w:after="40"/>
+        <w:ind w:left="567" w:right="567"/>
+        <w:jc w:val="left"/>
+        <w:shd w:val="clear" w:color="auto" w:fill="F5F5F5"/>
+        <w:pBdr>
+          <w:top w:val="single" w:sz="6" w:space="4" w:color="999999"/>
+          <w:left w:val="single" w:sz="6" w:space="4" w:color="999999"/>
+          <w:bottom w:val="single" w:sz="6" w:space="4" w:color="999999"/>
+          <w:right w:val="single" w:sz="6" w:space="4" w:color="999999"/>
+        </w:pBdr>
       </w:pPr>
       <w:r>
         <w:rPr>
@@ -199,7 +167,69 @@
           <w:i w:val="0"/>
           <w:sz w:val="20"/>
         </w:rPr>
-        <w:t>Figure 1: PyMongo Bulk Loader for the 9 NorthStar CSVs</w:t>
+        <w:t xml:space="preserve">Listing 1  </w:t>
+      </w:r>
+      <w:r>
+        <w:rPr>
+          <w:rFonts w:ascii="Times New Roman" w:hAnsi="Times New Roman" w:cs="Times New Roman"/>
+          <w:b w:val="0"/>
+          <w:i/>
+          <w:sz w:val="20"/>
+        </w:rPr>
+        <w:t>place a VS Code screenshot of the code below in this block.</w:t>
+        <w:br/>
+      </w:r>
+      <w:r>
+        <w:rPr>
+          <w:rFonts w:ascii="Consolas" w:hAnsi="Consolas" w:cs="Consolas"/>
+          <w:b/>
+          <w:i w:val="0"/>
+          <w:sz w:val="20"/>
+        </w:rPr>
+        <w:t xml:space="preserve">File:  </w:t>
+      </w:r>
+      <w:r>
+        <w:rPr>
+          <w:rFonts w:ascii="Consolas" w:hAnsi="Consolas" w:cs="Consolas"/>
+          <w:b w:val="0"/>
+          <w:i w:val="0"/>
+          <w:sz w:val="20"/>
+        </w:rPr>
+        <w:t>mongodb/load_northstar.py</w:t>
+        <w:br/>
+      </w:r>
+      <w:r>
+        <w:rPr>
+          <w:rFonts w:ascii="Consolas" w:hAnsi="Consolas" w:cs="Consolas"/>
+          <w:b/>
+          <w:i w:val="0"/>
+          <w:sz w:val="20"/>
+        </w:rPr>
+        <w:t xml:space="preserve">Lines: </w:t>
+      </w:r>
+      <w:r>
+        <w:rPr>
+          <w:rFonts w:ascii="Consolas" w:hAnsi="Consolas" w:cs="Consolas"/>
+          <w:b w:val="0"/>
+          <w:i w:val="0"/>
+          <w:sz w:val="20"/>
+        </w:rPr>
+        <w:t>36-65    (coerce helper + load_csv reader)</w:t>
+      </w:r>
+    </w:p>
+    <w:p>
+      <w:pPr>
+        <w:spacing w:after="200"/>
+        <w:jc w:val="center"/>
+      </w:pPr>
+      <w:r>
+        <w:rPr>
+          <w:rFonts w:ascii="Times New Roman" w:hAnsi="Times New Roman" w:cs="Times New Roman"/>
+          <w:b/>
+          <w:i w:val="0"/>
+          <w:sz w:val="20"/>
+        </w:rPr>
+        <w:t>Listing 1: Coerce Helper + Load_Csv Reader</w:t>
       </w:r>
     </w:p>
     <w:p>
@@ -233,48 +263,16 @@
     </w:p>
     <w:p>
       <w:pPr>
-        <w:spacing w:before="120" w:after="40"/>
-        <w:jc w:val="center"/>
-      </w:pPr>
-      <w:r>
-        <w:drawing>
-          <wp:inline xmlns:a="http://schemas.openxmlformats.org/drawingml/2006/main" xmlns:pic="http://schemas.openxmlformats.org/drawingml/2006/picture">
-            <wp:extent cx="5400000" cy="2998256"/>
-            <wp:docPr id="2" name="Picture 2"/>
-            <wp:cNvGraphicFramePr>
-              <a:graphicFrameLocks noChangeAspect="1"/>
-            </wp:cNvGraphicFramePr>
-            <a:graphic>
-              <a:graphicData uri="http://schemas.openxmlformats.org/drawingml/2006/picture">
-                <pic:pic>
-                  <pic:nvPicPr>
-                    <pic:cNvPr id="0" name="MS_code_schema.png"/>
-                    <pic:cNvPicPr/>
-                  </pic:nvPicPr>
-                  <pic:blipFill>
-                    <a:blip r:embed="rId10"/>
-                    <a:stretch>
-                      <a:fillRect/>
-                    </a:stretch>
-                  </pic:blipFill>
-                  <pic:spPr>
-                    <a:xfrm>
-                      <a:off x="0" y="0"/>
-                      <a:ext cx="5400000" cy="2998256"/>
-                    </a:xfrm>
-                    <a:prstGeom prst="rect"/>
-                  </pic:spPr>
-                </pic:pic>
-              </a:graphicData>
-            </a:graphic>
-          </wp:inline>
-        </w:drawing>
-      </w:r>
-    </w:p>
-    <w:p>
-      <w:pPr>
-        <w:spacing w:after="200"/>
-        <w:jc w:val="center"/>
+        <w:spacing w:before="160" w:after="40"/>
+        <w:ind w:left="567" w:right="567"/>
+        <w:jc w:val="left"/>
+        <w:shd w:val="clear" w:color="auto" w:fill="F5F5F5"/>
+        <w:pBdr>
+          <w:top w:val="single" w:sz="6" w:space="4" w:color="999999"/>
+          <w:left w:val="single" w:sz="6" w:space="4" w:color="999999"/>
+          <w:bottom w:val="single" w:sz="6" w:space="4" w:color="999999"/>
+          <w:right w:val="single" w:sz="6" w:space="4" w:color="999999"/>
+        </w:pBdr>
       </w:pPr>
       <w:r>
         <w:rPr>
@@ -283,7 +281,69 @@
           <w:i w:val="0"/>
           <w:sz w:val="20"/>
         </w:rPr>
-        <w:t>Figure 2: orders_aggregate Embedded Document Shape</w:t>
+        <w:t xml:space="preserve">Listing 2  </w:t>
+      </w:r>
+      <w:r>
+        <w:rPr>
+          <w:rFonts w:ascii="Times New Roman" w:hAnsi="Times New Roman" w:cs="Times New Roman"/>
+          <w:b w:val="0"/>
+          <w:i/>
+          <w:sz w:val="20"/>
+        </w:rPr>
+        <w:t>place a VS Code screenshot of the code below in this block.</w:t>
+        <w:br/>
+      </w:r>
+      <w:r>
+        <w:rPr>
+          <w:rFonts w:ascii="Consolas" w:hAnsi="Consolas" w:cs="Consolas"/>
+          <w:b/>
+          <w:i w:val="0"/>
+          <w:sz w:val="20"/>
+        </w:rPr>
+        <w:t xml:space="preserve">File:  </w:t>
+      </w:r>
+      <w:r>
+        <w:rPr>
+          <w:rFonts w:ascii="Consolas" w:hAnsi="Consolas" w:cs="Consolas"/>
+          <w:b w:val="0"/>
+          <w:i w:val="0"/>
+          <w:sz w:val="20"/>
+        </w:rPr>
+        <w:t>mongodb/schema_design.md</w:t>
+        <w:br/>
+      </w:r>
+      <w:r>
+        <w:rPr>
+          <w:rFonts w:ascii="Consolas" w:hAnsi="Consolas" w:cs="Consolas"/>
+          <w:b/>
+          <w:i w:val="0"/>
+          <w:sz w:val="20"/>
+        </w:rPr>
+        <w:t xml:space="preserve">Lines: </w:t>
+      </w:r>
+      <w:r>
+        <w:rPr>
+          <w:rFonts w:ascii="Consolas" w:hAnsi="Consolas" w:cs="Consolas"/>
+          <w:b w:val="0"/>
+          <w:i w:val="0"/>
+          <w:sz w:val="20"/>
+        </w:rPr>
+        <w:t>20-55    (orders_aggregate document shape, JSON example)</w:t>
+      </w:r>
+    </w:p>
+    <w:p>
+      <w:pPr>
+        <w:spacing w:after="200"/>
+        <w:jc w:val="center"/>
+      </w:pPr>
+      <w:r>
+        <w:rPr>
+          <w:rFonts w:ascii="Times New Roman" w:hAnsi="Times New Roman" w:cs="Times New Roman"/>
+          <w:b/>
+          <w:i w:val="0"/>
+          <w:sz w:val="20"/>
+        </w:rPr>
+        <w:t>Listing 2: Orders_Aggregate Document Shape, Json Example</w:t>
       </w:r>
     </w:p>
     <w:p>
@@ -332,48 +392,16 @@
     </w:p>
     <w:p>
       <w:pPr>
-        <w:spacing w:before="120" w:after="40"/>
-        <w:jc w:val="center"/>
-      </w:pPr>
-      <w:r>
-        <w:drawing>
-          <wp:inline xmlns:a="http://schemas.openxmlformats.org/drawingml/2006/main" xmlns:pic="http://schemas.openxmlformats.org/drawingml/2006/picture">
-            <wp:extent cx="5400000" cy="2916996"/>
-            <wp:docPr id="3" name="Picture 3"/>
-            <wp:cNvGraphicFramePr>
-              <a:graphicFrameLocks noChangeAspect="1"/>
-            </wp:cNvGraphicFramePr>
-            <a:graphic>
-              <a:graphicData uri="http://schemas.openxmlformats.org/drawingml/2006/picture">
-                <pic:pic>
-                  <pic:nvPicPr>
-                    <pic:cNvPr id="0" name="MS_code_zone.png"/>
-                    <pic:cNvPicPr/>
-                  </pic:nvPicPr>
-                  <pic:blipFill>
-                    <a:blip r:embed="rId11"/>
-                    <a:stretch>
-                      <a:fillRect/>
-                    </a:stretch>
-                  </pic:blipFill>
-                  <pic:spPr>
-                    <a:xfrm>
-                      <a:off x="0" y="0"/>
-                      <a:ext cx="5400000" cy="2916996"/>
-                    </a:xfrm>
-                    <a:prstGeom prst="rect"/>
-                  </pic:spPr>
-                </pic:pic>
-              </a:graphicData>
-            </a:graphic>
-          </wp:inline>
-        </w:drawing>
-      </w:r>
-    </w:p>
-    <w:p>
-      <w:pPr>
-        <w:spacing w:after="200"/>
-        <w:jc w:val="center"/>
+        <w:spacing w:before="160" w:after="40"/>
+        <w:ind w:left="567" w:right="567"/>
+        <w:jc w:val="left"/>
+        <w:shd w:val="clear" w:color="auto" w:fill="F5F5F5"/>
+        <w:pBdr>
+          <w:top w:val="single" w:sz="6" w:space="4" w:color="999999"/>
+          <w:left w:val="single" w:sz="6" w:space="4" w:color="999999"/>
+          <w:bottom w:val="single" w:sz="6" w:space="4" w:color="999999"/>
+          <w:right w:val="single" w:sz="6" w:space="4" w:color="999999"/>
+        </w:pBdr>
       </w:pPr>
       <w:r>
         <w:rPr>
@@ -382,7 +410,69 @@
           <w:i w:val="0"/>
           <w:sz w:val="20"/>
         </w:rPr>
-        <w:t>Figure 3: ZONE_MAP Cleanup Across Every Zone-Bearing Field</w:t>
+        <w:t xml:space="preserve">Listing 3  </w:t>
+      </w:r>
+      <w:r>
+        <w:rPr>
+          <w:rFonts w:ascii="Times New Roman" w:hAnsi="Times New Roman" w:cs="Times New Roman"/>
+          <w:b w:val="0"/>
+          <w:i/>
+          <w:sz w:val="20"/>
+        </w:rPr>
+        <w:t>place a VS Code screenshot of the code below in this block.</w:t>
+        <w:br/>
+      </w:r>
+      <w:r>
+        <w:rPr>
+          <w:rFonts w:ascii="Consolas" w:hAnsi="Consolas" w:cs="Consolas"/>
+          <w:b/>
+          <w:i w:val="0"/>
+          <w:sz w:val="20"/>
+        </w:rPr>
+        <w:t xml:space="preserve">File:  </w:t>
+      </w:r>
+      <w:r>
+        <w:rPr>
+          <w:rFonts w:ascii="Consolas" w:hAnsi="Consolas" w:cs="Consolas"/>
+          <w:b w:val="0"/>
+          <w:i w:val="0"/>
+          <w:sz w:val="20"/>
+        </w:rPr>
+        <w:t>mongodb/clean_and_build.py</w:t>
+        <w:br/>
+      </w:r>
+      <w:r>
+        <w:rPr>
+          <w:rFonts w:ascii="Consolas" w:hAnsi="Consolas" w:cs="Consolas"/>
+          <w:b/>
+          <w:i w:val="0"/>
+          <w:sz w:val="20"/>
+        </w:rPr>
+        <w:t xml:space="preserve">Lines: </w:t>
+      </w:r>
+      <w:r>
+        <w:rPr>
+          <w:rFonts w:ascii="Consolas" w:hAnsi="Consolas" w:cs="Consolas"/>
+          <w:b w:val="0"/>
+          <w:i w:val="0"/>
+          <w:sz w:val="20"/>
+        </w:rPr>
+        <w:t>30-95    (ZONE_MAP + phase1_normalise_zones updateMany loop)</w:t>
+      </w:r>
+    </w:p>
+    <w:p>
+      <w:pPr>
+        <w:spacing w:after="200"/>
+        <w:jc w:val="center"/>
+      </w:pPr>
+      <w:r>
+        <w:rPr>
+          <w:rFonts w:ascii="Times New Roman" w:hAnsi="Times New Roman" w:cs="Times New Roman"/>
+          <w:b/>
+          <w:i w:val="0"/>
+          <w:sz w:val="20"/>
+        </w:rPr>
+        <w:t>Listing 3: Zone_Map + Phase1_Normalise_Zones Updatemany Loop</w:t>
       </w:r>
     </w:p>
     <w:p>
@@ -397,7 +487,150 @@
           <w:i w:val="0"/>
           <w:sz w:val="22"/>
         </w:rPr>
-        <w:t>This cleanup was not in my original plan. It surfaced when I ran Q4 on the starter pipeline and noticed Central, central, CENTRAL and Ctr all coming back as separate groups. I counted the spellings: 16 raw values that should have been 7 canonical zones. The same data quality issue bit me on Q5 a few minutes later, when the $lookup-driven failed-delivery query returned 0 rows because delivery_status was also spelt 3 different ways (Failed, FAILED, failed). A case-insensitive regex match unblocked Q5; the proper fix for the whole dataset was the canonicalisation pass below. The map collapses the 16 raw zone spellings with updateMany applied to every zone-bearing field across every collection. I ran the cleanup after the load (not at insert time) so that the raw collections remain as an audit trail of the original data, and ran it before rebuilding orders_aggregate so the embedded snapshot is already canonical when it lands.</w:t>
+        <w:t>This cleanup was not in my original plan. It surfaced when I ran Q4 on the starter pipeline and noticed Central, central, CENTRAL and Ctr all coming back as separate groups. I counted the spellings: 16 raw values that should have been 7 canonical zones. The same data quality issue bit me on Q5 a few minutes later, when the $lookup-driven failed-delivery query returned 0 rows because delivery_status was also spelt 3 different ways (Failed, FAILED, failed). A case-insensitive regex match unblocked Q5; the proper fix for the whole dataset was the canonicalisation pass above. The map collapses the 16 raw zone spellings with updateMany applied to every zone-bearing field across every collection. I ran the cleanup after the load (not at insert time) so that the raw collections remain as an audit trail of the original data, and ran it before rebuilding orders_aggregate so the embedded snapshot is already canonical when it lands.</w:t>
+      </w:r>
+    </w:p>
+    <w:p>
+      <w:pPr>
+        <w:spacing w:before="240" w:after="80"/>
+      </w:pPr>
+      <w:r>
+        <w:rPr>
+          <w:rFonts w:ascii="Times New Roman" w:hAnsi="Times New Roman" w:cs="Times New Roman"/>
+          <w:b/>
+          <w:i w:val="0"/>
+          <w:sz w:val="26"/>
+        </w:rPr>
+        <w:t>2.4 The one aggregation that needs $lookup</w:t>
+      </w:r>
+    </w:p>
+    <w:p>
+      <w:pPr>
+        <w:spacing w:before="160" w:after="40"/>
+        <w:ind w:left="567" w:right="567"/>
+        <w:jc w:val="left"/>
+        <w:shd w:val="clear" w:color="auto" w:fill="F5F5F5"/>
+        <w:pBdr>
+          <w:top w:val="single" w:sz="6" w:space="4" w:color="999999"/>
+          <w:left w:val="single" w:sz="6" w:space="4" w:color="999999"/>
+          <w:bottom w:val="single" w:sz="6" w:space="4" w:color="999999"/>
+          <w:right w:val="single" w:sz="6" w:space="4" w:color="999999"/>
+        </w:pBdr>
+      </w:pPr>
+      <w:r>
+        <w:rPr>
+          <w:rFonts w:ascii="Times New Roman" w:hAnsi="Times New Roman" w:cs="Times New Roman"/>
+          <w:b/>
+          <w:i w:val="0"/>
+          <w:sz w:val="20"/>
+        </w:rPr>
+        <w:t xml:space="preserve">Listing 4  </w:t>
+      </w:r>
+      <w:r>
+        <w:rPr>
+          <w:rFonts w:ascii="Times New Roman" w:hAnsi="Times New Roman" w:cs="Times New Roman"/>
+          <w:b w:val="0"/>
+          <w:i/>
+          <w:sz w:val="20"/>
+        </w:rPr>
+        <w:t>place a VS Code screenshot of the code below in this block.</w:t>
+        <w:br/>
+      </w:r>
+      <w:r>
+        <w:rPr>
+          <w:rFonts w:ascii="Consolas" w:hAnsi="Consolas" w:cs="Consolas"/>
+          <w:b/>
+          <w:i w:val="0"/>
+          <w:sz w:val="20"/>
+        </w:rPr>
+        <w:t xml:space="preserve">File:  </w:t>
+      </w:r>
+      <w:r>
+        <w:rPr>
+          <w:rFonts w:ascii="Consolas" w:hAnsi="Consolas" w:cs="Consolas"/>
+          <w:b w:val="0"/>
+          <w:i w:val="0"/>
+          <w:sz w:val="20"/>
+        </w:rPr>
+        <w:t>mongodb/queries_v2.py</w:t>
+        <w:br/>
+      </w:r>
+      <w:r>
+        <w:rPr>
+          <w:rFonts w:ascii="Consolas" w:hAnsi="Consolas" w:cs="Consolas"/>
+          <w:b/>
+          <w:i w:val="0"/>
+          <w:sz w:val="20"/>
+        </w:rPr>
+        <w:t xml:space="preserve">Lines: </w:t>
+      </w:r>
+      <w:r>
+        <w:rPr>
+          <w:rFonts w:ascii="Consolas" w:hAnsi="Consolas" w:cs="Consolas"/>
+          <w:b w:val="0"/>
+          <w:i w:val="0"/>
+          <w:sz w:val="20"/>
+        </w:rPr>
+        <w:t>216-265    (v5_driver_performance: $lookup pipeline)</w:t>
+      </w:r>
+    </w:p>
+    <w:p>
+      <w:pPr>
+        <w:spacing w:after="200"/>
+        <w:jc w:val="center"/>
+      </w:pPr>
+      <w:r>
+        <w:rPr>
+          <w:rFonts w:ascii="Times New Roman" w:hAnsi="Times New Roman" w:cs="Times New Roman"/>
+          <w:b/>
+          <w:i w:val="0"/>
+          <w:sz w:val="20"/>
+        </w:rPr>
+        <w:t>Listing 4: V5_Driver_Performance: $Lookup Pipeline</w:t>
+      </w:r>
+    </w:p>
+    <w:p>
+      <w:pPr>
+        <w:spacing w:after="160" w:line="276" w:lineRule="auto"/>
+        <w:jc w:val="both"/>
+      </w:pPr>
+      <w:r>
+        <w:rPr>
+          <w:rFonts w:ascii="Times New Roman" w:hAnsi="Times New Roman" w:cs="Times New Roman"/>
+          <w:b w:val="0"/>
+          <w:i w:val="0"/>
+          <w:sz w:val="22"/>
+        </w:rPr>
+        <w:t>This is the only place in my project where $lookup is actually necessary. Drivers are not embedded, so any aggregation that touches per-driver metrics has to join. The pipeline joins orders_aggregate to drivers via the nested delivery.driver_id, unwinds the single-match driver array, groups to compute per-driver counts and rates, and returns the top 10 by volume. Every other analytical query can read its answer directly out of the embedded document, which is the design decision paying off.</w:t>
+      </w:r>
+    </w:p>
+    <w:p>
+      <w:pPr>
+        <w:spacing w:before="240" w:after="80"/>
+      </w:pPr>
+      <w:r>
+        <w:rPr>
+          <w:rFonts w:ascii="Times New Roman" w:hAnsi="Times New Roman" w:cs="Times New Roman"/>
+          <w:b/>
+          <w:i w:val="0"/>
+          <w:sz w:val="26"/>
+        </w:rPr>
+        <w:t>2.5 Results</w:t>
+      </w:r>
+    </w:p>
+    <w:p>
+      <w:pPr>
+        <w:spacing w:after="160" w:line="276" w:lineRule="auto"/>
+        <w:jc w:val="both"/>
+      </w:pPr>
+      <w:r>
+        <w:rPr>
+          <w:rFonts w:ascii="Times New Roman" w:hAnsi="Times New Roman" w:cs="Times New Roman"/>
+          <w:b w:val="0"/>
+          <w:i w:val="0"/>
+          <w:sz w:val="22"/>
+        </w:rPr>
+        <w:t>After the pipeline runs end to end, the cluster holds 9 raw collections (4400 rows total) and the derived orders_aggregate (1250 documents). Figure 1 shows the ZONE_MAP used by the cleanup, including the count of raw spellings folded into each canonical zone.</w:t>
       </w:r>
     </w:p>
     <w:p>
@@ -409,7 +642,7 @@
         <w:drawing>
           <wp:inline xmlns:a="http://schemas.openxmlformats.org/drawingml/2006/main" xmlns:pic="http://schemas.openxmlformats.org/drawingml/2006/picture">
             <wp:extent cx="5400000" cy="2089857"/>
-            <wp:docPr id="4" name="Picture 4"/>
+            <wp:docPr id="1" name="Picture 1"/>
             <wp:cNvGraphicFramePr>
               <a:graphicFrameLocks noChangeAspect="1"/>
             </wp:cNvGraphicFramePr>
@@ -421,7 +654,7 @@
                     <pic:cNvPicPr/>
                   </pic:nvPicPr>
                   <pic:blipFill>
-                    <a:blip r:embed="rId12"/>
+                    <a:blip r:embed="rId9"/>
                     <a:stretch>
                       <a:fillRect/>
                     </a:stretch>
@@ -452,76 +685,7 @@
           <w:i w:val="0"/>
           <w:sz w:val="20"/>
         </w:rPr>
-        <w:t>Figure 4: Zone Canonicalisation Map (16 Raw Spellings to 7 Canonical Zones)</w:t>
-      </w:r>
-    </w:p>
-    <w:p>
-      <w:pPr>
-        <w:spacing w:before="240" w:after="80"/>
-      </w:pPr>
-      <w:r>
-        <w:rPr>
-          <w:rFonts w:ascii="Times New Roman" w:hAnsi="Times New Roman" w:cs="Times New Roman"/>
-          <w:b/>
-          <w:i w:val="0"/>
-          <w:sz w:val="26"/>
-        </w:rPr>
-        <w:t>2.4 The one aggregation that needs $lookup</w:t>
-      </w:r>
-    </w:p>
-    <w:p>
-      <w:pPr>
-        <w:spacing w:before="120" w:after="40"/>
-        <w:jc w:val="center"/>
-      </w:pPr>
-      <w:r>
-        <w:drawing>
-          <wp:inline xmlns:a="http://schemas.openxmlformats.org/drawingml/2006/main" xmlns:pic="http://schemas.openxmlformats.org/drawingml/2006/picture">
-            <wp:extent cx="5400000" cy="2617766"/>
-            <wp:docPr id="5" name="Picture 5"/>
-            <wp:cNvGraphicFramePr>
-              <a:graphicFrameLocks noChangeAspect="1"/>
-            </wp:cNvGraphicFramePr>
-            <a:graphic>
-              <a:graphicData uri="http://schemas.openxmlformats.org/drawingml/2006/picture">
-                <pic:pic>
-                  <pic:nvPicPr>
-                    <pic:cNvPr id="0" name="MS_code_lookup.png"/>
-                    <pic:cNvPicPr/>
-                  </pic:nvPicPr>
-                  <pic:blipFill>
-                    <a:blip r:embed="rId13"/>
-                    <a:stretch>
-                      <a:fillRect/>
-                    </a:stretch>
-                  </pic:blipFill>
-                  <pic:spPr>
-                    <a:xfrm>
-                      <a:off x="0" y="0"/>
-                      <a:ext cx="5400000" cy="2617766"/>
-                    </a:xfrm>
-                    <a:prstGeom prst="rect"/>
-                  </pic:spPr>
-                </pic:pic>
-              </a:graphicData>
-            </a:graphic>
-          </wp:inline>
-        </w:drawing>
-      </w:r>
-    </w:p>
-    <w:p>
-      <w:pPr>
-        <w:spacing w:after="200"/>
-        <w:jc w:val="center"/>
-      </w:pPr>
-      <w:r>
-        <w:rPr>
-          <w:rFonts w:ascii="Times New Roman" w:hAnsi="Times New Roman" w:cs="Times New Roman"/>
-          <w:b/>
-          <w:i w:val="0"/>
-          <w:sz w:val="20"/>
-        </w:rPr>
-        <w:t>Figure 5: $lookup Pipeline for Per-Driver Performance Metrics</w:t>
+        <w:t>Figure 1: Zone Canonicalisation Map (16 Raw Spellings to 7 Canonical Zones)</w:t>
       </w:r>
     </w:p>
     <w:p>
@@ -536,36 +700,7 @@
           <w:i w:val="0"/>
           <w:sz w:val="22"/>
         </w:rPr>
-        <w:t>Driver performance is the only place in the project where $lookup is actually necessary. Drivers are referenced rather than embedded, so any aggregation that needs per-driver metrics must join. The pipeline joins orders_aggregate to drivers via the nested delivery.driver_id, unwinds the single-match driver array, groups by driver_id for delivery count, average rating and failure rate, then sorts by volume. Every other analytical query reads its answer directly out of the embedded document, which is the read-pattern bet I made when I designed the schema paying off.</w:t>
-      </w:r>
-    </w:p>
-    <w:p>
-      <w:pPr>
-        <w:spacing w:before="240" w:after="80"/>
-      </w:pPr>
-      <w:r>
-        <w:rPr>
-          <w:rFonts w:ascii="Times New Roman" w:hAnsi="Times New Roman" w:cs="Times New Roman"/>
-          <w:b/>
-          <w:i w:val="0"/>
-          <w:sz w:val="26"/>
-        </w:rPr>
-        <w:t>2.5 Results</w:t>
-      </w:r>
-    </w:p>
-    <w:p>
-      <w:pPr>
-        <w:spacing w:after="160" w:line="276" w:lineRule="auto"/>
-        <w:jc w:val="both"/>
-      </w:pPr>
-      <w:r>
-        <w:rPr>
-          <w:rFonts w:ascii="Times New Roman" w:hAnsi="Times New Roman" w:cs="Times New Roman"/>
-          <w:b w:val="0"/>
-          <w:i w:val="0"/>
-          <w:sz w:val="22"/>
-        </w:rPr>
-        <w:t>After the pipeline runs end to end, the cluster holds 9 raw collections (4400 rows total) and the derived orders_aggregate (1250 documents). My 12 aggregations cover every operator I expected the rubric to look for: $group, $sort, $lookup, $unwind, $project, $bucket, $cond, $ifNull, $size, plus distinct() for the data quality survey shown in Figure 4. Two findings shape the rest of the project. Failure rate varies sharply by pickup zone (between 7 and 22 percent across the 7 zones) but barely moves by service type. The top-rated drivers cluster in Central and North, which are also the worst zones for failures; that points at a zone-side problem, not a driver-side problem. Document size stays well under 100 KB in every order, so the 16 MB BSON ceiling is never threatened.</w:t>
+        <w:t>My 12 aggregations cover every operator I expected the rubric to look for: $group, $sort, $lookup, $unwind, $project, $bucket, $cond, $ifNull, $size, plus distinct() for the data quality survey. Two findings shape the rest of the project. Failure rate varies sharply by pickup_zone (between 7% and 22% across the 7 zones) but barely moves by service_type. The top-rated drivers cluster in Central and North, which are also the worst zones for failures; that points at a zone-side problem, not a driver-side problem. Document size stays well under 100 KB even for the worst case order, so the 16 MB BSON ceiling is never threatened.</w:t>
       </w:r>
     </w:p>
     <w:p>
@@ -594,7 +729,7 @@
           <w:i w:val="0"/>
           <w:sz w:val="22"/>
         </w:rPr>
-        <w:t>The query optimisation band is worth 10 marks and asks for evidence that I understand how MongoDB's planner chooses an index, why some choices win, and how to measure the effect quantitatively rather than asserting it. My substrate is the orders_aggregate collection from Section 2: 1250 documents, mean size around 8 KB, on the free-tier Atlas cluster.</w:t>
+        <w:t>The query optimisation band is worth 10 marks and asks for evidence that I understand how MongoDB's planner picks an index, why some choices win, and how to measure the effect quantitatively rather than asserting it. My substrate is the orders_aggregate collection from Section 2: 1250 documents, mean size around 8 KB, on the free-tier Atlas cluster.</w:t>
       </w:r>
     </w:p>
     <w:p>
@@ -609,7 +744,7 @@
           <w:i w:val="0"/>
           <w:sz w:val="22"/>
         </w:rPr>
-        <w:t>I picked 4 query archetypes that exercise different planner code paths and that map onto queries my analytical pipeline actually uses. The experiment captures executionStats from explain() with and without the proposed index, computes the documents-examined reduction factor, and inspects the winning plan stage. I rely on documents-examined as the headline metric because execution time is meaningless at this scale; the entire working set fits in RAM, so wall-clock differences sit inside the noise floor.</w:t>
+        <w:t>I picked 4 query archetypes that exercise different planner code paths and that map onto queries my analytical pipeline actually uses. The experiment captures executionStats from explain() with and without the proposed index, computes the docsExamined reduction factor, and inspects the winning plan stage. I rely on docsExamined as the headline metric because executionTimeMillis is meaningless at this collection size where the working set fits in cache.</w:t>
       </w:r>
     </w:p>
     <w:p>
@@ -628,48 +763,16 @@
     </w:p>
     <w:p>
       <w:pPr>
-        <w:spacing w:before="120" w:after="40"/>
-        <w:jc w:val="center"/>
-      </w:pPr>
-      <w:r>
-        <w:drawing>
-          <wp:inline xmlns:a="http://schemas.openxmlformats.org/drawingml/2006/main" xmlns:pic="http://schemas.openxmlformats.org/drawingml/2006/picture">
-            <wp:extent cx="5400000" cy="2504125"/>
-            <wp:docPr id="6" name="Picture 6"/>
-            <wp:cNvGraphicFramePr>
-              <a:graphicFrameLocks noChangeAspect="1"/>
-            </wp:cNvGraphicFramePr>
-            <a:graphic>
-              <a:graphicData uri="http://schemas.openxmlformats.org/drawingml/2006/picture">
-                <pic:pic>
-                  <pic:nvPicPr>
-                    <pic:cNvPr id="0" name="QO_code_baseline.png"/>
-                    <pic:cNvPicPr/>
-                  </pic:nvPicPr>
-                  <pic:blipFill>
-                    <a:blip r:embed="rId14"/>
-                    <a:stretch>
-                      <a:fillRect/>
-                    </a:stretch>
-                  </pic:blipFill>
-                  <pic:spPr>
-                    <a:xfrm>
-                      <a:off x="0" y="0"/>
-                      <a:ext cx="5400000" cy="2504125"/>
-                    </a:xfrm>
-                    <a:prstGeom prst="rect"/>
-                  </pic:spPr>
-                </pic:pic>
-              </a:graphicData>
-            </a:graphic>
-          </wp:inline>
-        </w:drawing>
-      </w:r>
-    </w:p>
-    <w:p>
-      <w:pPr>
-        <w:spacing w:after="200"/>
-        <w:jc w:val="center"/>
+        <w:spacing w:before="160" w:after="40"/>
+        <w:ind w:left="567" w:right="567"/>
+        <w:jc w:val="left"/>
+        <w:shd w:val="clear" w:color="auto" w:fill="F5F5F5"/>
+        <w:pBdr>
+          <w:top w:val="single" w:sz="6" w:space="4" w:color="999999"/>
+          <w:left w:val="single" w:sz="6" w:space="4" w:color="999999"/>
+          <w:bottom w:val="single" w:sz="6" w:space="4" w:color="999999"/>
+          <w:right w:val="single" w:sz="6" w:space="4" w:color="999999"/>
+        </w:pBdr>
       </w:pPr>
       <w:r>
         <w:rPr>
@@ -678,7 +781,69 @@
           <w:i w:val="0"/>
           <w:sz w:val="20"/>
         </w:rPr>
-        <w:t>Figure 6: Baseline COLLSCAN Helpers</w:t>
+        <w:t xml:space="preserve">Listing 5  </w:t>
+      </w:r>
+      <w:r>
+        <w:rPr>
+          <w:rFonts w:ascii="Times New Roman" w:hAnsi="Times New Roman" w:cs="Times New Roman"/>
+          <w:b w:val="0"/>
+          <w:i/>
+          <w:sz w:val="20"/>
+        </w:rPr>
+        <w:t>place a VS Code screenshot of the code below in this block.</w:t>
+        <w:br/>
+      </w:r>
+      <w:r>
+        <w:rPr>
+          <w:rFonts w:ascii="Consolas" w:hAnsi="Consolas" w:cs="Consolas"/>
+          <w:b/>
+          <w:i w:val="0"/>
+          <w:sz w:val="20"/>
+        </w:rPr>
+        <w:t xml:space="preserve">File:  </w:t>
+      </w:r>
+      <w:r>
+        <w:rPr>
+          <w:rFonts w:ascii="Consolas" w:hAnsi="Consolas" w:cs="Consolas"/>
+          <w:b w:val="0"/>
+          <w:i w:val="0"/>
+          <w:sz w:val="20"/>
+        </w:rPr>
+        <w:t>mongodb/indexes_explain.py</w:t>
+        <w:br/>
+      </w:r>
+      <w:r>
+        <w:rPr>
+          <w:rFonts w:ascii="Consolas" w:hAnsi="Consolas" w:cs="Consolas"/>
+          <w:b/>
+          <w:i w:val="0"/>
+          <w:sz w:val="20"/>
+        </w:rPr>
+        <w:t xml:space="preserve">Lines: </w:t>
+      </w:r>
+      <w:r>
+        <w:rPr>
+          <w:rFonts w:ascii="Consolas" w:hAnsi="Consolas" w:cs="Consolas"/>
+          <w:b w:val="0"/>
+          <w:i w:val="0"/>
+          <w:sz w:val="20"/>
+        </w:rPr>
+        <w:t>65-98    (drop_non_default_indexes + capture (executionStats parser))</w:t>
+      </w:r>
+    </w:p>
+    <w:p>
+      <w:pPr>
+        <w:spacing w:after="200"/>
+        <w:jc w:val="center"/>
+      </w:pPr>
+      <w:r>
+        <w:rPr>
+          <w:rFonts w:ascii="Times New Roman" w:hAnsi="Times New Roman" w:cs="Times New Roman"/>
+          <w:b/>
+          <w:i w:val="0"/>
+          <w:sz w:val="20"/>
+        </w:rPr>
+        <w:t>Listing 5: Drop_Non_Default_Indexes + Capture (Executionstats Parser)</w:t>
       </w:r>
     </w:p>
     <w:p>
@@ -693,7 +858,7 @@
           <w:i w:val="0"/>
           <w:sz w:val="22"/>
         </w:rPr>
-        <w:t>My baseline strips orders_aggregate down to the mandatory _id_ index, then runs explain('executionStats') to capture the COLLSCAN plan. The capture_explain helper pulls 5 fields out of executionStats that summarise what the planner did and how much work it cost. Resetting between archetypes guarantees a true baseline: the engine never sees an index left over from a previous archetype.</w:t>
+        <w:t>My baseline strips orders_aggregate down to the mandatory _id_ index, then runs explain('executionStats') to capture the COLLSCAN plan. The capture helper pulls 5 fields out of executionStats that summarise what the planner did and how much work it cost. Resetting between archetypes guarantees a true baseline: the engine never sees an index left over from a previous archetype.</w:t>
       </w:r>
     </w:p>
     <w:p>
@@ -707,53 +872,21 @@
           <w:i w:val="0"/>
           <w:sz w:val="26"/>
         </w:rPr>
-        <w:t>3.2 Build the proposed indexes</w:t>
+        <w:t>3.2 The 4 query archetypes and their proposed indexes</w:t>
       </w:r>
     </w:p>
     <w:p>
       <w:pPr>
-        <w:spacing w:before="120" w:after="40"/>
-        <w:jc w:val="center"/>
-      </w:pPr>
-      <w:r>
-        <w:drawing>
-          <wp:inline xmlns:a="http://schemas.openxmlformats.org/drawingml/2006/main" xmlns:pic="http://schemas.openxmlformats.org/drawingml/2006/picture">
-            <wp:extent cx="5400000" cy="1862632"/>
-            <wp:docPr id="7" name="Picture 7"/>
-            <wp:cNvGraphicFramePr>
-              <a:graphicFrameLocks noChangeAspect="1"/>
-            </wp:cNvGraphicFramePr>
-            <a:graphic>
-              <a:graphicData uri="http://schemas.openxmlformats.org/drawingml/2006/picture">
-                <pic:pic>
-                  <pic:nvPicPr>
-                    <pic:cNvPr id="0" name="QO_code_index.png"/>
-                    <pic:cNvPicPr/>
-                  </pic:nvPicPr>
-                  <pic:blipFill>
-                    <a:blip r:embed="rId15"/>
-                    <a:stretch>
-                      <a:fillRect/>
-                    </a:stretch>
-                  </pic:blipFill>
-                  <pic:spPr>
-                    <a:xfrm>
-                      <a:off x="0" y="0"/>
-                      <a:ext cx="5400000" cy="1862632"/>
-                    </a:xfrm>
-                    <a:prstGeom prst="rect"/>
-                  </pic:spPr>
-                </pic:pic>
-              </a:graphicData>
-            </a:graphic>
-          </wp:inline>
-        </w:drawing>
-      </w:r>
-    </w:p>
-    <w:p>
-      <w:pPr>
-        <w:spacing w:after="200"/>
-        <w:jc w:val="center"/>
+        <w:spacing w:before="160" w:after="40"/>
+        <w:ind w:left="567" w:right="567"/>
+        <w:jc w:val="left"/>
+        <w:shd w:val="clear" w:color="auto" w:fill="F5F5F5"/>
+        <w:pBdr>
+          <w:top w:val="single" w:sz="6" w:space="4" w:color="999999"/>
+          <w:left w:val="single" w:sz="6" w:space="4" w:color="999999"/>
+          <w:bottom w:val="single" w:sz="6" w:space="4" w:color="999999"/>
+          <w:right w:val="single" w:sz="6" w:space="4" w:color="999999"/>
+        </w:pBdr>
       </w:pPr>
       <w:r>
         <w:rPr>
@@ -762,7 +895,69 @@
           <w:i w:val="0"/>
           <w:sz w:val="20"/>
         </w:rPr>
-        <w:t>Figure 7: Proposed Index Set per Archetype</w:t>
+        <w:t xml:space="preserve">Listing 6  </w:t>
+      </w:r>
+      <w:r>
+        <w:rPr>
+          <w:rFonts w:ascii="Times New Roman" w:hAnsi="Times New Roman" w:cs="Times New Roman"/>
+          <w:b w:val="0"/>
+          <w:i/>
+          <w:sz w:val="20"/>
+        </w:rPr>
+        <w:t>place a VS Code screenshot of the code below in this block.</w:t>
+        <w:br/>
+      </w:r>
+      <w:r>
+        <w:rPr>
+          <w:rFonts w:ascii="Consolas" w:hAnsi="Consolas" w:cs="Consolas"/>
+          <w:b/>
+          <w:i w:val="0"/>
+          <w:sz w:val="20"/>
+        </w:rPr>
+        <w:t xml:space="preserve">File:  </w:t>
+      </w:r>
+      <w:r>
+        <w:rPr>
+          <w:rFonts w:ascii="Consolas" w:hAnsi="Consolas" w:cs="Consolas"/>
+          <w:b w:val="0"/>
+          <w:i w:val="0"/>
+          <w:sz w:val="20"/>
+        </w:rPr>
+        <w:t>mongodb/indexes_explain.py</w:t>
+        <w:br/>
+      </w:r>
+      <w:r>
+        <w:rPr>
+          <w:rFonts w:ascii="Consolas" w:hAnsi="Consolas" w:cs="Consolas"/>
+          <w:b/>
+          <w:i w:val="0"/>
+          <w:sz w:val="20"/>
+        </w:rPr>
+        <w:t xml:space="preserve">Lines: </w:t>
+      </w:r>
+      <w:r>
+        <w:rPr>
+          <w:rFonts w:ascii="Consolas" w:hAnsi="Consolas" w:cs="Consolas"/>
+          <w:b w:val="0"/>
+          <w:i w:val="0"/>
+          <w:sz w:val="20"/>
+        </w:rPr>
+        <w:t>38-65    (QUERIES list: 4 archetypes with proposed index per archetype)</w:t>
+      </w:r>
+    </w:p>
+    <w:p>
+      <w:pPr>
+        <w:spacing w:after="200"/>
+        <w:jc w:val="center"/>
+      </w:pPr>
+      <w:r>
+        <w:rPr>
+          <w:rFonts w:ascii="Times New Roman" w:hAnsi="Times New Roman" w:cs="Times New Roman"/>
+          <w:b/>
+          <w:i w:val="0"/>
+          <w:sz w:val="20"/>
+        </w:rPr>
+        <w:t>Listing 6: Queries List: 4 Archetypes With Proposed Index Per Archetype</w:t>
       </w:r>
     </w:p>
     <w:p>
@@ -777,7 +972,7 @@
           <w:i w:val="0"/>
           <w:sz w:val="22"/>
         </w:rPr>
-        <w:t>For each archetype I create the index I would actually ship to production. The compound index on (pickup_zone, service_type) follows MongoDB's prefix rule with the more selective field first. The nested-field index on customer.loyalty_score is the one I think is most interesting, because it proves MongoDB will indexscan an embedded path if I declare the dotted notation correctly. That was the bet behind embedding the customer snapshot in the first place.</w:t>
+        <w:t>For each archetype I declare the index I would actually ship to production. The compound index on (service_type, delivery.delivery_status) follows MongoDB's prefix rule with the more selective field first. The nested-field index on customer.loyalty_score is the one I think is most interesting, because it proves MongoDB will indexscan an embedded path if I declare the dotted notation correctly. That was the bet behind embedding the customer snapshot in the first place.</w:t>
       </w:r>
     </w:p>
     <w:p>
@@ -796,48 +991,16 @@
     </w:p>
     <w:p>
       <w:pPr>
-        <w:spacing w:before="120" w:after="40"/>
-        <w:jc w:val="center"/>
-      </w:pPr>
-      <w:r>
-        <w:drawing>
-          <wp:inline xmlns:a="http://schemas.openxmlformats.org/drawingml/2006/main" xmlns:pic="http://schemas.openxmlformats.org/drawingml/2006/picture">
-            <wp:extent cx="5400000" cy="2501362"/>
-            <wp:docPr id="8" name="Picture 8"/>
-            <wp:cNvGraphicFramePr>
-              <a:graphicFrameLocks noChangeAspect="1"/>
-            </wp:cNvGraphicFramePr>
-            <a:graphic>
-              <a:graphicData uri="http://schemas.openxmlformats.org/drawingml/2006/picture">
-                <pic:pic>
-                  <pic:nvPicPr>
-                    <pic:cNvPr id="0" name="QO_code_experiment.png"/>
-                    <pic:cNvPicPr/>
-                  </pic:nvPicPr>
-                  <pic:blipFill>
-                    <a:blip r:embed="rId16"/>
-                    <a:stretch>
-                      <a:fillRect/>
-                    </a:stretch>
-                  </pic:blipFill>
-                  <pic:spPr>
-                    <a:xfrm>
-                      <a:off x="0" y="0"/>
-                      <a:ext cx="5400000" cy="2501362"/>
-                    </a:xfrm>
-                    <a:prstGeom prst="rect"/>
-                  </pic:spPr>
-                </pic:pic>
-              </a:graphicData>
-            </a:graphic>
-          </wp:inline>
-        </w:drawing>
-      </w:r>
-    </w:p>
-    <w:p>
-      <w:pPr>
-        <w:spacing w:after="200"/>
-        <w:jc w:val="center"/>
+        <w:spacing w:before="160" w:after="40"/>
+        <w:ind w:left="567" w:right="567"/>
+        <w:jc w:val="left"/>
+        <w:shd w:val="clear" w:color="auto" w:fill="F5F5F5"/>
+        <w:pBdr>
+          <w:top w:val="single" w:sz="6" w:space="4" w:color="999999"/>
+          <w:left w:val="single" w:sz="6" w:space="4" w:color="999999"/>
+          <w:bottom w:val="single" w:sz="6" w:space="4" w:color="999999"/>
+          <w:right w:val="single" w:sz="6" w:space="4" w:color="999999"/>
+        </w:pBdr>
       </w:pPr>
       <w:r>
         <w:rPr>
@@ -846,7 +1009,69 @@
           <w:i w:val="0"/>
           <w:sz w:val="20"/>
         </w:rPr>
-        <w:t>Figure 8: Before vs After Measurement Loop</w:t>
+        <w:t xml:space="preserve">Listing 7  </w:t>
+      </w:r>
+      <w:r>
+        <w:rPr>
+          <w:rFonts w:ascii="Times New Roman" w:hAnsi="Times New Roman" w:cs="Times New Roman"/>
+          <w:b w:val="0"/>
+          <w:i/>
+          <w:sz w:val="20"/>
+        </w:rPr>
+        <w:t>place a VS Code screenshot of the code below in this block.</w:t>
+        <w:br/>
+      </w:r>
+      <w:r>
+        <w:rPr>
+          <w:rFonts w:ascii="Consolas" w:hAnsi="Consolas" w:cs="Consolas"/>
+          <w:b/>
+          <w:i w:val="0"/>
+          <w:sz w:val="20"/>
+        </w:rPr>
+        <w:t xml:space="preserve">File:  </w:t>
+      </w:r>
+      <w:r>
+        <w:rPr>
+          <w:rFonts w:ascii="Consolas" w:hAnsi="Consolas" w:cs="Consolas"/>
+          <w:b w:val="0"/>
+          <w:i w:val="0"/>
+          <w:sz w:val="20"/>
+        </w:rPr>
+        <w:t>mongodb/indexes_explain.py</w:t>
+        <w:br/>
+      </w:r>
+      <w:r>
+        <w:rPr>
+          <w:rFonts w:ascii="Consolas" w:hAnsi="Consolas" w:cs="Consolas"/>
+          <w:b/>
+          <w:i w:val="0"/>
+          <w:sz w:val="20"/>
+        </w:rPr>
+        <w:t xml:space="preserve">Lines: </w:t>
+      </w:r>
+      <w:r>
+        <w:rPr>
+          <w:rFonts w:ascii="Consolas" w:hAnsi="Consolas" w:cs="Consolas"/>
+          <w:b w:val="0"/>
+          <w:i w:val="0"/>
+          <w:sz w:val="20"/>
+        </w:rPr>
+        <w:t>114-165    (run_one + main: before vs after measurement loop)</w:t>
+      </w:r>
+    </w:p>
+    <w:p>
+      <w:pPr>
+        <w:spacing w:after="200"/>
+        <w:jc w:val="center"/>
+      </w:pPr>
+      <w:r>
+        <w:rPr>
+          <w:rFonts w:ascii="Times New Roman" w:hAnsi="Times New Roman" w:cs="Times New Roman"/>
+          <w:b/>
+          <w:i w:val="0"/>
+          <w:sz w:val="20"/>
+        </w:rPr>
+        <w:t>Listing 7: Run_One + Main: Before Vs After Measurement Loop</w:t>
       </w:r>
     </w:p>
     <w:p>
@@ -887,7 +1112,7 @@
         <w:drawing>
           <wp:inline xmlns:a="http://schemas.openxmlformats.org/drawingml/2006/main" xmlns:pic="http://schemas.openxmlformats.org/drawingml/2006/picture">
             <wp:extent cx="5400000" cy="2896975"/>
-            <wp:docPr id="9" name="Picture 9"/>
+            <wp:docPr id="2" name="Picture 2"/>
             <wp:cNvGraphicFramePr>
               <a:graphicFrameLocks noChangeAspect="1"/>
             </wp:cNvGraphicFramePr>
@@ -899,7 +1124,7 @@
                     <pic:cNvPicPr/>
                   </pic:nvPicPr>
                   <pic:blipFill>
-                    <a:blip r:embed="rId17"/>
+                    <a:blip r:embed="rId10"/>
                     <a:stretch>
                       <a:fillRect/>
                     </a:stretch>
@@ -930,7 +1155,7 @@
           <w:i w:val="0"/>
           <w:sz w:val="20"/>
         </w:rPr>
-        <w:t>Figure 9: The 4 Query Archetypes Profiled</w:t>
+        <w:t>Figure 2: The 4 Query Archetypes Profiled</w:t>
       </w:r>
     </w:p>
     <w:p>
@@ -942,7 +1167,7 @@
         <w:drawing>
           <wp:inline xmlns:a="http://schemas.openxmlformats.org/drawingml/2006/main" xmlns:pic="http://schemas.openxmlformats.org/drawingml/2006/picture">
             <wp:extent cx="5400000" cy="2483808"/>
-            <wp:docPr id="10" name="Picture 10"/>
+            <wp:docPr id="3" name="Picture 3"/>
             <wp:cNvGraphicFramePr>
               <a:graphicFrameLocks noChangeAspect="1"/>
             </wp:cNvGraphicFramePr>
@@ -954,7 +1179,7 @@
                     <pic:cNvPicPr/>
                   </pic:nvPicPr>
                   <pic:blipFill>
-                    <a:blip r:embed="rId18"/>
+                    <a:blip r:embed="rId11"/>
                     <a:stretch>
                       <a:fillRect/>
                     </a:stretch>
@@ -985,7 +1210,7 @@
           <w:i w:val="0"/>
           <w:sz w:val="20"/>
         </w:rPr>
-        <w:t>Figure 10: docsExamined Before vs After Indexing</w:t>
+        <w:t>Figure 3: docsExamined Before vs After Indexing, with Reduction Factors</w:t>
       </w:r>
     </w:p>
     <w:p>
@@ -1000,7 +1225,22 @@
           <w:i w:val="0"/>
           <w:sz w:val="22"/>
         </w:rPr>
-        <w:t>3 patterns jump out of Figure 10. The point lookup on order_id (Q_C) returns 1 document, so its reduction factor is the size of the collection: 1250 times. The compound predicate (Q_B) wins 50 times because the index narrows on the more selective field first. The single-field equality (Q_A) and the nested-field equality (Q_D) win 7.6 and 5.3 times respectively because each filter cuts the collection to roughly an eighth of its size. All 4 indexed runs end on IXSCAN as the winning stage; all 4 baselines use COLLSCAN, which is what B-tree theory predicts. Execution time I have not reported because the working set fits in RAM and the millisecond differences are inside the timing noise floor. At larger data volumes those differences would surface, but at this scale docsExamined is the more honest metric.</w:t>
+        <w:t>3 patterns jump out of Figure 3. The point lookup on order_id (Q_C) returns 1 document, so its reduction factor is the size of the collection: 1250x. The compound predicate (Q_B) wins 50x because the index narrows on the more selective field first. The single-field equality (Q_A) and the mid-cardinality equality (Q_D) win 7.6x and 5.3x because each filter cuts the collection to roughly an eighth of its size. All 4 indexed runs end up with IXSCAN as the winning stage; all 4 baselines use COLLSCAN, which is what B-tree theory predicts.</w:t>
+      </w:r>
+    </w:p>
+    <w:p>
+      <w:pPr>
+        <w:spacing w:after="160" w:line="276" w:lineRule="auto"/>
+        <w:jc w:val="both"/>
+      </w:pPr>
+      <w:r>
+        <w:rPr>
+          <w:rFonts w:ascii="Times New Roman" w:hAnsi="Times New Roman" w:cs="Times New Roman"/>
+          <w:b w:val="0"/>
+          <w:i w:val="0"/>
+          <w:sz w:val="22"/>
+        </w:rPr>
+        <w:t>What I cannot report credibly is execution time. The collection fits in RAM, so the engine never actually has to touch disk, and the wall-clock differences between COLLSCAN and IXSCAN are inside the noise floor of millisecond timing. At larger data volumes the same archetypes would surface absolute timing wins, but at this scale docsExamined is the more honest metric to report.</w:t>
       </w:r>
     </w:p>
     <w:p>
@@ -1029,7 +1269,7 @@
           <w:i w:val="0"/>
           <w:sz w:val="22"/>
         </w:rPr>
-        <w:t>SQL in R asks me to demonstrate the relational paradigm against the same data, surface a finding the document paradigm could not express as cleanly, and tie it back to R for downstream analytical use. The dataset is small (around 4400 rows total), so SQLite is the correct engine: zero install overhead for a marker, the full ANSI SQL dialect including window functions, and a single file that ships alongside the project. Anything heavier would be overengineering.</w:t>
+        <w:t>SQL in R asks me to demonstrate the relational paradigm against the same data, surface a finding the document paradigm could not express as cleanly, and tie it back to R for downstream analytical use. The dataset is small (around 4400 rows total), so SQLite is the correct engine: zero install overhead for a marker, the full ANSI SQL dialect including window functions, and a single file that ships alongside the project.</w:t>
       </w:r>
     </w:p>
     <w:p>
@@ -1048,48 +1288,16 @@
     </w:p>
     <w:p>
       <w:pPr>
-        <w:spacing w:before="120" w:after="40"/>
-        <w:jc w:val="center"/>
-      </w:pPr>
-      <w:r>
-        <w:drawing>
-          <wp:inline xmlns:a="http://schemas.openxmlformats.org/drawingml/2006/main" xmlns:pic="http://schemas.openxmlformats.org/drawingml/2006/picture">
-            <wp:extent cx="5400000" cy="2488299"/>
-            <wp:docPr id="11" name="Picture 11"/>
-            <wp:cNvGraphicFramePr>
-              <a:graphicFrameLocks noChangeAspect="1"/>
-            </wp:cNvGraphicFramePr>
-            <a:graphic>
-              <a:graphicData uri="http://schemas.openxmlformats.org/drawingml/2006/picture">
-                <pic:pic>
-                  <pic:nvPicPr>
-                    <pic:cNvPr id="0" name="SR_code_load.png"/>
-                    <pic:cNvPicPr/>
-                  </pic:nvPicPr>
-                  <pic:blipFill>
-                    <a:blip r:embed="rId19"/>
-                    <a:stretch>
-                      <a:fillRect/>
-                    </a:stretch>
-                  </pic:blipFill>
-                  <pic:spPr>
-                    <a:xfrm>
-                      <a:off x="0" y="0"/>
-                      <a:ext cx="5400000" cy="2488299"/>
-                    </a:xfrm>
-                    <a:prstGeom prst="rect"/>
-                  </pic:spPr>
-                </pic:pic>
-              </a:graphicData>
-            </a:graphic>
-          </wp:inline>
-        </w:drawing>
-      </w:r>
-    </w:p>
-    <w:p>
-      <w:pPr>
-        <w:spacing w:after="200"/>
-        <w:jc w:val="center"/>
+        <w:spacing w:before="160" w:after="40"/>
+        <w:ind w:left="567" w:right="567"/>
+        <w:jc w:val="left"/>
+        <w:shd w:val="clear" w:color="auto" w:fill="F5F5F5"/>
+        <w:pBdr>
+          <w:top w:val="single" w:sz="6" w:space="4" w:color="999999"/>
+          <w:left w:val="single" w:sz="6" w:space="4" w:color="999999"/>
+          <w:bottom w:val="single" w:sz="6" w:space="4" w:color="999999"/>
+          <w:right w:val="single" w:sz="6" w:space="4" w:color="999999"/>
+        </w:pBdr>
       </w:pPr>
       <w:r>
         <w:rPr>
@@ -1098,7 +1306,69 @@
           <w:i w:val="0"/>
           <w:sz w:val="20"/>
         </w:rPr>
-        <w:t>Figure 11: SQLite Loader with Zone Canonicalisation and 6 Join Indexes</w:t>
+        <w:t xml:space="preserve">Listing 8  </w:t>
+      </w:r>
+      <w:r>
+        <w:rPr>
+          <w:rFonts w:ascii="Times New Roman" w:hAnsi="Times New Roman" w:cs="Times New Roman"/>
+          <w:b w:val="0"/>
+          <w:i/>
+          <w:sz w:val="20"/>
+        </w:rPr>
+        <w:t>place a VS Code screenshot of the code below in this block.</w:t>
+        <w:br/>
+      </w:r>
+      <w:r>
+        <w:rPr>
+          <w:rFonts w:ascii="Consolas" w:hAnsi="Consolas" w:cs="Consolas"/>
+          <w:b/>
+          <w:i w:val="0"/>
+          <w:sz w:val="20"/>
+        </w:rPr>
+        <w:t xml:space="preserve">File:  </w:t>
+      </w:r>
+      <w:r>
+        <w:rPr>
+          <w:rFonts w:ascii="Consolas" w:hAnsi="Consolas" w:cs="Consolas"/>
+          <w:b w:val="0"/>
+          <w:i w:val="0"/>
+          <w:sz w:val="20"/>
+        </w:rPr>
+        <w:t>sql_r/load_northstar.R</w:t>
+        <w:br/>
+      </w:r>
+      <w:r>
+        <w:rPr>
+          <w:rFonts w:ascii="Consolas" w:hAnsi="Consolas" w:cs="Consolas"/>
+          <w:b/>
+          <w:i w:val="0"/>
+          <w:sz w:val="20"/>
+        </w:rPr>
+        <w:t xml:space="preserve">Lines: </w:t>
+      </w:r>
+      <w:r>
+        <w:rPr>
+          <w:rFonts w:ascii="Consolas" w:hAnsi="Consolas" w:cs="Consolas"/>
+          <w:b w:val="0"/>
+          <w:i w:val="0"/>
+          <w:sz w:val="20"/>
+        </w:rPr>
+        <w:t>44-95    (load_csv helper, 9 dbWriteTable calls, 6 join-key indexes)</w:t>
+      </w:r>
+    </w:p>
+    <w:p>
+      <w:pPr>
+        <w:spacing w:after="200"/>
+        <w:jc w:val="center"/>
+      </w:pPr>
+      <w:r>
+        <w:rPr>
+          <w:rFonts w:ascii="Times New Roman" w:hAnsi="Times New Roman" w:cs="Times New Roman"/>
+          <w:b/>
+          <w:i w:val="0"/>
+          <w:sz w:val="20"/>
+        </w:rPr>
+        <w:t>Listing 8: Load_Csv Helper, 9 Dbwritetable Calls, 6 Join-Key Indexes</w:t>
       </w:r>
     </w:p>
     <w:p>
@@ -1113,7 +1383,7 @@
           <w:i w:val="0"/>
           <w:sz w:val="22"/>
         </w:rPr>
-        <w:t>My loader reads each CSV with readr::read_csv, runs every zone-bearing column through the same canonicalisation map the MongoDB pipeline uses, and writes each table via dbWriteTable. After load it creates 6 indexes on the join keys that the analytical queries exercise. Without those indexes, EXPLAIN QUERY PLAN reports nested loop scans for the multi-table queries; with them, the same plans report SEARCH USING INDEX. I left the implicit rowid primary index alone because SQLite manages it on its own. The shared canonicalisation map is what makes the 8 query results match the MongoDB pipeline to the digit; if I had cleaned the data differently across paradigms, the cross-paradigm validation in Section 4.4 would have failed.</w:t>
+        <w:t>My loader reads each CSV with readr::read_csv, runs every zone-bearing column through the same canonicalisation map the MongoDB pipeline uses, and writes each table via dbWriteTable. After load it creates 6 indexes on the join keys that the analytical queries exercise. Without those indexes, EXPLAIN QUERY PLAN reports nested loop scans for the multi-table queries; with them, the same plans report SEARCH USING INDEX. The shared canonicalisation map is what makes the 8 query results match the MongoDB pipeline to the digit; if I had cleaned the data differently across paradigms, the cross-paradigm validation in Section 4.4 would have failed.</w:t>
       </w:r>
     </w:p>
     <w:p>
@@ -1132,48 +1402,16 @@
     </w:p>
     <w:p>
       <w:pPr>
-        <w:spacing w:before="120" w:after="40"/>
-        <w:jc w:val="center"/>
-      </w:pPr>
-      <w:r>
-        <w:drawing>
-          <wp:inline xmlns:a="http://schemas.openxmlformats.org/drawingml/2006/main" xmlns:pic="http://schemas.openxmlformats.org/drawingml/2006/picture">
-            <wp:extent cx="5400000" cy="2486441"/>
-            <wp:docPr id="12" name="Picture 12"/>
-            <wp:cNvGraphicFramePr>
-              <a:graphicFrameLocks noChangeAspect="1"/>
-            </wp:cNvGraphicFramePr>
-            <a:graphic>
-              <a:graphicData uri="http://schemas.openxmlformats.org/drawingml/2006/picture">
-                <pic:pic>
-                  <pic:nvPicPr>
-                    <pic:cNvPr id="0" name="SR_code_join.png"/>
-                    <pic:cNvPicPr/>
-                  </pic:nvPicPr>
-                  <pic:blipFill>
-                    <a:blip r:embed="rId20"/>
-                    <a:stretch>
-                      <a:fillRect/>
-                    </a:stretch>
-                  </pic:blipFill>
-                  <pic:spPr>
-                    <a:xfrm>
-                      <a:off x="0" y="0"/>
-                      <a:ext cx="5400000" cy="2486441"/>
-                    </a:xfrm>
-                    <a:prstGeom prst="rect"/>
-                  </pic:spPr>
-                </pic:pic>
-              </a:graphicData>
-            </a:graphic>
-          </wp:inline>
-        </w:drawing>
-      </w:r>
-    </w:p>
-    <w:p>
-      <w:pPr>
-        <w:spacing w:after="200"/>
-        <w:jc w:val="center"/>
+        <w:spacing w:before="160" w:after="40"/>
+        <w:ind w:left="567" w:right="567"/>
+        <w:jc w:val="left"/>
+        <w:shd w:val="clear" w:color="auto" w:fill="F5F5F5"/>
+        <w:pBdr>
+          <w:top w:val="single" w:sz="6" w:space="4" w:color="999999"/>
+          <w:left w:val="single" w:sz="6" w:space="4" w:color="999999"/>
+          <w:bottom w:val="single" w:sz="6" w:space="4" w:color="999999"/>
+          <w:right w:val="single" w:sz="6" w:space="4" w:color="999999"/>
+        </w:pBdr>
       </w:pPr>
       <w:r>
         <w:rPr>
@@ -1182,7 +1420,69 @@
           <w:i w:val="0"/>
           <w:sz w:val="20"/>
         </w:rPr>
-        <w:t>Figure 12: 3-Way Join Surfacing Compound-Risk Orders</w:t>
+        <w:t xml:space="preserve">Listing 9  </w:t>
+      </w:r>
+      <w:r>
+        <w:rPr>
+          <w:rFonts w:ascii="Times New Roman" w:hAnsi="Times New Roman" w:cs="Times New Roman"/>
+          <w:b w:val="0"/>
+          <w:i/>
+          <w:sz w:val="20"/>
+        </w:rPr>
+        <w:t>place a VS Code screenshot of the code below in this block.</w:t>
+        <w:br/>
+      </w:r>
+      <w:r>
+        <w:rPr>
+          <w:rFonts w:ascii="Consolas" w:hAnsi="Consolas" w:cs="Consolas"/>
+          <w:b/>
+          <w:i w:val="0"/>
+          <w:sz w:val="20"/>
+        </w:rPr>
+        <w:t xml:space="preserve">File:  </w:t>
+      </w:r>
+      <w:r>
+        <w:rPr>
+          <w:rFonts w:ascii="Consolas" w:hAnsi="Consolas" w:cs="Consolas"/>
+          <w:b w:val="0"/>
+          <w:i w:val="0"/>
+          <w:sz w:val="20"/>
+        </w:rPr>
+        <w:t>sql_r/queries.R</w:t>
+        <w:br/>
+      </w:r>
+      <w:r>
+        <w:rPr>
+          <w:rFonts w:ascii="Consolas" w:hAnsi="Consolas" w:cs="Consolas"/>
+          <w:b/>
+          <w:i w:val="0"/>
+          <w:sz w:val="20"/>
+        </w:rPr>
+        <w:t xml:space="preserve">Lines: </w:t>
+      </w:r>
+      <w:r>
+        <w:rPr>
+          <w:rFonts w:ascii="Consolas" w:hAnsi="Consolas" w:cs="Consolas"/>
+          <w:b w:val="0"/>
+          <w:i w:val="0"/>
+          <w:sz w:val="20"/>
+        </w:rPr>
+        <w:t>76-92    (S6: top 5 orders with both a complaint and a failed delivery)</w:t>
+      </w:r>
+    </w:p>
+    <w:p>
+      <w:pPr>
+        <w:spacing w:after="200"/>
+        <w:jc w:val="center"/>
+      </w:pPr>
+      <w:r>
+        <w:rPr>
+          <w:rFonts w:ascii="Times New Roman" w:hAnsi="Times New Roman" w:cs="Times New Roman"/>
+          <w:b/>
+          <w:i w:val="0"/>
+          <w:sz w:val="20"/>
+        </w:rPr>
+        <w:t>Listing 9: S6: Top 5 Orders With Both A Complaint And A Failed Delivery</w:t>
       </w:r>
     </w:p>
     <w:p>
@@ -1197,7 +1497,7 @@
           <w:i w:val="0"/>
           <w:sz w:val="22"/>
         </w:rPr>
-        <w:t>S6 surfaces the orders that combine 3 different failure indicators at once: a logged complaint, a failed delivery, and a low post-delivery rating. The relational paradigm handles this cleanly because each entity sits in its own table and the joins are explicit. In MongoDB I happen to get the same answer almost for free because complaints and deliveries are embedded inside orders_aggregate, but that is a happy consequence of my schema choice rather than a property of the document paradigm itself. The result is 12 compound-risk orders, 11 of which have pickup zone Central or North, replicating the zone-side failure pattern from Section 2.</w:t>
+        <w:t>S6 surfaces the orders that combine 3 different failure indicators at once: a logged complaint, a failed delivery, and a low post-delivery rating. The relational paradigm handles this cleanly because each entity sits in its own table and the joins are explicit. In MongoDB I happen to get the same answer almost for free because complaints and deliveries are embedded inside orders_aggregate, but that is a happy consequence of my schema choice rather than a property of the document paradigm itself.</w:t>
       </w:r>
     </w:p>
     <w:p>
@@ -1216,48 +1516,16 @@
     </w:p>
     <w:p>
       <w:pPr>
-        <w:spacing w:before="120" w:after="40"/>
-        <w:jc w:val="center"/>
-      </w:pPr>
-      <w:r>
-        <w:drawing>
-          <wp:inline xmlns:a="http://schemas.openxmlformats.org/drawingml/2006/main" xmlns:pic="http://schemas.openxmlformats.org/drawingml/2006/picture">
-            <wp:extent cx="5400000" cy="2401637"/>
-            <wp:docPr id="13" name="Picture 13"/>
-            <wp:cNvGraphicFramePr>
-              <a:graphicFrameLocks noChangeAspect="1"/>
-            </wp:cNvGraphicFramePr>
-            <a:graphic>
-              <a:graphicData uri="http://schemas.openxmlformats.org/drawingml/2006/picture">
-                <pic:pic>
-                  <pic:nvPicPr>
-                    <pic:cNvPr id="0" name="SR_code_window.png"/>
-                    <pic:cNvPicPr/>
-                  </pic:nvPicPr>
-                  <pic:blipFill>
-                    <a:blip r:embed="rId21"/>
-                    <a:stretch>
-                      <a:fillRect/>
-                    </a:stretch>
-                  </pic:blipFill>
-                  <pic:spPr>
-                    <a:xfrm>
-                      <a:off x="0" y="0"/>
-                      <a:ext cx="5400000" cy="2401637"/>
-                    </a:xfrm>
-                    <a:prstGeom prst="rect"/>
-                  </pic:spPr>
-                </pic:pic>
-              </a:graphicData>
-            </a:graphic>
-          </wp:inline>
-        </w:drawing>
-      </w:r>
-    </w:p>
-    <w:p>
-      <w:pPr>
-        <w:spacing w:after="200"/>
-        <w:jc w:val="center"/>
+        <w:spacing w:before="160" w:after="40"/>
+        <w:ind w:left="567" w:right="567"/>
+        <w:jc w:val="left"/>
+        <w:shd w:val="clear" w:color="auto" w:fill="F5F5F5"/>
+        <w:pBdr>
+          <w:top w:val="single" w:sz="6" w:space="4" w:color="999999"/>
+          <w:left w:val="single" w:sz="6" w:space="4" w:color="999999"/>
+          <w:bottom w:val="single" w:sz="6" w:space="4" w:color="999999"/>
+          <w:right w:val="single" w:sz="6" w:space="4" w:color="999999"/>
+        </w:pBdr>
       </w:pPr>
       <w:r>
         <w:rPr>
@@ -1266,7 +1534,69 @@
           <w:i w:val="0"/>
           <w:sz w:val="20"/>
         </w:rPr>
-        <w:t>Figure 13: RANK() OVER PARTITION BY for Top-3-Drivers-per-Zone</w:t>
+        <w:t xml:space="preserve">Listing 10  </w:t>
+      </w:r>
+      <w:r>
+        <w:rPr>
+          <w:rFonts w:ascii="Times New Roman" w:hAnsi="Times New Roman" w:cs="Times New Roman"/>
+          <w:b w:val="0"/>
+          <w:i/>
+          <w:sz w:val="20"/>
+        </w:rPr>
+        <w:t>place a VS Code screenshot of the code below in this block.</w:t>
+        <w:br/>
+      </w:r>
+      <w:r>
+        <w:rPr>
+          <w:rFonts w:ascii="Consolas" w:hAnsi="Consolas" w:cs="Consolas"/>
+          <w:b/>
+          <w:i w:val="0"/>
+          <w:sz w:val="20"/>
+        </w:rPr>
+        <w:t xml:space="preserve">File:  </w:t>
+      </w:r>
+      <w:r>
+        <w:rPr>
+          <w:rFonts w:ascii="Consolas" w:hAnsi="Consolas" w:cs="Consolas"/>
+          <w:b w:val="0"/>
+          <w:i w:val="0"/>
+          <w:sz w:val="20"/>
+        </w:rPr>
+        <w:t>sql_r/queries.R</w:t>
+        <w:br/>
+      </w:r>
+      <w:r>
+        <w:rPr>
+          <w:rFonts w:ascii="Consolas" w:hAnsi="Consolas" w:cs="Consolas"/>
+          <w:b/>
+          <w:i w:val="0"/>
+          <w:sz w:val="20"/>
+        </w:rPr>
+        <w:t xml:space="preserve">Lines: </w:t>
+      </w:r>
+      <w:r>
+        <w:rPr>
+          <w:rFonts w:ascii="Consolas" w:hAnsi="Consolas" w:cs="Consolas"/>
+          <w:b w:val="0"/>
+          <w:i w:val="0"/>
+          <w:sz w:val="20"/>
+        </w:rPr>
+        <w:t>123-140    (S9: RANK() OVER PARTITION BY base_zone)</w:t>
+      </w:r>
+    </w:p>
+    <w:p>
+      <w:pPr>
+        <w:spacing w:after="200"/>
+        <w:jc w:val="center"/>
+      </w:pPr>
+      <w:r>
+        <w:rPr>
+          <w:rFonts w:ascii="Times New Roman" w:hAnsi="Times New Roman" w:cs="Times New Roman"/>
+          <w:b/>
+          <w:i w:val="0"/>
+          <w:sz w:val="20"/>
+        </w:rPr>
+        <w:t>Listing 10: S9: Rank() Over Partition By Base_Zone</w:t>
       </w:r>
     </w:p>
     <w:p>
@@ -1281,7 +1611,7 @@
           <w:i w:val="0"/>
           <w:sz w:val="22"/>
         </w:rPr>
-        <w:t>S9 ranks drivers within each base zone by completed deliveries and returns the top 3 per zone. The whole thing is one SQL statement. The MongoDB equivalent needs $setWindowFields or a multi-stage pipeline. This is the marquee SQL advantage and the demonstrative reason the SQL in R band carries 15 dedicated marks. The query returns 21 rows (3 drivers per zone, 7 zones, with ties broken by RANK()). 4 of the 7 zone leaders are also in the top quintile of overall driver ratings, which I read as evidence that operational productivity and customer experience are positively correlated at the driver level.</w:t>
+        <w:t>S9 ranks drivers within each base zone by completed deliveries and returns the top 3 per zone. The whole thing is one SQL statement. The MongoDB equivalent needs $setWindowFields or a multi-stage pipeline. This is the marquee SQL advantage and the demonstrative reason the SQL in R band carries 15 dedicated marks.</w:t>
       </w:r>
     </w:p>
     <w:p>
@@ -1310,7 +1640,7 @@
           <w:i w:val="0"/>
           <w:sz w:val="22"/>
         </w:rPr>
-        <w:t>Queries S1 through S8 produce numerically identical results to the corresponding MongoDB aggregations from Section 2. That sounds tautological until I remind myself the data has been through 2 different load paths, 2 different cleanup paths and 2 different aggregation engines. The agreement is the strongest evidence I have that both pipelines are correct; any divergence would have flagged a bug in one of them. On the NorthStar dataset specifically, SQL is the better fit for the analytical pipeline and MongoDB is the better fit for the order-centric read pattern that queries_v2.py exercises. Either paradigm can express every business question I studied. The choice between them in a production setting comes down to the dominant workload, not the shape of the data.</w:t>
+        <w:t>S1 through S8 produce numerically identical results to the MongoDB aggregations from notebook 01. That sounds tautological until I remind myself the data went through 2 different load paths, 2 different cleanup paths, and 2 different aggregation engines. Where SQL's GROUP BY service_type returns the same average order_value as MongoDB's $group on $service_type, I know the joins, the cleanup and the schema are correct in both pipelines. Any divergence would have flagged a bug. On the NorthStar dataset specifically, SQL is the better fit for my analytical pipeline and MongoDB is the better fit for the order-centric read pattern that queries_v2.py exercises. The choice between them in a production setting comes down to the dominant workload, not the shape of the data.</w:t>
       </w:r>
     </w:p>
     <w:p>
@@ -1358,48 +1688,16 @@
     </w:p>
     <w:p>
       <w:pPr>
-        <w:spacing w:before="120" w:after="40"/>
-        <w:jc w:val="center"/>
-      </w:pPr>
-      <w:r>
-        <w:drawing>
-          <wp:inline xmlns:a="http://schemas.openxmlformats.org/drawingml/2006/main" xmlns:pic="http://schemas.openxmlformats.org/drawingml/2006/picture">
-            <wp:extent cx="5400000" cy="2545406"/>
-            <wp:docPr id="14" name="Picture 14"/>
-            <wp:cNvGraphicFramePr>
-              <a:graphicFrameLocks noChangeAspect="1"/>
-            </wp:cNvGraphicFramePr>
-            <a:graphic>
-              <a:graphicData uri="http://schemas.openxmlformats.org/drawingml/2006/picture">
-                <pic:pic>
-                  <pic:nvPicPr>
-                    <pic:cNvPr id="0" name="RA_code_tidy.png"/>
-                    <pic:cNvPicPr/>
-                  </pic:nvPicPr>
-                  <pic:blipFill>
-                    <a:blip r:embed="rId22"/>
-                    <a:stretch>
-                      <a:fillRect/>
-                    </a:stretch>
-                  </pic:blipFill>
-                  <pic:spPr>
-                    <a:xfrm>
-                      <a:off x="0" y="0"/>
-                      <a:ext cx="5400000" cy="2545406"/>
-                    </a:xfrm>
-                    <a:prstGeom prst="rect"/>
-                  </pic:spPr>
-                </pic:pic>
-              </a:graphicData>
-            </a:graphic>
-          </wp:inline>
-        </w:drawing>
-      </w:r>
-    </w:p>
-    <w:p>
-      <w:pPr>
-        <w:spacing w:after="200"/>
-        <w:jc w:val="center"/>
+        <w:spacing w:before="160" w:after="40"/>
+        <w:ind w:left="567" w:right="567"/>
+        <w:jc w:val="left"/>
+        <w:shd w:val="clear" w:color="auto" w:fill="F5F5F5"/>
+        <w:pBdr>
+          <w:top w:val="single" w:sz="6" w:space="4" w:color="999999"/>
+          <w:left w:val="single" w:sz="6" w:space="4" w:color="999999"/>
+          <w:bottom w:val="single" w:sz="6" w:space="4" w:color="999999"/>
+          <w:right w:val="single" w:sz="6" w:space="4" w:color="999999"/>
+        </w:pBdr>
       </w:pPr>
       <w:r>
         <w:rPr>
@@ -1408,7 +1706,69 @@
           <w:i w:val="0"/>
           <w:sz w:val="20"/>
         </w:rPr>
-        <w:t>Figure 14: Tidyverse Join of Orders, Deliveries, Customers and Complaints</w:t>
+        <w:t xml:space="preserve">Listing 11  </w:t>
+      </w:r>
+      <w:r>
+        <w:rPr>
+          <w:rFonts w:ascii="Times New Roman" w:hAnsi="Times New Roman" w:cs="Times New Roman"/>
+          <w:b w:val="0"/>
+          <w:i/>
+          <w:sz w:val="20"/>
+        </w:rPr>
+        <w:t>place a VS Code screenshot of the code below in this block.</w:t>
+        <w:br/>
+      </w:r>
+      <w:r>
+        <w:rPr>
+          <w:rFonts w:ascii="Consolas" w:hAnsi="Consolas" w:cs="Consolas"/>
+          <w:b/>
+          <w:i w:val="0"/>
+          <w:sz w:val="20"/>
+        </w:rPr>
+        <w:t xml:space="preserve">File:  </w:t>
+      </w:r>
+      <w:r>
+        <w:rPr>
+          <w:rFonts w:ascii="Consolas" w:hAnsi="Consolas" w:cs="Consolas"/>
+          <w:b w:val="0"/>
+          <w:i w:val="0"/>
+          <w:sz w:val="20"/>
+        </w:rPr>
+        <w:t>r_analytics/analysis.R</w:t>
+        <w:br/>
+      </w:r>
+      <w:r>
+        <w:rPr>
+          <w:rFonts w:ascii="Consolas" w:hAnsi="Consolas" w:cs="Consolas"/>
+          <w:b/>
+          <w:i w:val="0"/>
+          <w:sz w:val="20"/>
+        </w:rPr>
+        <w:t xml:space="preserve">Lines: </w:t>
+      </w:r>
+      <w:r>
+        <w:rPr>
+          <w:rFonts w:ascii="Consolas" w:hAnsi="Consolas" w:cs="Consolas"/>
+          <w:b w:val="0"/>
+          <w:i w:val="0"/>
+          <w:sz w:val="20"/>
+        </w:rPr>
+        <w:t>70-95    (left-join chain producing the analytical tibble)</w:t>
+      </w:r>
+    </w:p>
+    <w:p>
+      <w:pPr>
+        <w:spacing w:after="200"/>
+        <w:jc w:val="center"/>
+      </w:pPr>
+      <w:r>
+        <w:rPr>
+          <w:rFonts w:ascii="Times New Roman" w:hAnsi="Times New Roman" w:cs="Times New Roman"/>
+          <w:b/>
+          <w:i w:val="0"/>
+          <w:sz w:val="20"/>
+        </w:rPr>
+        <w:t>Listing 11: Left-Join Chain Producing The Analytical Tibble</w:t>
       </w:r>
     </w:p>
     <w:p>
@@ -1442,48 +1802,16 @@
     </w:p>
     <w:p>
       <w:pPr>
-        <w:spacing w:before="120" w:after="40"/>
-        <w:jc w:val="center"/>
-      </w:pPr>
-      <w:r>
-        <w:drawing>
-          <wp:inline xmlns:a="http://schemas.openxmlformats.org/drawingml/2006/main" xmlns:pic="http://schemas.openxmlformats.org/drawingml/2006/picture">
-            <wp:extent cx="5400000" cy="2552727"/>
-            <wp:docPr id="15" name="Picture 15"/>
-            <wp:cNvGraphicFramePr>
-              <a:graphicFrameLocks noChangeAspect="1"/>
-            </wp:cNvGraphicFramePr>
-            <a:graphic>
-              <a:graphicData uri="http://schemas.openxmlformats.org/drawingml/2006/picture">
-                <pic:pic>
-                  <pic:nvPicPr>
-                    <pic:cNvPr id="0" name="RA_code_heatmap.png"/>
-                    <pic:cNvPicPr/>
-                  </pic:nvPicPr>
-                  <pic:blipFill>
-                    <a:blip r:embed="rId23"/>
-                    <a:stretch>
-                      <a:fillRect/>
-                    </a:stretch>
-                  </pic:blipFill>
-                  <pic:spPr>
-                    <a:xfrm>
-                      <a:off x="0" y="0"/>
-                      <a:ext cx="5400000" cy="2552727"/>
-                    </a:xfrm>
-                    <a:prstGeom prst="rect"/>
-                  </pic:spPr>
-                </pic:pic>
-              </a:graphicData>
-            </a:graphic>
-          </wp:inline>
-        </w:drawing>
-      </w:r>
-    </w:p>
-    <w:p>
-      <w:pPr>
-        <w:spacing w:after="200"/>
-        <w:jc w:val="center"/>
+        <w:spacing w:before="160" w:after="40"/>
+        <w:ind w:left="567" w:right="567"/>
+        <w:jc w:val="left"/>
+        <w:shd w:val="clear" w:color="auto" w:fill="F5F5F5"/>
+        <w:pBdr>
+          <w:top w:val="single" w:sz="6" w:space="4" w:color="999999"/>
+          <w:left w:val="single" w:sz="6" w:space="4" w:color="999999"/>
+          <w:bottom w:val="single" w:sz="6" w:space="4" w:color="999999"/>
+          <w:right w:val="single" w:sz="6" w:space="4" w:color="999999"/>
+        </w:pBdr>
       </w:pPr>
       <w:r>
         <w:rPr>
@@ -1492,7 +1820,69 @@
           <w:i w:val="0"/>
           <w:sz w:val="20"/>
         </w:rPr>
-        <w:t>Figure 15: ggplot2 Heatmap of Failure Rate by Zone and Service Type</w:t>
+        <w:t xml:space="preserve">Listing 12  </w:t>
+      </w:r>
+      <w:r>
+        <w:rPr>
+          <w:rFonts w:ascii="Times New Roman" w:hAnsi="Times New Roman" w:cs="Times New Roman"/>
+          <w:b w:val="0"/>
+          <w:i/>
+          <w:sz w:val="20"/>
+        </w:rPr>
+        <w:t>place a VS Code screenshot of the code below in this block.</w:t>
+        <w:br/>
+      </w:r>
+      <w:r>
+        <w:rPr>
+          <w:rFonts w:ascii="Consolas" w:hAnsi="Consolas" w:cs="Consolas"/>
+          <w:b/>
+          <w:i w:val="0"/>
+          <w:sz w:val="20"/>
+        </w:rPr>
+        <w:t xml:space="preserve">File:  </w:t>
+      </w:r>
+      <w:r>
+        <w:rPr>
+          <w:rFonts w:ascii="Consolas" w:hAnsi="Consolas" w:cs="Consolas"/>
+          <w:b w:val="0"/>
+          <w:i w:val="0"/>
+          <w:sz w:val="20"/>
+        </w:rPr>
+        <w:t>r_analytics/analysis.R</w:t>
+        <w:br/>
+      </w:r>
+      <w:r>
+        <w:rPr>
+          <w:rFonts w:ascii="Consolas" w:hAnsi="Consolas" w:cs="Consolas"/>
+          <w:b/>
+          <w:i w:val="0"/>
+          <w:sz w:val="20"/>
+        </w:rPr>
+        <w:t xml:space="preserve">Lines: </w:t>
+      </w:r>
+      <w:r>
+        <w:rPr>
+          <w:rFonts w:ascii="Consolas" w:hAnsi="Consolas" w:cs="Consolas"/>
+          <w:b w:val="0"/>
+          <w:i w:val="0"/>
+          <w:sz w:val="20"/>
+        </w:rPr>
+        <w:t>165-210    (ggplot geom_tile heatmap of failure rate by zone and service type)</w:t>
+      </w:r>
+    </w:p>
+    <w:p>
+      <w:pPr>
+        <w:spacing w:after="200"/>
+        <w:jc w:val="center"/>
+      </w:pPr>
+      <w:r>
+        <w:rPr>
+          <w:rFonts w:ascii="Times New Roman" w:hAnsi="Times New Roman" w:cs="Times New Roman"/>
+          <w:b/>
+          <w:i w:val="0"/>
+          <w:sz w:val="20"/>
+        </w:rPr>
+        <w:t>Listing 12: Ggplot Geom_Tile Heatmap Of Failure Rate By Zone And Service Type</w:t>
       </w:r>
     </w:p>
     <w:p>
@@ -1507,7 +1897,7 @@
           <w:i w:val="0"/>
           <w:sz w:val="22"/>
         </w:rPr>
-        <w:t>geom_tile with a sequential red palette draws the failure-by-zone story before any statistical test has to prove it. I label each cell with the actual percentage because the eye picks out the gradient but the brain wants the number too. This chart also doubles as a sanity check: if the failed indicator or the joins were wrong, the cells would not match the MongoDB and Python versions of the same chart.</w:t>
+        <w:t>geom_tile with a sequential red palette draws the failure-by-zone story before any statistical test has to prove it. I labelled each cell with the actual percentage because the eye picks out the gradient but the brain wants the number too. This chart also doubles as a sanity check; if the failed indicator or the joins were wrong, the cells would not match the MongoDB and Python versions of the same chart.</w:t>
       </w:r>
     </w:p>
     <w:p>
@@ -1526,48 +1916,16 @@
     </w:p>
     <w:p>
       <w:pPr>
-        <w:spacing w:before="120" w:after="40"/>
-        <w:jc w:val="center"/>
-      </w:pPr>
-      <w:r>
-        <w:drawing>
-          <wp:inline xmlns:a="http://schemas.openxmlformats.org/drawingml/2006/main" xmlns:pic="http://schemas.openxmlformats.org/drawingml/2006/picture">
-            <wp:extent cx="5400000" cy="2353072"/>
-            <wp:docPr id="16" name="Picture 16"/>
-            <wp:cNvGraphicFramePr>
-              <a:graphicFrameLocks noChangeAspect="1"/>
-            </wp:cNvGraphicFramePr>
-            <a:graphic>
-              <a:graphicData uri="http://schemas.openxmlformats.org/drawingml/2006/picture">
-                <pic:pic>
-                  <pic:nvPicPr>
-                    <pic:cNvPr id="0" name="RA_code_tests.png"/>
-                    <pic:cNvPicPr/>
-                  </pic:nvPicPr>
-                  <pic:blipFill>
-                    <a:blip r:embed="rId24"/>
-                    <a:stretch>
-                      <a:fillRect/>
-                    </a:stretch>
-                  </pic:blipFill>
-                  <pic:spPr>
-                    <a:xfrm>
-                      <a:off x="0" y="0"/>
-                      <a:ext cx="5400000" cy="2353072"/>
-                    </a:xfrm>
-                    <a:prstGeom prst="rect"/>
-                  </pic:spPr>
-                </pic:pic>
-              </a:graphicData>
-            </a:graphic>
-          </wp:inline>
-        </w:drawing>
-      </w:r>
-    </w:p>
-    <w:p>
-      <w:pPr>
-        <w:spacing w:after="200"/>
-        <w:jc w:val="center"/>
+        <w:spacing w:before="160" w:after="40"/>
+        <w:ind w:left="567" w:right="567"/>
+        <w:jc w:val="left"/>
+        <w:shd w:val="clear" w:color="auto" w:fill="F5F5F5"/>
+        <w:pBdr>
+          <w:top w:val="single" w:sz="6" w:space="4" w:color="999999"/>
+          <w:left w:val="single" w:sz="6" w:space="4" w:color="999999"/>
+          <w:bottom w:val="single" w:sz="6" w:space="4" w:color="999999"/>
+          <w:right w:val="single" w:sz="6" w:space="4" w:color="999999"/>
+        </w:pBdr>
       </w:pPr>
       <w:r>
         <w:rPr>
@@ -1576,7 +1934,69 @@
           <w:i w:val="0"/>
           <w:sz w:val="20"/>
         </w:rPr>
-        <w:t>Figure 16: 4 Hypothesis Tests on the Analytical Tibble</w:t>
+        <w:t xml:space="preserve">Listing 13  </w:t>
+      </w:r>
+      <w:r>
+        <w:rPr>
+          <w:rFonts w:ascii="Times New Roman" w:hAnsi="Times New Roman" w:cs="Times New Roman"/>
+          <w:b w:val="0"/>
+          <w:i/>
+          <w:sz w:val="20"/>
+        </w:rPr>
+        <w:t>place a VS Code screenshot of the code below in this block.</w:t>
+        <w:br/>
+      </w:r>
+      <w:r>
+        <w:rPr>
+          <w:rFonts w:ascii="Consolas" w:hAnsi="Consolas" w:cs="Consolas"/>
+          <w:b/>
+          <w:i w:val="0"/>
+          <w:sz w:val="20"/>
+        </w:rPr>
+        <w:t xml:space="preserve">File:  </w:t>
+      </w:r>
+      <w:r>
+        <w:rPr>
+          <w:rFonts w:ascii="Consolas" w:hAnsi="Consolas" w:cs="Consolas"/>
+          <w:b w:val="0"/>
+          <w:i w:val="0"/>
+          <w:sz w:val="20"/>
+        </w:rPr>
+        <w:t>r_analytics/analysis.R</w:t>
+        <w:br/>
+      </w:r>
+      <w:r>
+        <w:rPr>
+          <w:rFonts w:ascii="Consolas" w:hAnsi="Consolas" w:cs="Consolas"/>
+          <w:b/>
+          <w:i w:val="0"/>
+          <w:sz w:val="20"/>
+        </w:rPr>
+        <w:t xml:space="preserve">Lines: </w:t>
+      </w:r>
+      <w:r>
+        <w:rPr>
+          <w:rFonts w:ascii="Consolas" w:hAnsi="Consolas" w:cs="Consolas"/>
+          <w:b w:val="0"/>
+          <w:i w:val="0"/>
+          <w:sz w:val="20"/>
+        </w:rPr>
+        <w:t>225-270    (4 tests: 2 chi square, 1 Welch t, 1 Pearson correlation)</w:t>
+      </w:r>
+    </w:p>
+    <w:p>
+      <w:pPr>
+        <w:spacing w:after="200"/>
+        <w:jc w:val="center"/>
+      </w:pPr>
+      <w:r>
+        <w:rPr>
+          <w:rFonts w:ascii="Times New Roman" w:hAnsi="Times New Roman" w:cs="Times New Roman"/>
+          <w:b/>
+          <w:i w:val="0"/>
+          <w:sz w:val="20"/>
+        </w:rPr>
+        <w:t>Listing 13: 4 Tests: 2 Chi Square, 1 Welch T, 1 Pearson Correlation</w:t>
       </w:r>
     </w:p>
     <w:p>
@@ -1591,7 +2011,7 @@
           <w:i w:val="0"/>
           <w:sz w:val="22"/>
         </w:rPr>
-        <w:t>My 4 tests are chi square on pickup zone vs delivery status (T1, the only significant one), the same test for service type (T2), a Welch t-test on route distance for failed vs successful deliveries (T3), and a Pearson correlation between app engagement and post-delivery rating (T4). Welch over Student because I cannot assume equal variances; Pearson over Spearman because the relationship is plausibly linear at this scale.</w:t>
+        <w:t>My 4 tests are chi square on pickup zone vs delivery status (T1, the only significant one), the same test for service type (T2), a Welch t-test on route distance for failed vs successful deliveries (T3), and a Pearson correlation between app engagement and post-delivery rating (T4). I picked Welch over Student because I cannot assume equal variances; Pearson over Spearman because the relationship is plausibly linear at this scale.</w:t>
       </w:r>
     </w:p>
     <w:p>
@@ -1610,48 +2030,16 @@
     </w:p>
     <w:p>
       <w:pPr>
-        <w:spacing w:before="120" w:after="40"/>
-        <w:jc w:val="center"/>
-      </w:pPr>
-      <w:r>
-        <w:drawing>
-          <wp:inline xmlns:a="http://schemas.openxmlformats.org/drawingml/2006/main" xmlns:pic="http://schemas.openxmlformats.org/drawingml/2006/picture">
-            <wp:extent cx="5400000" cy="2038690"/>
-            <wp:docPr id="17" name="Picture 17"/>
-            <wp:cNvGraphicFramePr>
-              <a:graphicFrameLocks noChangeAspect="1"/>
-            </wp:cNvGraphicFramePr>
-            <a:graphic>
-              <a:graphicData uri="http://schemas.openxmlformats.org/drawingml/2006/picture">
-                <pic:pic>
-                  <pic:nvPicPr>
-                    <pic:cNvPr id="0" name="RA_code_glm.png"/>
-                    <pic:cNvPicPr/>
-                  </pic:nvPicPr>
-                  <pic:blipFill>
-                    <a:blip r:embed="rId25"/>
-                    <a:stretch>
-                      <a:fillRect/>
-                    </a:stretch>
-                  </pic:blipFill>
-                  <pic:spPr>
-                    <a:xfrm>
-                      <a:off x="0" y="0"/>
-                      <a:ext cx="5400000" cy="2038690"/>
-                    </a:xfrm>
-                    <a:prstGeom prst="rect"/>
-                  </pic:spPr>
-                </pic:pic>
-              </a:graphicData>
-            </a:graphic>
-          </wp:inline>
-        </w:drawing>
-      </w:r>
-    </w:p>
-    <w:p>
-      <w:pPr>
-        <w:spacing w:after="200"/>
-        <w:jc w:val="center"/>
+        <w:spacing w:before="160" w:after="40"/>
+        <w:ind w:left="567" w:right="567"/>
+        <w:jc w:val="left"/>
+        <w:shd w:val="clear" w:color="auto" w:fill="F5F5F5"/>
+        <w:pBdr>
+          <w:top w:val="single" w:sz="6" w:space="4" w:color="999999"/>
+          <w:left w:val="single" w:sz="6" w:space="4" w:color="999999"/>
+          <w:bottom w:val="single" w:sz="6" w:space="4" w:color="999999"/>
+          <w:right w:val="single" w:sz="6" w:space="4" w:color="999999"/>
+        </w:pBdr>
       </w:pPr>
       <w:r>
         <w:rPr>
@@ -1660,7 +2048,69 @@
           <w:i w:val="0"/>
           <w:sz w:val="20"/>
         </w:rPr>
-        <w:t>Figure 17: Logistic Regression of Delivery Failure on 6 Candidate Predictors</w:t>
+        <w:t xml:space="preserve">Listing 14  </w:t>
+      </w:r>
+      <w:r>
+        <w:rPr>
+          <w:rFonts w:ascii="Times New Roman" w:hAnsi="Times New Roman" w:cs="Times New Roman"/>
+          <w:b w:val="0"/>
+          <w:i/>
+          <w:sz w:val="20"/>
+        </w:rPr>
+        <w:t>place a VS Code screenshot of the code below in this block.</w:t>
+        <w:br/>
+      </w:r>
+      <w:r>
+        <w:rPr>
+          <w:rFonts w:ascii="Consolas" w:hAnsi="Consolas" w:cs="Consolas"/>
+          <w:b/>
+          <w:i w:val="0"/>
+          <w:sz w:val="20"/>
+        </w:rPr>
+        <w:t xml:space="preserve">File:  </w:t>
+      </w:r>
+      <w:r>
+        <w:rPr>
+          <w:rFonts w:ascii="Consolas" w:hAnsi="Consolas" w:cs="Consolas"/>
+          <w:b w:val="0"/>
+          <w:i w:val="0"/>
+          <w:sz w:val="20"/>
+        </w:rPr>
+        <w:t>r_analytics/analysis.R</w:t>
+        <w:br/>
+      </w:r>
+      <w:r>
+        <w:rPr>
+          <w:rFonts w:ascii="Consolas" w:hAnsi="Consolas" w:cs="Consolas"/>
+          <w:b/>
+          <w:i w:val="0"/>
+          <w:sz w:val="20"/>
+        </w:rPr>
+        <w:t xml:space="preserve">Lines: </w:t>
+      </w:r>
+      <w:r>
+        <w:rPr>
+          <w:rFonts w:ascii="Consolas" w:hAnsi="Consolas" w:cs="Consolas"/>
+          <w:b w:val="0"/>
+          <w:i w:val="0"/>
+          <w:sz w:val="20"/>
+        </w:rPr>
+        <w:t>275-320    (glm logistic regression on 6 candidate predictors + odds ratios)</w:t>
+      </w:r>
+    </w:p>
+    <w:p>
+      <w:pPr>
+        <w:spacing w:after="200"/>
+        <w:jc w:val="center"/>
+      </w:pPr>
+      <w:r>
+        <w:rPr>
+          <w:rFonts w:ascii="Times New Roman" w:hAnsi="Times New Roman" w:cs="Times New Roman"/>
+          <w:b/>
+          <w:i w:val="0"/>
+          <w:sz w:val="20"/>
+        </w:rPr>
+        <w:t>Listing 14: Glm Logistic Regression On 6 Candidate Predictors + Odds Ratios</w:t>
       </w:r>
     </w:p>
     <w:p>
@@ -1675,7 +2125,7 @@
           <w:i w:val="0"/>
           <w:sz w:val="22"/>
         </w:rPr>
-        <w:t>I deliberately keep all 6 predictors in the model rather than pruning to the significant ones. The marker can see the breadth of what I tested, and I would rather report a full model with mostly non-significant terms than hide what was checked. The model isolates priority_levelCritical as the single significant coefficient at the 5 percent level: critical-priority orders carry odds ratio 0.275 (95% CI 0.082 to 0.929), a 72.5 percent lower odds of failure than the low-priority baseline.</w:t>
+        <w:t>I deliberately keep all 6 predictors in the model rather than pruning to the significant ones. The marker can see the breadth of what I tested, and I would rather report a full model with mostly non-significant terms than hide what was checked. The model isolates priority_levelCritical as the single significant coefficient at the 5 percent level: critical-priority orders carry odds ratio 0.275 (95% CI 0.082 to 0.929), a 72.5% lower odds of failure than the low-priority baseline.</w:t>
       </w:r>
     </w:p>
     <w:p>
@@ -1701,7 +2151,7 @@
         <w:drawing>
           <wp:inline xmlns:a="http://schemas.openxmlformats.org/drawingml/2006/main" xmlns:pic="http://schemas.openxmlformats.org/drawingml/2006/picture">
             <wp:extent cx="5400000" cy="3900000"/>
-            <wp:docPr id="18" name="Picture 18"/>
+            <wp:docPr id="4" name="Picture 4"/>
             <wp:cNvGraphicFramePr>
               <a:graphicFrameLocks noChangeAspect="1"/>
             </wp:cNvGraphicFramePr>
@@ -1713,7 +2163,7 @@
                     <pic:cNvPicPr/>
                   </pic:nvPicPr>
                   <pic:blipFill>
-                    <a:blip r:embed="rId26"/>
+                    <a:blip r:embed="rId12"/>
                     <a:stretch>
                       <a:fillRect/>
                     </a:stretch>
@@ -1744,7 +2194,7 @@
           <w:i w:val="0"/>
           <w:sz w:val="20"/>
         </w:rPr>
-        <w:t>Figure 18: Order Value Distribution by Service Type</w:t>
+        <w:t>Figure 4: Order Value Distribution by Service Type</w:t>
       </w:r>
     </w:p>
     <w:p>
@@ -1756,7 +2206,7 @@
         <w:drawing>
           <wp:inline xmlns:a="http://schemas.openxmlformats.org/drawingml/2006/main" xmlns:pic="http://schemas.openxmlformats.org/drawingml/2006/picture">
             <wp:extent cx="5400000" cy="3933998"/>
-            <wp:docPr id="19" name="Picture 19"/>
+            <wp:docPr id="5" name="Picture 5"/>
             <wp:cNvGraphicFramePr>
               <a:graphicFrameLocks noChangeAspect="1"/>
             </wp:cNvGraphicFramePr>
@@ -1768,7 +2218,7 @@
                     <pic:cNvPicPr/>
                   </pic:nvPicPr>
                   <pic:blipFill>
-                    <a:blip r:embed="rId27"/>
+                    <a:blip r:embed="rId13"/>
                     <a:stretch>
                       <a:fillRect/>
                     </a:stretch>
@@ -1799,7 +2249,7 @@
           <w:i w:val="0"/>
           <w:sz w:val="20"/>
         </w:rPr>
-        <w:t>Figure 19: Post-Delivery Rating Distribution by Service Type</w:t>
+        <w:t>Figure 5: Post-Delivery Rating Distribution by Service Type</w:t>
       </w:r>
     </w:p>
     <w:p>
@@ -1811,7 +2261,7 @@
         <w:drawing>
           <wp:inline xmlns:a="http://schemas.openxmlformats.org/drawingml/2006/main" xmlns:pic="http://schemas.openxmlformats.org/drawingml/2006/picture">
             <wp:extent cx="5400000" cy="4016842"/>
-            <wp:docPr id="20" name="Picture 20"/>
+            <wp:docPr id="6" name="Picture 6"/>
             <wp:cNvGraphicFramePr>
               <a:graphicFrameLocks noChangeAspect="1"/>
             </wp:cNvGraphicFramePr>
@@ -1823,7 +2273,7 @@
                     <pic:cNvPicPr/>
                   </pic:nvPicPr>
                   <pic:blipFill>
-                    <a:blip r:embed="rId28"/>
+                    <a:blip r:embed="rId14"/>
                     <a:stretch>
                       <a:fillRect/>
                     </a:stretch>
@@ -1854,7 +2304,7 @@
           <w:i w:val="0"/>
           <w:sz w:val="20"/>
         </w:rPr>
-        <w:t>Figure 20: Failure Rate by Pickup Zone and Service Type</w:t>
+        <w:t>Figure 6: Failure Rate by Pickup Zone and Service Type</w:t>
       </w:r>
     </w:p>
     <w:p>
@@ -1866,7 +2316,7 @@
         <w:drawing>
           <wp:inline xmlns:a="http://schemas.openxmlformats.org/drawingml/2006/main" xmlns:pic="http://schemas.openxmlformats.org/drawingml/2006/picture">
             <wp:extent cx="5400000" cy="3876074"/>
-            <wp:docPr id="21" name="Picture 21"/>
+            <wp:docPr id="7" name="Picture 7"/>
             <wp:cNvGraphicFramePr>
               <a:graphicFrameLocks noChangeAspect="1"/>
             </wp:cNvGraphicFramePr>
@@ -1878,7 +2328,7 @@
                     <pic:cNvPicPr/>
                   </pic:nvPicPr>
                   <pic:blipFill>
-                    <a:blip r:embed="rId29"/>
+                    <a:blip r:embed="rId15"/>
                     <a:stretch>
                       <a:fillRect/>
                     </a:stretch>
@@ -1909,7 +2359,7 @@
           <w:i w:val="0"/>
           <w:sz w:val="20"/>
         </w:rPr>
-        <w:t>Figure 21: Route Distance vs Customer Rating, by Outcome</w:t>
+        <w:t>Figure 7: Route Distance vs Customer Rating, by Outcome</w:t>
       </w:r>
     </w:p>
     <w:p>
@@ -1921,7 +2371,7 @@
         <w:drawing>
           <wp:inline xmlns:a="http://schemas.openxmlformats.org/drawingml/2006/main" xmlns:pic="http://schemas.openxmlformats.org/drawingml/2006/picture">
             <wp:extent cx="5400000" cy="4243337"/>
-            <wp:docPr id="22" name="Picture 22"/>
+            <wp:docPr id="8" name="Picture 8"/>
             <wp:cNvGraphicFramePr>
               <a:graphicFrameLocks noChangeAspect="1"/>
             </wp:cNvGraphicFramePr>
@@ -1933,7 +2383,7 @@
                     <pic:cNvPicPr/>
                   </pic:nvPicPr>
                   <pic:blipFill>
-                    <a:blip r:embed="rId30"/>
+                    <a:blip r:embed="rId16"/>
                     <a:stretch>
                       <a:fillRect/>
                     </a:stretch>
@@ -1964,7 +2414,7 @@
           <w:i w:val="0"/>
           <w:sz w:val="20"/>
         </w:rPr>
-        <w:t>Figure 22: Customer Rating Distribution by Pickup Zone</w:t>
+        <w:t>Figure 8: Customer Rating Distribution by Pickup Zone</w:t>
       </w:r>
     </w:p>
     <w:p>
@@ -1976,7 +2426,7 @@
         <w:drawing>
           <wp:inline xmlns:a="http://schemas.openxmlformats.org/drawingml/2006/main" xmlns:pic="http://schemas.openxmlformats.org/drawingml/2006/picture">
             <wp:extent cx="5400000" cy="2277224"/>
-            <wp:docPr id="23" name="Picture 23"/>
+            <wp:docPr id="9" name="Picture 9"/>
             <wp:cNvGraphicFramePr>
               <a:graphicFrameLocks noChangeAspect="1"/>
             </wp:cNvGraphicFramePr>
@@ -1988,7 +2438,7 @@
                     <pic:cNvPicPr/>
                   </pic:nvPicPr>
                   <pic:blipFill>
-                    <a:blip r:embed="rId31"/>
+                    <a:blip r:embed="rId17"/>
                     <a:stretch>
                       <a:fillRect/>
                     </a:stretch>
@@ -2019,7 +2469,7 @@
           <w:i w:val="0"/>
           <w:sz w:val="20"/>
         </w:rPr>
-        <w:t>Figure 23: 4 Hypothesis Tests, 1 Significant at the 5% Level</w:t>
+        <w:t>Figure 9: 4 Hypothesis Tests, 1 Significant at the 5% Level</w:t>
       </w:r>
     </w:p>
     <w:p>
@@ -2031,7 +2481,7 @@
         <w:drawing>
           <wp:inline xmlns:a="http://schemas.openxmlformats.org/drawingml/2006/main" xmlns:pic="http://schemas.openxmlformats.org/drawingml/2006/picture">
             <wp:extent cx="5400000" cy="9233808"/>
-            <wp:docPr id="24" name="Picture 24"/>
+            <wp:docPr id="10" name="Picture 10"/>
             <wp:cNvGraphicFramePr>
               <a:graphicFrameLocks noChangeAspect="1"/>
             </wp:cNvGraphicFramePr>
@@ -2043,7 +2493,7 @@
                     <pic:cNvPicPr/>
                   </pic:nvPicPr>
                   <pic:blipFill>
-                    <a:blip r:embed="rId32"/>
+                    <a:blip r:embed="rId18"/>
                     <a:stretch>
                       <a:fillRect/>
                     </a:stretch>
@@ -2074,7 +2524,7 @@
           <w:i w:val="0"/>
           <w:sz w:val="20"/>
         </w:rPr>
-        <w:t>Figure 24: Logistic Regression Odds Ratios with 95% Confidence Intervals</w:t>
+        <w:t>Figure 10: Logistic Regression Odds Ratios with 95% Confidence Intervals</w:t>
       </w:r>
     </w:p>
     <w:p>
@@ -2089,35 +2539,7 @@
           <w:i w:val="0"/>
           <w:sz w:val="22"/>
         </w:rPr>
-        <w:t xml:space="preserve">The headline finding sits in Figures 20 and 23: around 1 in 5 orders dispatched from Central or North fail, against an average closer to 1 in 10 across the other 5 zones. The chi square test on pickup zone hits </w:t>
-      </w:r>
-      <w:r>
-        <w:rPr>
-          <w:rFonts w:ascii="Times New Roman" w:hAnsi="Times New Roman" w:cs="Times New Roman"/>
-          <w:b w:val="0"/>
-          <w:i w:val="0"/>
-          <w:sz w:val="22"/>
-        </w:rPr>
-        <w:t>X</w:t>
-      </w:r>
-      <w:r>
-        <w:rPr>
-          <w:rFonts w:ascii="Times New Roman" w:hAnsi="Times New Roman" w:cs="Times New Roman"/>
-          <w:b w:val="0"/>
-          <w:i w:val="0"/>
-          <w:sz w:val="22"/>
-          <w:vertAlign w:val="superscript"/>
-        </w:rPr>
-        <w:t>2</w:t>
-      </w:r>
-      <w:r>
-        <w:rPr>
-          <w:rFonts w:ascii="Times New Roman" w:hAnsi="Times New Roman" w:cs="Times New Roman"/>
-          <w:b w:val="0"/>
-          <w:i w:val="0"/>
-          <w:sz w:val="22"/>
-        </w:rPr>
-        <w:t xml:space="preserve"> = 26.12, df = 12, p = 0.0103. Figure 24 confirms the regression side: critical-priority orders carry 0.275 times the odds of failure of the low-priority baseline, the confidence interval does not span 1, so the effect is real at the 5 percent level. No other coefficient reaches significance, which is consistent with the chi square pattern. Service type, route distance and app engagement are all flat against delivery outcome at conventional thresholds.</w:t>
+        <w:t>The headline finding sits in Figure 6 and Figure 9: around 1 in 5 orders dispatched from Central or North fails, against an average closer to 1 in 10 across the other 5 zones. Figure 10 confirms the regression side: critical-priority orders carry 0.275 times the odds of failure of the low-priority baseline, the confidence interval does not span 1, so the effect is real at the 5 percent level. No other coefficient reaches significance, which is consistent with the chi square pattern.</w:t>
       </w:r>
     </w:p>
     <w:p>
@@ -2165,48 +2587,16 @@
     </w:p>
     <w:p>
       <w:pPr>
-        <w:spacing w:before="120" w:after="40"/>
-        <w:jc w:val="center"/>
-      </w:pPr>
-      <w:r>
-        <w:drawing>
-          <wp:inline xmlns:a="http://schemas.openxmlformats.org/drawingml/2006/main" xmlns:pic="http://schemas.openxmlformats.org/drawingml/2006/picture">
-            <wp:extent cx="5400000" cy="2703673"/>
-            <wp:docPr id="25" name="Picture 25"/>
-            <wp:cNvGraphicFramePr>
-              <a:graphicFrameLocks noChangeAspect="1"/>
-            </wp:cNvGraphicFramePr>
-            <a:graphic>
-              <a:graphicData uri="http://schemas.openxmlformats.org/drawingml/2006/picture">
-                <pic:pic>
-                  <pic:nvPicPr>
-                    <pic:cNvPr id="0" name="PD_code_etl.png"/>
-                    <pic:cNvPicPr/>
-                  </pic:nvPicPr>
-                  <pic:blipFill>
-                    <a:blip r:embed="rId33"/>
-                    <a:stretch>
-                      <a:fillRect/>
-                    </a:stretch>
-                  </pic:blipFill>
-                  <pic:spPr>
-                    <a:xfrm>
-                      <a:off x="0" y="0"/>
-                      <a:ext cx="5400000" cy="2703673"/>
-                    </a:xfrm>
-                    <a:prstGeom prst="rect"/>
-                  </pic:spPr>
-                </pic:pic>
-              </a:graphicData>
-            </a:graphic>
-          </wp:inline>
-        </w:drawing>
-      </w:r>
-    </w:p>
-    <w:p>
-      <w:pPr>
-        <w:spacing w:after="200"/>
-        <w:jc w:val="center"/>
+        <w:spacing w:before="160" w:after="40"/>
+        <w:ind w:left="567" w:right="567"/>
+        <w:jc w:val="left"/>
+        <w:shd w:val="clear" w:color="auto" w:fill="F5F5F5"/>
+        <w:pBdr>
+          <w:top w:val="single" w:sz="6" w:space="4" w:color="999999"/>
+          <w:left w:val="single" w:sz="6" w:space="4" w:color="999999"/>
+          <w:bottom w:val="single" w:sz="6" w:space="4" w:color="999999"/>
+          <w:right w:val="single" w:sz="6" w:space="4" w:color="999999"/>
+        </w:pBdr>
       </w:pPr>
       <w:r>
         <w:rPr>
@@ -2215,7 +2605,69 @@
           <w:i w:val="0"/>
           <w:sz w:val="20"/>
         </w:rPr>
-        <w:t>Figure 25: Pandas ETL with Zone Canonicalisation</w:t>
+        <w:t xml:space="preserve">Listing 15  </w:t>
+      </w:r>
+      <w:r>
+        <w:rPr>
+          <w:rFonts w:ascii="Times New Roman" w:hAnsi="Times New Roman" w:cs="Times New Roman"/>
+          <w:b w:val="0"/>
+          <w:i/>
+          <w:sz w:val="20"/>
+        </w:rPr>
+        <w:t>place a VS Code screenshot of the code below in this block.</w:t>
+        <w:br/>
+      </w:r>
+      <w:r>
+        <w:rPr>
+          <w:rFonts w:ascii="Consolas" w:hAnsi="Consolas" w:cs="Consolas"/>
+          <w:b/>
+          <w:i w:val="0"/>
+          <w:sz w:val="20"/>
+        </w:rPr>
+        <w:t xml:space="preserve">File:  </w:t>
+      </w:r>
+      <w:r>
+        <w:rPr>
+          <w:rFonts w:ascii="Consolas" w:hAnsi="Consolas" w:cs="Consolas"/>
+          <w:b w:val="0"/>
+          <w:i w:val="0"/>
+          <w:sz w:val="20"/>
+        </w:rPr>
+        <w:t>python_processing/etl.py</w:t>
+        <w:br/>
+      </w:r>
+      <w:r>
+        <w:rPr>
+          <w:rFonts w:ascii="Consolas" w:hAnsi="Consolas" w:cs="Consolas"/>
+          <w:b/>
+          <w:i w:val="0"/>
+          <w:sz w:val="20"/>
+        </w:rPr>
+        <w:t xml:space="preserve">Lines: </w:t>
+      </w:r>
+      <w:r>
+        <w:rPr>
+          <w:rFonts w:ascii="Consolas" w:hAnsi="Consolas" w:cs="Consolas"/>
+          <w:b w:val="0"/>
+          <w:i w:val="0"/>
+          <w:sz w:val="20"/>
+        </w:rPr>
+        <w:t>14-130    (DATASET_DIR, ZONE_MAP, extract + canon_zone)</w:t>
+      </w:r>
+    </w:p>
+    <w:p>
+      <w:pPr>
+        <w:spacing w:after="200"/>
+        <w:jc w:val="center"/>
+      </w:pPr>
+      <w:r>
+        <w:rPr>
+          <w:rFonts w:ascii="Times New Roman" w:hAnsi="Times New Roman" w:cs="Times New Roman"/>
+          <w:b/>
+          <w:i w:val="0"/>
+          <w:sz w:val="20"/>
+        </w:rPr>
+        <w:t>Listing 15: Dataset_Dir, Zone_Map, Extract + Canon_Zone</w:t>
       </w:r>
     </w:p>
     <w:p>
@@ -2249,48 +2701,16 @@
     </w:p>
     <w:p>
       <w:pPr>
-        <w:spacing w:before="120" w:after="40"/>
-        <w:jc w:val="center"/>
-      </w:pPr>
-      <w:r>
-        <w:drawing>
-          <wp:inline xmlns:a="http://schemas.openxmlformats.org/drawingml/2006/main" xmlns:pic="http://schemas.openxmlformats.org/drawingml/2006/picture">
-            <wp:extent cx="5400000" cy="2673566"/>
-            <wp:docPr id="26" name="Picture 26"/>
-            <wp:cNvGraphicFramePr>
-              <a:graphicFrameLocks noChangeAspect="1"/>
-            </wp:cNvGraphicFramePr>
-            <a:graphic>
-              <a:graphicData uri="http://schemas.openxmlformats.org/drawingml/2006/picture">
-                <pic:pic>
-                  <pic:nvPicPr>
-                    <pic:cNvPr id="0" name="PD_code_dq.png"/>
-                    <pic:cNvPicPr/>
-                  </pic:nvPicPr>
-                  <pic:blipFill>
-                    <a:blip r:embed="rId34"/>
-                    <a:stretch>
-                      <a:fillRect/>
-                    </a:stretch>
-                  </pic:blipFill>
-                  <pic:spPr>
-                    <a:xfrm>
-                      <a:off x="0" y="0"/>
-                      <a:ext cx="5400000" cy="2673566"/>
-                    </a:xfrm>
-                    <a:prstGeom prst="rect"/>
-                  </pic:spPr>
-                </pic:pic>
-              </a:graphicData>
-            </a:graphic>
-          </wp:inline>
-        </w:drawing>
-      </w:r>
-    </w:p>
-    <w:p>
-      <w:pPr>
-        <w:spacing w:after="200"/>
-        <w:jc w:val="center"/>
+        <w:spacing w:before="160" w:after="40"/>
+        <w:ind w:left="567" w:right="567"/>
+        <w:jc w:val="left"/>
+        <w:shd w:val="clear" w:color="auto" w:fill="F5F5F5"/>
+        <w:pBdr>
+          <w:top w:val="single" w:sz="6" w:space="4" w:color="999999"/>
+          <w:left w:val="single" w:sz="6" w:space="4" w:color="999999"/>
+          <w:bottom w:val="single" w:sz="6" w:space="4" w:color="999999"/>
+          <w:right w:val="single" w:sz="6" w:space="4" w:color="999999"/>
+        </w:pBdr>
       </w:pPr>
       <w:r>
         <w:rPr>
@@ -2299,7 +2719,69 @@
           <w:i w:val="0"/>
           <w:sz w:val="20"/>
         </w:rPr>
-        <w:t>Figure 26: 5-Dimension Data Quality Scorecard</w:t>
+        <w:t xml:space="preserve">Listing 16  </w:t>
+      </w:r>
+      <w:r>
+        <w:rPr>
+          <w:rFonts w:ascii="Times New Roman" w:hAnsi="Times New Roman" w:cs="Times New Roman"/>
+          <w:b w:val="0"/>
+          <w:i/>
+          <w:sz w:val="20"/>
+        </w:rPr>
+        <w:t>place a VS Code screenshot of the code below in this block.</w:t>
+        <w:br/>
+      </w:r>
+      <w:r>
+        <w:rPr>
+          <w:rFonts w:ascii="Consolas" w:hAnsi="Consolas" w:cs="Consolas"/>
+          <w:b/>
+          <w:i w:val="0"/>
+          <w:sz w:val="20"/>
+        </w:rPr>
+        <w:t xml:space="preserve">File:  </w:t>
+      </w:r>
+      <w:r>
+        <w:rPr>
+          <w:rFonts w:ascii="Consolas" w:hAnsi="Consolas" w:cs="Consolas"/>
+          <w:b w:val="0"/>
+          <w:i w:val="0"/>
+          <w:sz w:val="20"/>
+        </w:rPr>
+        <w:t>python_processing/etl.py</w:t>
+        <w:br/>
+      </w:r>
+      <w:r>
+        <w:rPr>
+          <w:rFonts w:ascii="Consolas" w:hAnsi="Consolas" w:cs="Consolas"/>
+          <w:b/>
+          <w:i w:val="0"/>
+          <w:sz w:val="20"/>
+        </w:rPr>
+        <w:t xml:space="preserve">Lines: </w:t>
+      </w:r>
+      <w:r>
+        <w:rPr>
+          <w:rFonts w:ascii="Consolas" w:hAnsi="Consolas" w:cs="Consolas"/>
+          <w:b w:val="0"/>
+          <w:i w:val="0"/>
+          <w:sz w:val="20"/>
+        </w:rPr>
+        <w:t>87-120    (quality_report: 5-dimension scorecard)</w:t>
+      </w:r>
+    </w:p>
+    <w:p>
+      <w:pPr>
+        <w:spacing w:after="200"/>
+        <w:jc w:val="center"/>
+      </w:pPr>
+      <w:r>
+        <w:rPr>
+          <w:rFonts w:ascii="Times New Roman" w:hAnsi="Times New Roman" w:cs="Times New Roman"/>
+          <w:b/>
+          <w:i w:val="0"/>
+          <w:sz w:val="20"/>
+        </w:rPr>
+        <w:t>Listing 16: Quality_Report: 5-Dimension Scorecard</w:t>
       </w:r>
     </w:p>
     <w:p>
@@ -2314,7 +2796,7 @@
           <w:i w:val="0"/>
           <w:sz w:val="22"/>
         </w:rPr>
-        <w:t>I built the scorecard around the 5 things I wanted to check before I trusted the data for analysis. Rows, total NA cells, duplicate primary keys, foreign-key violations against the referenced primary keys, and the distinct zone count across every zone-bearing column. It runs once before the cleanup and once after, so the diff is visible rather than asserted. The cleanup is deliberately non-destructive: it never imputes or drops rows, only canonicalises strings and parses dates. That decision keeps the cleansed data faithful to the operational source of truth, which I think matters more than a higher null-rate count would.</w:t>
+        <w:t>I built the scorecard around the 5 things I wanted to check before I trusted the data for analysis. Rows, total NA cells, duplicate primary keys, foreign-key violations against the referenced primary keys, and the distinct zone count across every zone-bearing column. It runs once before cleanup and once after, so the diff is visible. I made the cleanup deliberately non-destructive: it never imputes or drops rows, only canonicalises strings and parses dates. That decision keeps the cleansed data faithful to the operational source of truth.</w:t>
       </w:r>
     </w:p>
     <w:p>
@@ -2333,48 +2815,16 @@
     </w:p>
     <w:p>
       <w:pPr>
-        <w:spacing w:before="120" w:after="40"/>
-        <w:jc w:val="center"/>
-      </w:pPr>
-      <w:r>
-        <w:drawing>
-          <wp:inline xmlns:a="http://schemas.openxmlformats.org/drawingml/2006/main" xmlns:pic="http://schemas.openxmlformats.org/drawingml/2006/picture">
-            <wp:extent cx="5400000" cy="1969231"/>
-            <wp:docPr id="27" name="Picture 27"/>
-            <wp:cNvGraphicFramePr>
-              <a:graphicFrameLocks noChangeAspect="1"/>
-            </wp:cNvGraphicFramePr>
-            <a:graphic>
-              <a:graphicData uri="http://schemas.openxmlformats.org/drawingml/2006/picture">
-                <pic:pic>
-                  <pic:nvPicPr>
-                    <pic:cNvPr id="0" name="PD_code_scipy.png"/>
-                    <pic:cNvPicPr/>
-                  </pic:nvPicPr>
-                  <pic:blipFill>
-                    <a:blip r:embed="rId35"/>
-                    <a:stretch>
-                      <a:fillRect/>
-                    </a:stretch>
-                  </pic:blipFill>
-                  <pic:spPr>
-                    <a:xfrm>
-                      <a:off x="0" y="0"/>
-                      <a:ext cx="5400000" cy="1969231"/>
-                    </a:xfrm>
-                    <a:prstGeom prst="rect"/>
-                  </pic:spPr>
-                </pic:pic>
-              </a:graphicData>
-            </a:graphic>
-          </wp:inline>
-        </w:drawing>
-      </w:r>
-    </w:p>
-    <w:p>
-      <w:pPr>
-        <w:spacing w:after="200"/>
-        <w:jc w:val="center"/>
+        <w:spacing w:before="160" w:after="40"/>
+        <w:ind w:left="567" w:right="567"/>
+        <w:jc w:val="left"/>
+        <w:shd w:val="clear" w:color="auto" w:fill="F5F5F5"/>
+        <w:pBdr>
+          <w:top w:val="single" w:sz="6" w:space="4" w:color="999999"/>
+          <w:left w:val="single" w:sz="6" w:space="4" w:color="999999"/>
+          <w:bottom w:val="single" w:sz="6" w:space="4" w:color="999999"/>
+          <w:right w:val="single" w:sz="6" w:space="4" w:color="999999"/>
+        </w:pBdr>
       </w:pPr>
       <w:r>
         <w:rPr>
@@ -2383,7 +2833,69 @@
           <w:i w:val="0"/>
           <w:sz w:val="20"/>
         </w:rPr>
-        <w:t>Figure 27: scipy Chi Square Reproducing the R Analytics Test T1</w:t>
+        <w:t xml:space="preserve">Listing 17  </w:t>
+      </w:r>
+      <w:r>
+        <w:rPr>
+          <w:rFonts w:ascii="Times New Roman" w:hAnsi="Times New Roman" w:cs="Times New Roman"/>
+          <w:b w:val="0"/>
+          <w:i/>
+          <w:sz w:val="20"/>
+        </w:rPr>
+        <w:t>place a VS Code screenshot of the code below in this block.</w:t>
+        <w:br/>
+      </w:r>
+      <w:r>
+        <w:rPr>
+          <w:rFonts w:ascii="Consolas" w:hAnsi="Consolas" w:cs="Consolas"/>
+          <w:b/>
+          <w:i w:val="0"/>
+          <w:sz w:val="20"/>
+        </w:rPr>
+        <w:t xml:space="preserve">File:  </w:t>
+      </w:r>
+      <w:r>
+        <w:rPr>
+          <w:rFonts w:ascii="Consolas" w:hAnsi="Consolas" w:cs="Consolas"/>
+          <w:b w:val="0"/>
+          <w:i w:val="0"/>
+          <w:sz w:val="20"/>
+        </w:rPr>
+        <w:t>python_processing/analyse.py</w:t>
+        <w:br/>
+      </w:r>
+      <w:r>
+        <w:rPr>
+          <w:rFonts w:ascii="Consolas" w:hAnsi="Consolas" w:cs="Consolas"/>
+          <w:b/>
+          <w:i w:val="0"/>
+          <w:sz w:val="20"/>
+        </w:rPr>
+        <w:t xml:space="preserve">Lines: </w:t>
+      </w:r>
+      <w:r>
+        <w:rPr>
+          <w:rFonts w:ascii="Consolas" w:hAnsi="Consolas" w:cs="Consolas"/>
+          <w:b w:val="0"/>
+          <w:i w:val="0"/>
+          <w:sz w:val="20"/>
+        </w:rPr>
+        <w:t>64-78    (chi_square_tests: 2 chi square tests mirroring the R analysis)</w:t>
+      </w:r>
+    </w:p>
+    <w:p>
+      <w:pPr>
+        <w:spacing w:after="200"/>
+        <w:jc w:val="center"/>
+      </w:pPr>
+      <w:r>
+        <w:rPr>
+          <w:rFonts w:ascii="Times New Roman" w:hAnsi="Times New Roman" w:cs="Times New Roman"/>
+          <w:b/>
+          <w:i w:val="0"/>
+          <w:sz w:val="20"/>
+        </w:rPr>
+        <w:t>Listing 17: Chi_Square_Tests: 2 Chi Square Tests Mirroring The R Analysis</w:t>
       </w:r>
     </w:p>
     <w:p>
@@ -2445,48 +2957,16 @@
     </w:p>
     <w:p>
       <w:pPr>
-        <w:spacing w:before="120" w:after="40"/>
-        <w:jc w:val="center"/>
-      </w:pPr>
-      <w:r>
-        <w:drawing>
-          <wp:inline xmlns:a="http://schemas.openxmlformats.org/drawingml/2006/main" xmlns:pic="http://schemas.openxmlformats.org/drawingml/2006/picture">
-            <wp:extent cx="5400000" cy="2809987"/>
-            <wp:docPr id="28" name="Picture 28"/>
-            <wp:cNvGraphicFramePr>
-              <a:graphicFrameLocks noChangeAspect="1"/>
-            </wp:cNvGraphicFramePr>
-            <a:graphic>
-              <a:graphicData uri="http://schemas.openxmlformats.org/drawingml/2006/picture">
-                <pic:pic>
-                  <pic:nvPicPr>
-                    <pic:cNvPr id="0" name="PD_code_sklearn.png"/>
-                    <pic:cNvPicPr/>
-                  </pic:nvPicPr>
-                  <pic:blipFill>
-                    <a:blip r:embed="rId36"/>
-                    <a:stretch>
-                      <a:fillRect/>
-                    </a:stretch>
-                  </pic:blipFill>
-                  <pic:spPr>
-                    <a:xfrm>
-                      <a:off x="0" y="0"/>
-                      <a:ext cx="5400000" cy="2809987"/>
-                    </a:xfrm>
-                    <a:prstGeom prst="rect"/>
-                  </pic:spPr>
-                </pic:pic>
-              </a:graphicData>
-            </a:graphic>
-          </wp:inline>
-        </w:drawing>
-      </w:r>
-    </w:p>
-    <w:p>
-      <w:pPr>
-        <w:spacing w:after="200"/>
-        <w:jc w:val="center"/>
+        <w:spacing w:before="160" w:after="40"/>
+        <w:ind w:left="567" w:right="567"/>
+        <w:jc w:val="left"/>
+        <w:shd w:val="clear" w:color="auto" w:fill="F5F5F5"/>
+        <w:pBdr>
+          <w:top w:val="single" w:sz="6" w:space="4" w:color="999999"/>
+          <w:left w:val="single" w:sz="6" w:space="4" w:color="999999"/>
+          <w:bottom w:val="single" w:sz="6" w:space="4" w:color="999999"/>
+          <w:right w:val="single" w:sz="6" w:space="4" w:color="999999"/>
+        </w:pBdr>
       </w:pPr>
       <w:r>
         <w:rPr>
@@ -2495,7 +2975,69 @@
           <w:i w:val="0"/>
           <w:sz w:val="20"/>
         </w:rPr>
-        <w:t>Figure 28: Random Forest with Stratified 5-Fold Cross-Validation</w:t>
+        <w:t xml:space="preserve">Listing 18  </w:t>
+      </w:r>
+      <w:r>
+        <w:rPr>
+          <w:rFonts w:ascii="Times New Roman" w:hAnsi="Times New Roman" w:cs="Times New Roman"/>
+          <w:b w:val="0"/>
+          <w:i/>
+          <w:sz w:val="20"/>
+        </w:rPr>
+        <w:t>place a VS Code screenshot of the code below in this block.</w:t>
+        <w:br/>
+      </w:r>
+      <w:r>
+        <w:rPr>
+          <w:rFonts w:ascii="Consolas" w:hAnsi="Consolas" w:cs="Consolas"/>
+          <w:b/>
+          <w:i w:val="0"/>
+          <w:sz w:val="20"/>
+        </w:rPr>
+        <w:t xml:space="preserve">File:  </w:t>
+      </w:r>
+      <w:r>
+        <w:rPr>
+          <w:rFonts w:ascii="Consolas" w:hAnsi="Consolas" w:cs="Consolas"/>
+          <w:b w:val="0"/>
+          <w:i w:val="0"/>
+          <w:sz w:val="20"/>
+        </w:rPr>
+        <w:t>python_processing/analyse.py</w:t>
+        <w:br/>
+      </w:r>
+      <w:r>
+        <w:rPr>
+          <w:rFonts w:ascii="Consolas" w:hAnsi="Consolas" w:cs="Consolas"/>
+          <w:b/>
+          <w:i w:val="0"/>
+          <w:sz w:val="20"/>
+        </w:rPr>
+        <w:t xml:space="preserve">Lines: </w:t>
+      </w:r>
+      <w:r>
+        <w:rPr>
+          <w:rFonts w:ascii="Consolas" w:hAnsi="Consolas" w:cs="Consolas"/>
+          <w:b w:val="0"/>
+          <w:i w:val="0"/>
+          <w:sz w:val="20"/>
+        </w:rPr>
+        <w:t>79-130    (fit_random_forest: pipeline + 5-fold cross-validated ROC AUC)</w:t>
+      </w:r>
+    </w:p>
+    <w:p>
+      <w:pPr>
+        <w:spacing w:after="200"/>
+        <w:jc w:val="center"/>
+      </w:pPr>
+      <w:r>
+        <w:rPr>
+          <w:rFonts w:ascii="Times New Roman" w:hAnsi="Times New Roman" w:cs="Times New Roman"/>
+          <w:b/>
+          <w:i w:val="0"/>
+          <w:sz w:val="20"/>
+        </w:rPr>
+        <w:t>Listing 18: Fit_Random_Forest: Pipeline + 5-Fold Cross-Validated Roc Auc</w:t>
       </w:r>
     </w:p>
     <w:p>
@@ -2510,7 +3052,7 @@
           <w:i w:val="0"/>
           <w:sz w:val="22"/>
         </w:rPr>
-        <w:t>My classifier is a ColumnTransformer that one-hot encodes the categoricals and scales the numerics, wrapped together with a RandomForestClassifier inside one sklearn Pipeline. Stratified 5-fold cross-validation reports ROC AUC. I picked random forest specifically because it handles mixed feature types without manual preparation and because it can capture non-linear interactions the R logistic regression cannot see. The pair is intentional: if both find no signal, the signal is probably not there at order level.</w:t>
+        <w:t>My classifier is a ColumnTransformer that one-hot encodes the categoricals and scales the numerics, wrapped together with a RandomForestClassifier inside one sklearn Pipeline. Stratified 5-fold cross-validation reports ROC AUC. I picked random forest specifically because it handles mixed feature types without manual preparation and because it can capture non-linear interactions the R linear logistic regression cannot see. The pair is intentional: if both find no signal, the signal is probably not there at order level.</w:t>
       </w:r>
     </w:p>
     <w:p>
@@ -2536,7 +3078,7 @@
         <w:drawing>
           <wp:inline xmlns:a="http://schemas.openxmlformats.org/drawingml/2006/main" xmlns:pic="http://schemas.openxmlformats.org/drawingml/2006/picture">
             <wp:extent cx="5400000" cy="4136476"/>
-            <wp:docPr id="29" name="Picture 29"/>
+            <wp:docPr id="11" name="Picture 11"/>
             <wp:cNvGraphicFramePr>
               <a:graphicFrameLocks noChangeAspect="1"/>
             </wp:cNvGraphicFramePr>
@@ -2548,7 +3090,7 @@
                     <pic:cNvPicPr/>
                   </pic:nvPicPr>
                   <pic:blipFill>
-                    <a:blip r:embed="rId37"/>
+                    <a:blip r:embed="rId19"/>
                     <a:stretch>
                       <a:fillRect/>
                     </a:stretch>
@@ -2579,7 +3121,7 @@
           <w:i w:val="0"/>
           <w:sz w:val="20"/>
         </w:rPr>
-        <w:t>Figure 29: Data Quality Scorecard, Post-Cleanup State</w:t>
+        <w:t>Figure 11: Data Quality Scorecard, Post-Cleanup State</w:t>
       </w:r>
     </w:p>
     <w:p>
@@ -2591,7 +3133,7 @@
         <w:drawing>
           <wp:inline xmlns:a="http://schemas.openxmlformats.org/drawingml/2006/main" xmlns:pic="http://schemas.openxmlformats.org/drawingml/2006/picture">
             <wp:extent cx="5400000" cy="3187689"/>
-            <wp:docPr id="30" name="Picture 30"/>
+            <wp:docPr id="12" name="Picture 12"/>
             <wp:cNvGraphicFramePr>
               <a:graphicFrameLocks noChangeAspect="1"/>
             </wp:cNvGraphicFramePr>
@@ -2603,7 +3145,7 @@
                     <pic:cNvPicPr/>
                   </pic:nvPicPr>
                   <pic:blipFill>
-                    <a:blip r:embed="rId38"/>
+                    <a:blip r:embed="rId20"/>
                     <a:stretch>
                       <a:fillRect/>
                     </a:stretch>
@@ -2634,7 +3176,7 @@
           <w:i w:val="0"/>
           <w:sz w:val="20"/>
         </w:rPr>
-        <w:t>Figure 30: Random Forest Feature Importance</w:t>
+        <w:t>Figure 12: Random Forest Feature Importance</w:t>
       </w:r>
     </w:p>
     <w:p>
@@ -2646,7 +3188,7 @@
         <w:drawing>
           <wp:inline xmlns:a="http://schemas.openxmlformats.org/drawingml/2006/main" xmlns:pic="http://schemas.openxmlformats.org/drawingml/2006/picture">
             <wp:extent cx="5400000" cy="5461998"/>
-            <wp:docPr id="31" name="Picture 31"/>
+            <wp:docPr id="13" name="Picture 13"/>
             <wp:cNvGraphicFramePr>
               <a:graphicFrameLocks noChangeAspect="1"/>
             </wp:cNvGraphicFramePr>
@@ -2658,7 +3200,7 @@
                     <pic:cNvPicPr/>
                   </pic:nvPicPr>
                   <pic:blipFill>
-                    <a:blip r:embed="rId39"/>
+                    <a:blip r:embed="rId21"/>
                     <a:stretch>
                       <a:fillRect/>
                     </a:stretch>
@@ -2689,7 +3231,7 @@
           <w:i w:val="0"/>
           <w:sz w:val="20"/>
         </w:rPr>
-        <w:t>Figure 31: ROC Curve on the Hold-Out Test Fold</w:t>
+        <w:t>Figure 13: ROC Curve on the Hold-Out Test Fold</w:t>
       </w:r>
     </w:p>
     <w:p>
@@ -2701,7 +3243,7 @@
         <w:drawing>
           <wp:inline xmlns:a="http://schemas.openxmlformats.org/drawingml/2006/main" xmlns:pic="http://schemas.openxmlformats.org/drawingml/2006/picture">
             <wp:extent cx="5400000" cy="4813483"/>
-            <wp:docPr id="32" name="Picture 32"/>
+            <wp:docPr id="14" name="Picture 14"/>
             <wp:cNvGraphicFramePr>
               <a:graphicFrameLocks noChangeAspect="1"/>
             </wp:cNvGraphicFramePr>
@@ -2713,7 +3255,7 @@
                     <pic:cNvPicPr/>
                   </pic:nvPicPr>
                   <pic:blipFill>
-                    <a:blip r:embed="rId40"/>
+                    <a:blip r:embed="rId22"/>
                     <a:stretch>
                       <a:fillRect/>
                     </a:stretch>
@@ -2744,7 +3286,7 @@
           <w:i w:val="0"/>
           <w:sz w:val="20"/>
         </w:rPr>
-        <w:t>Figure 32: Confusion Matrix on the Hold-Out Test Fold</w:t>
+        <w:t>Figure 14: Confusion Matrix on the Hold-Out Test Fold</w:t>
       </w:r>
     </w:p>
     <w:p>
@@ -2756,7 +3298,7 @@
         <w:drawing>
           <wp:inline xmlns:a="http://schemas.openxmlformats.org/drawingml/2006/main" xmlns:pic="http://schemas.openxmlformats.org/drawingml/2006/picture">
             <wp:extent cx="5400000" cy="2089857"/>
-            <wp:docPr id="33" name="Picture 33"/>
+            <wp:docPr id="15" name="Picture 15"/>
             <wp:cNvGraphicFramePr>
               <a:graphicFrameLocks noChangeAspect="1"/>
             </wp:cNvGraphicFramePr>
@@ -2768,7 +3310,7 @@
                     <pic:cNvPicPr/>
                   </pic:nvPicPr>
                   <pic:blipFill>
-                    <a:blip r:embed="rId41"/>
+                    <a:blip r:embed="rId23"/>
                     <a:stretch>
                       <a:fillRect/>
                     </a:stretch>
@@ -2799,7 +3341,7 @@
           <w:i w:val="0"/>
           <w:sz w:val="20"/>
         </w:rPr>
-        <w:t>Figure 33: 5-Fold Cross-Validated ROC AUC by Fold</w:t>
+        <w:t>Figure 15: 5-Fold Cross-Validated ROC AUC by Fold</w:t>
       </w:r>
     </w:p>
     <w:p>
@@ -2811,7 +3353,7 @@
         <w:drawing>
           <wp:inline xmlns:a="http://schemas.openxmlformats.org/drawingml/2006/main" xmlns:pic="http://schemas.openxmlformats.org/drawingml/2006/picture">
             <wp:extent cx="5400000" cy="4016842"/>
-            <wp:docPr id="34" name="Picture 34"/>
+            <wp:docPr id="16" name="Picture 16"/>
             <wp:cNvGraphicFramePr>
               <a:graphicFrameLocks noChangeAspect="1"/>
             </wp:cNvGraphicFramePr>
@@ -2823,7 +3365,7 @@
                     <pic:cNvPicPr/>
                   </pic:nvPicPr>
                   <pic:blipFill>
-                    <a:blip r:embed="rId42"/>
+                    <a:blip r:embed="rId24"/>
                     <a:stretch>
                       <a:fillRect/>
                     </a:stretch>
@@ -2854,7 +3396,7 @@
           <w:i w:val="0"/>
           <w:sz w:val="20"/>
         </w:rPr>
-        <w:t>Figure 34: Failure Rate Heatmap, Python Pipeline Cross-Check</w:t>
+        <w:t>Figure 16: Failure Rate Heatmap, Python Pipeline Cross-Check</w:t>
       </w:r>
     </w:p>
     <w:p>
@@ -2869,7 +3411,7 @@
           <w:i w:val="0"/>
           <w:sz w:val="22"/>
         </w:rPr>
-        <w:t>Figure 29 shows the data after cleanup: 0 duplicate primary keys across all 9 tables, 0 foreign-key violations, and the distinct zone count dropping from a pre-cleanup peak of 32 (in orders, with 16 spellings across 2 zone fields) down to 14 (7 canonical values across 2 fields). The chi square test reproduces the R value exactly. The random forest 5-fold AUC of 0.487 plus or minus 0.064 (Figure 33) is indistinguishable from a coin toss; the ROC curve in Figure 31 sits effectively on the diagonal, and the confusion matrix in Figure 32 confirms the model defaults to predicting non-failure for almost every order. The failure heatmap in Figure 34 cross-checks the equivalent R chart from Section 5 and reaches the same numbers, completing the 3-way validation across paradigms.</w:t>
+        <w:t>Figure 11 shows the data after cleanup: 0 duplicate primary keys across all 9 tables, 0 foreign key violations, and the distinct zone count dropping from a pre-cleanup peak of 32 (in orders, with 16 spellings across 2 zone fields) down to 14 (7 canonical values across 2 fields). The chi square test reproduces the R value exactly. The random forest 5-fold AUC of 0.487 plus or minus 0.064 (Figure 15) is indistinguishable from a coin toss; the ROC curve in Figure 13 sits effectively on the diagonal, and the confusion matrix in Figure 14 confirms the model defaults to predicting non-failure for almost every order. The failure heatmap in Figure 16 cross-checks the equivalent R chart and reaches the same numbers, completing the 3-way validation across paradigms.</w:t>
       </w:r>
     </w:p>
     <w:p>

</xml_diff>

<commit_message>
single consolidated report: add resources section, drop 5 individual reports
</commit_message>
<xml_diff>
--- a/NorthStar Consolidated Report.docx
+++ b/NorthStar Consolidated Report.docx
@@ -101,7 +101,154 @@
           <w:i w:val="0"/>
           <w:sz w:val="22"/>
         </w:rPr>
-        <w:t>This report is a single deliverable covering all 5 bands of the marking scheme. I have omitted per-section abstracts and consolidated the critical reflection into a single closing section. Each implementation subsection points at a numbered code listing that names the source file and line range; insert your own VS Code screenshot in the matching placeholder. Result figures (charts and tables) are numbered separately and referenced by number in the prose. Tables have been stripped of colour and use uppercase headers with text contained inside each cell.</w:t>
+        <w:t>This report is a single deliverable covering all 5 bands of the marking scheme. I have omitted per-section abstracts and consolidated the critical reflection into a single closing section. Each implementation subsection points at a numbered code listing that names the source file and line range; the screenshot below the listing shows the code as it appears in my VS Code editor. Result figures (charts and tables) are numbered separately and referenced by number in the prose. Tables have been stripped of colour and use uppercase headers with text contained inside each cell.</w:t>
+      </w:r>
+    </w:p>
+    <w:p>
+      <w:pPr>
+        <w:spacing w:before="320" w:after="120"/>
+      </w:pPr>
+      <w:r>
+        <w:rPr>
+          <w:rFonts w:ascii="Times New Roman" w:hAnsi="Times New Roman" w:cs="Times New Roman"/>
+          <w:b/>
+          <w:i w:val="0"/>
+          <w:sz w:val="30"/>
+        </w:rPr>
+        <w:t>1.1 Resources and remote access</w:t>
+      </w:r>
+    </w:p>
+    <w:p>
+      <w:pPr>
+        <w:spacing w:after="160" w:line="276" w:lineRule="auto"/>
+        <w:jc w:val="both"/>
+      </w:pPr>
+      <w:r>
+        <w:rPr>
+          <w:rFonts w:ascii="Times New Roman" w:hAnsi="Times New Roman" w:cs="Times New Roman"/>
+          <w:b w:val="0"/>
+          <w:i w:val="0"/>
+          <w:sz w:val="22"/>
+        </w:rPr>
+        <w:t>Every artefact this report references is in a single public GitHub repository. The 3 Colab notebooks below run end to end with no setup on the marker's machine: open the badge, click *Runtime &gt; Run all*, and the notebook pulls the data from the repo and runs the pipeline. Notebook 3 connects to my live MongoDB Atlas cluster using credentials that are already embedded in the notebook, so the marker does not need an Atlas account; if the cluster is paused or unreachable the notebook automatically falls back to mongomock so every cell still runs.</w:t>
+      </w:r>
+    </w:p>
+    <w:p>
+      <w:pPr>
+        <w:spacing w:before="80" w:after="40"/>
+      </w:pPr>
+      <w:r>
+        <w:rPr>
+          <w:rFonts w:ascii="Times New Roman" w:hAnsi="Times New Roman" w:cs="Times New Roman"/>
+          <w:b/>
+          <w:i w:val="0"/>
+          <w:sz w:val="22"/>
+        </w:rPr>
+        <w:t xml:space="preserve">GitHub repository: </w:t>
+      </w:r>
+      <w:hyperlink r:id="rId9">
+        <w:r>
+          <w:rPr>
+            <w:rFonts w:ascii="Times New Roman" w:hAnsi="Times New Roman"/>
+            <w:color w:val="0563C1"/>
+            <w:u w:val="single"/>
+            <w:sz w:val="22"/>
+          </w:rPr>
+          <w:t xml:space="preserve">github.com/D1lxrry/Nortstar-Task</w:t>
+        </w:r>
+      </w:hyperlink>
+    </w:p>
+    <w:p>
+      <w:pPr>
+        <w:spacing w:before="40" w:after="40"/>
+        <w:ind w:left="283"/>
+      </w:pPr>
+      <w:r>
+        <w:rPr>
+          <w:rFonts w:ascii="Times New Roman" w:hAnsi="Times New Roman" w:cs="Times New Roman"/>
+          <w:b/>
+          <w:i w:val="0"/>
+          <w:sz w:val="22"/>
+        </w:rPr>
+        <w:t xml:space="preserve">Notebook 1 (Python Data Processing): </w:t>
+      </w:r>
+      <w:hyperlink r:id="rId10">
+        <w:r>
+          <w:rPr>
+            <w:rFonts w:ascii="Times New Roman" w:hAnsi="Times New Roman"/>
+            <w:color w:val="0563C1"/>
+            <w:u w:val="single"/>
+            <w:sz w:val="22"/>
+          </w:rPr>
+          <w:t xml:space="preserve">https://colab.research.google.com/github/D1lxrry/Nortstar-Task/blob/main/colab_notebooks/01_python_data_processing.ipynb</w:t>
+        </w:r>
+      </w:hyperlink>
+    </w:p>
+    <w:p>
+      <w:pPr>
+        <w:spacing w:before="40" w:after="40"/>
+        <w:ind w:left="283"/>
+      </w:pPr>
+      <w:r>
+        <w:rPr>
+          <w:rFonts w:ascii="Times New Roman" w:hAnsi="Times New Roman" w:cs="Times New Roman"/>
+          <w:b/>
+          <w:i w:val="0"/>
+          <w:sz w:val="22"/>
+        </w:rPr>
+        <w:t xml:space="preserve">Notebook 2 (SQL in R + R Analytics): </w:t>
+      </w:r>
+      <w:hyperlink r:id="rId11">
+        <w:r>
+          <w:rPr>
+            <w:rFonts w:ascii="Times New Roman" w:hAnsi="Times New Roman"/>
+            <w:color w:val="0563C1"/>
+            <w:u w:val="single"/>
+            <w:sz w:val="22"/>
+          </w:rPr>
+          <w:t xml:space="preserve">https://colab.research.google.com/github/D1lxrry/Nortstar-Task/blob/main/colab_notebooks/02_r_sql_and_analytics.ipynb</w:t>
+        </w:r>
+      </w:hyperlink>
+    </w:p>
+    <w:p>
+      <w:pPr>
+        <w:spacing w:before="40" w:after="40"/>
+        <w:ind w:left="283"/>
+      </w:pPr>
+      <w:r>
+        <w:rPr>
+          <w:rFonts w:ascii="Times New Roman" w:hAnsi="Times New Roman" w:cs="Times New Roman"/>
+          <w:b/>
+          <w:i w:val="0"/>
+          <w:sz w:val="22"/>
+        </w:rPr>
+        <w:t xml:space="preserve">Notebook 3 (MongoDB + Query Optimisation): </w:t>
+      </w:r>
+      <w:hyperlink r:id="rId12">
+        <w:r>
+          <w:rPr>
+            <w:rFonts w:ascii="Times New Roman" w:hAnsi="Times New Roman"/>
+            <w:color w:val="0563C1"/>
+            <w:u w:val="single"/>
+            <w:sz w:val="22"/>
+          </w:rPr>
+          <w:t xml:space="preserve">https://colab.research.google.com/github/D1lxrry/Nortstar-Task/blob/main/colab_notebooks/03_mongodb_and_query_optimisation.ipynb</w:t>
+        </w:r>
+      </w:hyperlink>
+    </w:p>
+    <w:p>
+      <w:pPr>
+        <w:spacing w:after="160" w:line="276" w:lineRule="auto"/>
+        <w:jc w:val="both"/>
+      </w:pPr>
+      <w:r>
+        <w:rPr>
+          <w:rFonts w:ascii="Times New Roman" w:hAnsi="Times New Roman" w:cs="Times New Roman"/>
+          <w:b w:val="0"/>
+          <w:i w:val="0"/>
+          <w:sz w:val="22"/>
+        </w:rPr>
+        <w:t>The Atlas cluster is named NorthStar, hosted on AWS in eu-west-1 (Ireland) on the free M0 tier. The cluster has Network Access set to 0.0.0.0/0 so any Colab session can connect. A read-only database user is embedded in notebook 3 of the public repo, which is what gives the marker live access without needing my Atlas login. If the marker would prefer to inspect the data with their own MongoDB Compass or shell, the connection string is on the first cell of notebook 3 and can be copied out from there.</w:t>
       </w:r>
     </w:p>
     <w:p>
@@ -654,7 +801,7 @@
                     <pic:cNvPicPr/>
                   </pic:nvPicPr>
                   <pic:blipFill>
-                    <a:blip r:embed="rId9"/>
+                    <a:blip r:embed="rId13"/>
                     <a:stretch>
                       <a:fillRect/>
                     </a:stretch>
@@ -1124,7 +1271,7 @@
                     <pic:cNvPicPr/>
                   </pic:nvPicPr>
                   <pic:blipFill>
-                    <a:blip r:embed="rId10"/>
+                    <a:blip r:embed="rId14"/>
                     <a:stretch>
                       <a:fillRect/>
                     </a:stretch>
@@ -1179,7 +1326,7 @@
                     <pic:cNvPicPr/>
                   </pic:nvPicPr>
                   <pic:blipFill>
-                    <a:blip r:embed="rId11"/>
+                    <a:blip r:embed="rId15"/>
                     <a:stretch>
                       <a:fillRect/>
                     </a:stretch>
@@ -2163,7 +2310,7 @@
                     <pic:cNvPicPr/>
                   </pic:nvPicPr>
                   <pic:blipFill>
-                    <a:blip r:embed="rId12"/>
+                    <a:blip r:embed="rId16"/>
                     <a:stretch>
                       <a:fillRect/>
                     </a:stretch>
@@ -2218,7 +2365,7 @@
                     <pic:cNvPicPr/>
                   </pic:nvPicPr>
                   <pic:blipFill>
-                    <a:blip r:embed="rId13"/>
+                    <a:blip r:embed="rId17"/>
                     <a:stretch>
                       <a:fillRect/>
                     </a:stretch>
@@ -2273,7 +2420,7 @@
                     <pic:cNvPicPr/>
                   </pic:nvPicPr>
                   <pic:blipFill>
-                    <a:blip r:embed="rId14"/>
+                    <a:blip r:embed="rId18"/>
                     <a:stretch>
                       <a:fillRect/>
                     </a:stretch>
@@ -2328,7 +2475,7 @@
                     <pic:cNvPicPr/>
                   </pic:nvPicPr>
                   <pic:blipFill>
-                    <a:blip r:embed="rId15"/>
+                    <a:blip r:embed="rId19"/>
                     <a:stretch>
                       <a:fillRect/>
                     </a:stretch>
@@ -2383,7 +2530,7 @@
                     <pic:cNvPicPr/>
                   </pic:nvPicPr>
                   <pic:blipFill>
-                    <a:blip r:embed="rId16"/>
+                    <a:blip r:embed="rId20"/>
                     <a:stretch>
                       <a:fillRect/>
                     </a:stretch>
@@ -2438,7 +2585,7 @@
                     <pic:cNvPicPr/>
                   </pic:nvPicPr>
                   <pic:blipFill>
-                    <a:blip r:embed="rId17"/>
+                    <a:blip r:embed="rId21"/>
                     <a:stretch>
                       <a:fillRect/>
                     </a:stretch>
@@ -2493,7 +2640,7 @@
                     <pic:cNvPicPr/>
                   </pic:nvPicPr>
                   <pic:blipFill>
-                    <a:blip r:embed="rId18"/>
+                    <a:blip r:embed="rId22"/>
                     <a:stretch>
                       <a:fillRect/>
                     </a:stretch>
@@ -3090,7 +3237,7 @@
                     <pic:cNvPicPr/>
                   </pic:nvPicPr>
                   <pic:blipFill>
-                    <a:blip r:embed="rId19"/>
+                    <a:blip r:embed="rId23"/>
                     <a:stretch>
                       <a:fillRect/>
                     </a:stretch>
@@ -3145,7 +3292,7 @@
                     <pic:cNvPicPr/>
                   </pic:nvPicPr>
                   <pic:blipFill>
-                    <a:blip r:embed="rId20"/>
+                    <a:blip r:embed="rId24"/>
                     <a:stretch>
                       <a:fillRect/>
                     </a:stretch>
@@ -3200,7 +3347,7 @@
                     <pic:cNvPicPr/>
                   </pic:nvPicPr>
                   <pic:blipFill>
-                    <a:blip r:embed="rId21"/>
+                    <a:blip r:embed="rId25"/>
                     <a:stretch>
                       <a:fillRect/>
                     </a:stretch>
@@ -3255,7 +3402,7 @@
                     <pic:cNvPicPr/>
                   </pic:nvPicPr>
                   <pic:blipFill>
-                    <a:blip r:embed="rId22"/>
+                    <a:blip r:embed="rId26"/>
                     <a:stretch>
                       <a:fillRect/>
                     </a:stretch>
@@ -3310,7 +3457,7 @@
                     <pic:cNvPicPr/>
                   </pic:nvPicPr>
                   <pic:blipFill>
-                    <a:blip r:embed="rId23"/>
+                    <a:blip r:embed="rId27"/>
                     <a:stretch>
                       <a:fillRect/>
                     </a:stretch>
@@ -3365,7 +3512,7 @@
                     <pic:cNvPicPr/>
                   </pic:nvPicPr>
                   <pic:blipFill>
-                    <a:blip r:embed="rId24"/>
+                    <a:blip r:embed="rId28"/>
                     <a:stretch>
                       <a:fillRect/>
                     </a:stretch>

</xml_diff>

<commit_message>
cut consolidated report to 1914 words under the 2500 hard cap
- removed the 6 repetitions of the headline finding to 2 (intro + conclusion)
- pulled out the First/Second/Third scaffolding and meta-paragraph openings
- dropped the schema-design argument from 2.2 + 2.4 to just 2.2
- restricted the cross-paradigm validation claim to one mention in 5.3
- rewrote 7. Critical Reflection as 3 bolded inline paragraphs (Limitations / Methodology / Next steps)
- conclusion now closes on the operational recommendation, not a recap
- 18 Listings + 9 Figures retained
</commit_message>
<xml_diff>
--- a/NorthStar Consolidated Report.docx
+++ b/NorthStar Consolidated Report.docx
@@ -4,7 +4,7 @@
   <w:body>
     <w:p>
       <w:pPr>
-        <w:spacing w:after="400"/>
+        <w:spacing w:after="320"/>
         <w:jc w:val="center"/>
       </w:pPr>
       <w:r>
@@ -19,7 +19,7 @@
     </w:p>
     <w:p>
       <w:pPr>
-        <w:spacing w:before="320" w:after="120"/>
+        <w:spacing w:before="280" w:after="80"/>
       </w:pPr>
       <w:r>
         <w:rPr>
@@ -33,7 +33,7 @@
     </w:p>
     <w:p>
       <w:pPr>
-        <w:spacing w:after="160" w:line="276" w:lineRule="auto"/>
+        <w:spacing w:after="120" w:line="276" w:lineRule="auto"/>
         <w:jc w:val="both"/>
       </w:pPr>
       <w:r>
@@ -43,12 +43,26 @@
           <w:i w:val="0"/>
           <w:sz w:val="22"/>
         </w:rPr>
-        <w:t>The NorthStar Urban Mobility coursework asks for the same set of business questions to be answered using 4 different paradigms: MongoDB for document storage, SQL through R for relational analytics, R for inferential statistics and visualisation, and Python for data processing and machine learning. I treated the brief as one project with 5 deliverable bands rather than 5 separate exercises, so each pipeline reuses the same canonical data definitions and validates against the others.</w:t>
+        <w:t>The NorthStar Urban Mobility coursework asks for the same business questions to be answered using 4 paradigms (MongoDB, SQL in R, R analytics, Python). I treated the brief as one project: each pipeline reuses the same canonical data definitions and the numbers are cross-checked against the others. The headline finding is that delivery failures cluster by pickup zone, not by anything intrinsic to the order, and that operational improvement should target the failing zones rather than try to flag risky orders individually.</w:t>
       </w:r>
     </w:p>
     <w:p>
       <w:pPr>
-        <w:spacing w:after="160" w:line="276" w:lineRule="auto"/>
+        <w:spacing w:before="200" w:after="60"/>
+      </w:pPr>
+      <w:r>
+        <w:rPr>
+          <w:rFonts w:ascii="Times New Roman" w:hAnsi="Times New Roman" w:cs="Times New Roman"/>
+          <w:b/>
+          <w:i w:val="0"/>
+          <w:sz w:val="24"/>
+        </w:rPr>
+        <w:t>1.1 Resources and remote access</w:t>
+      </w:r>
+    </w:p>
+    <w:p>
+      <w:pPr>
+        <w:spacing w:after="120" w:line="276" w:lineRule="auto"/>
         <w:jc w:val="both"/>
       </w:pPr>
       <w:r>
@@ -58,41 +72,13 @@
           <w:i w:val="0"/>
           <w:sz w:val="22"/>
         </w:rPr>
-        <w:t xml:space="preserve">My headline finding is that delivery failures at NorthStar cluster by pickup zone rather than by anything intrinsic to the order. The chi square test on pickup zone comes out at </w:t>
-      </w:r>
-      <w:r>
-        <w:rPr>
-          <w:rFonts w:ascii="Times New Roman" w:hAnsi="Times New Roman" w:cs="Times New Roman"/>
-          <w:b w:val="0"/>
-          <w:i w:val="0"/>
-          <w:sz w:val="22"/>
-        </w:rPr>
-        <w:t>X</w:t>
-      </w:r>
-      <w:r>
-        <w:rPr>
-          <w:rFonts w:ascii="Times New Roman" w:hAnsi="Times New Roman" w:cs="Times New Roman"/>
-          <w:b w:val="0"/>
-          <w:i w:val="0"/>
-          <w:sz w:val="22"/>
-          <w:vertAlign w:val="superscript"/>
-        </w:rPr>
-        <w:t>2</w:t>
-      </w:r>
-      <w:r>
-        <w:rPr>
-          <w:rFonts w:ascii="Times New Roman" w:hAnsi="Times New Roman" w:cs="Times New Roman"/>
-          <w:b w:val="0"/>
-          <w:i w:val="0"/>
-          <w:sz w:val="22"/>
-        </w:rPr>
-        <w:t xml:space="preserve"> = 26.12, df = 12, p = 0.0103, identical in scipy and in R to 4 decimal places. A random forest with 9 candidate predictors hits 5-fold ROC AUC of 0.487 plus or minus 0.064, indistinguishable from random guessing, which agrees with my R logistic regression where only the critical-priority indicator reaches significance (OR 0.275, 95% CI 0.082 to 0.929). 3 independent lines of evidence land on the same conclusion: operational improvement should target the failing zones, not try to predict per-order risk.</w:t>
+        <w:t>All artefacts live in one public GitHub repository. The 3 Colab notebooks run end to end with no setup. Notebook 3 carries embedded read credentials for the Atlas cluster, so the marker runs the live MongoDB cells on their own machine without an Atlas account; if the cluster is paused the notebook falls back to mongomock so every cell still completes.</w:t>
       </w:r>
     </w:p>
     <w:p>
       <w:pPr>
-        <w:spacing w:after="160" w:line="276" w:lineRule="auto"/>
-        <w:jc w:val="both"/>
+        <w:spacing w:after="40"/>
+        <w:ind w:left="283"/>
       </w:pPr>
       <w:r>
         <w:rPr>
@@ -101,50 +87,6 @@
           <w:i w:val="0"/>
           <w:sz w:val="22"/>
         </w:rPr>
-        <w:t>This report is a single deliverable covering all 5 bands of the marking scheme. I have omitted per-section abstracts and consolidated the critical reflection into a single closing section. Each implementation subsection points at a numbered code listing that names the source file and line range; the screenshot below the listing shows the code as it appears in my VS Code editor. Result figures (charts and tables) are numbered separately and referenced by number in the prose. Tables have been stripped of colour and use uppercase headers with text contained inside each cell.</w:t>
-      </w:r>
-    </w:p>
-    <w:p>
-      <w:pPr>
-        <w:spacing w:before="320" w:after="120"/>
-      </w:pPr>
-      <w:r>
-        <w:rPr>
-          <w:rFonts w:ascii="Times New Roman" w:hAnsi="Times New Roman" w:cs="Times New Roman"/>
-          <w:b/>
-          <w:i w:val="0"/>
-          <w:sz w:val="30"/>
-        </w:rPr>
-        <w:t>1.1 Resources and remote access</w:t>
-      </w:r>
-    </w:p>
-    <w:p>
-      <w:pPr>
-        <w:spacing w:after="160" w:line="276" w:lineRule="auto"/>
-        <w:jc w:val="both"/>
-      </w:pPr>
-      <w:r>
-        <w:rPr>
-          <w:rFonts w:ascii="Times New Roman" w:hAnsi="Times New Roman" w:cs="Times New Roman"/>
-          <w:b w:val="0"/>
-          <w:i w:val="0"/>
-          <w:sz w:val="22"/>
-        </w:rPr>
-        <w:t>Every artefact this report references is in a single public GitHub repository. The 3 Colab notebooks below run end to end with no setup on the marker's machine: open the badge, click *Runtime &gt; Run all*, and the notebook pulls the data from the repo and runs the pipeline. Notebook 3 connects to my live MongoDB Atlas cluster using credentials that are already embedded in the notebook, so the marker does not need an Atlas account; if the cluster is paused or unreachable the notebook automatically falls back to mongomock so every cell still runs.</w:t>
-      </w:r>
-    </w:p>
-    <w:p>
-      <w:pPr>
-        <w:spacing w:before="80" w:after="40"/>
-      </w:pPr>
-      <w:r>
-        <w:rPr>
-          <w:rFonts w:ascii="Times New Roman" w:hAnsi="Times New Roman" w:cs="Times New Roman"/>
-          <w:b/>
-          <w:i w:val="0"/>
-          <w:sz w:val="22"/>
-        </w:rPr>
-        <w:t xml:space="preserve">GitHub repository: </w:t>
       </w:r>
       <w:hyperlink r:id="rId9">
         <w:r>
@@ -154,24 +96,15 @@
             <w:u w:val="single"/>
             <w:sz w:val="22"/>
           </w:rPr>
-          <w:t xml:space="preserve">github.com/D1lxrry/Nortstar-Task</w:t>
+          <w:t xml:space="preserve">GitHub repo: github.com/D1lxrry/Nortstar-Task</w:t>
         </w:r>
       </w:hyperlink>
     </w:p>
     <w:p>
       <w:pPr>
-        <w:spacing w:before="40" w:after="40"/>
+        <w:spacing w:after="40"/>
         <w:ind w:left="283"/>
       </w:pPr>
-      <w:r>
-        <w:rPr>
-          <w:rFonts w:ascii="Times New Roman" w:hAnsi="Times New Roman" w:cs="Times New Roman"/>
-          <w:b/>
-          <w:i w:val="0"/>
-          <w:sz w:val="22"/>
-        </w:rPr>
-        <w:t xml:space="preserve">Notebook 1 (Python Data Processing): </w:t>
-      </w:r>
       <w:hyperlink r:id="rId10">
         <w:r>
           <w:rPr>
@@ -180,24 +113,15 @@
             <w:u w:val="single"/>
             <w:sz w:val="22"/>
           </w:rPr>
-          <w:t xml:space="preserve">https://colab.research.google.com/github/D1lxrry/Nortstar-Task/blob/main/colab_notebooks/01_python_data_processing.ipynb</w:t>
+          <w:t xml:space="preserve">Notebook 1 (Python Data Processing)</w:t>
         </w:r>
       </w:hyperlink>
     </w:p>
     <w:p>
       <w:pPr>
-        <w:spacing w:before="40" w:after="40"/>
+        <w:spacing w:after="40"/>
         <w:ind w:left="283"/>
       </w:pPr>
-      <w:r>
-        <w:rPr>
-          <w:rFonts w:ascii="Times New Roman" w:hAnsi="Times New Roman" w:cs="Times New Roman"/>
-          <w:b/>
-          <w:i w:val="0"/>
-          <w:sz w:val="22"/>
-        </w:rPr>
-        <w:t xml:space="preserve">Notebook 2 (SQL in R + R Analytics): </w:t>
-      </w:r>
       <w:hyperlink r:id="rId11">
         <w:r>
           <w:rPr>
@@ -206,24 +130,15 @@
             <w:u w:val="single"/>
             <w:sz w:val="22"/>
           </w:rPr>
-          <w:t xml:space="preserve">https://colab.research.google.com/github/D1lxrry/Nortstar-Task/blob/main/colab_notebooks/02_r_sql_and_analytics.ipynb</w:t>
+          <w:t xml:space="preserve">Notebook 2 (SQL in R + R Analytics)</w:t>
         </w:r>
       </w:hyperlink>
     </w:p>
     <w:p>
       <w:pPr>
-        <w:spacing w:before="40" w:after="40"/>
+        <w:spacing w:after="160"/>
         <w:ind w:left="283"/>
       </w:pPr>
-      <w:r>
-        <w:rPr>
-          <w:rFonts w:ascii="Times New Roman" w:hAnsi="Times New Roman" w:cs="Times New Roman"/>
-          <w:b/>
-          <w:i w:val="0"/>
-          <w:sz w:val="22"/>
-        </w:rPr>
-        <w:t xml:space="preserve">Notebook 3 (MongoDB + Query Optimisation): </w:t>
-      </w:r>
       <w:hyperlink r:id="rId12">
         <w:r>
           <w:rPr>
@@ -232,28 +147,13 @@
             <w:u w:val="single"/>
             <w:sz w:val="22"/>
           </w:rPr>
-          <w:t xml:space="preserve">https://colab.research.google.com/github/D1lxrry/Nortstar-Task/blob/main/colab_notebooks/03_mongodb_and_query_optimisation.ipynb</w:t>
+          <w:t xml:space="preserve">Notebook 3 (MongoDB + Query Optimisation, live Atlas)</w:t>
         </w:r>
       </w:hyperlink>
     </w:p>
     <w:p>
       <w:pPr>
-        <w:spacing w:after="160" w:line="276" w:lineRule="auto"/>
-        <w:jc w:val="both"/>
-      </w:pPr>
-      <w:r>
-        <w:rPr>
-          <w:rFonts w:ascii="Times New Roman" w:hAnsi="Times New Roman" w:cs="Times New Roman"/>
-          <w:b w:val="0"/>
-          <w:i w:val="0"/>
-          <w:sz w:val="22"/>
-        </w:rPr>
-        <w:t>The Atlas cluster is named NorthStar, hosted on AWS in eu-west-1 (Ireland) on the free M0 tier. The cluster has Network Access set to 0.0.0.0/0 so any Colab session can connect. A read-only database user is embedded in notebook 3 of the public repo, which is what gives the marker live access without needing my Atlas login. If the marker would prefer to inspect the data with their own MongoDB Compass or shell, the connection string is on the first cell of notebook 3 and can be copied out from there.</w:t>
-      </w:r>
-    </w:p>
-    <w:p>
-      <w:pPr>
-        <w:spacing w:before="320" w:after="120"/>
+        <w:spacing w:before="280" w:after="80"/>
       </w:pPr>
       <w:r>
         <w:rPr>
@@ -267,36 +167,21 @@
     </w:p>
     <w:p>
       <w:pPr>
-        <w:spacing w:after="160" w:line="276" w:lineRule="auto"/>
-        <w:jc w:val="both"/>
-      </w:pPr>
-      <w:r>
-        <w:rPr>
-          <w:rFonts w:ascii="Times New Roman" w:hAnsi="Times New Roman" w:cs="Times New Roman"/>
-          <w:b w:val="0"/>
-          <w:i w:val="0"/>
-          <w:sz w:val="22"/>
-        </w:rPr>
-        <w:t>My first observation when I started designing the schema was that almost every business question reduces to one of two shapes. Either it asks what happened to a specific order, or it asks how orders aggregate by some attribute. That pushed me toward an order-centric document rather than mirroring the relational layout 1 to 1 inside MongoDB. The work splits into 4 phases: provisioning a free-tier Atlas cluster, loading the 9 raw CSVs into 9 collections via PyMongo, designing the embedded orders_aggregate collection with the cleanup that goes with it, and writing the 12 analytical aggregations the band rewards.</w:t>
-      </w:r>
-    </w:p>
-    <w:p>
-      <w:pPr>
-        <w:spacing w:before="240" w:after="80"/>
+        <w:spacing w:before="200" w:after="60"/>
       </w:pPr>
       <w:r>
         <w:rPr>
           <w:rFonts w:ascii="Times New Roman" w:hAnsi="Times New Roman" w:cs="Times New Roman"/>
           <w:b/>
           <w:i w:val="0"/>
-          <w:sz w:val="26"/>
+          <w:sz w:val="24"/>
         </w:rPr>
         <w:t>2.1 Bulk load with type coercion</w:t>
       </w:r>
     </w:p>
     <w:p>
       <w:pPr>
-        <w:spacing w:before="160" w:after="40"/>
+        <w:spacing w:before="120" w:after="40"/>
         <w:ind w:left="567" w:right="567"/>
         <w:jc w:val="left"/>
         <w:shd w:val="clear" w:color="auto" w:fill="F5F5F5"/>
@@ -366,7 +251,7 @@
     </w:p>
     <w:p>
       <w:pPr>
-        <w:spacing w:after="200"/>
+        <w:spacing w:after="160"/>
         <w:jc w:val="center"/>
       </w:pPr>
       <w:r>
@@ -381,7 +266,7 @@
     </w:p>
     <w:p>
       <w:pPr>
-        <w:spacing w:after="160" w:line="276" w:lineRule="auto"/>
+        <w:spacing w:after="120" w:line="276" w:lineRule="auto"/>
         <w:jc w:val="both"/>
       </w:pPr>
       <w:r>
@@ -391,26 +276,26 @@
           <w:i w:val="0"/>
           <w:sz w:val="22"/>
         </w:rPr>
-        <w:t>My loader reads each CSV with the standard csv.DictReader, runs every field through a shared coerce helper, and bulk-inserts the resulting documents. The coercion step matters more than it sounds. The first time I ran the queries without it, I got "NaN" back from $avg because Mongo treats every value as a string when the field comes in unstructured. Coercing to native int, float, datetime or bool fixed every downstream aggregation in one move.</w:t>
+        <w:t>Each CSV is read with `csv.DictReader` and run through a shared `coerce` helper that turns strings into native int, float, datetime or bool. Without it `$avg` returns NaN because Mongo treats unquoted CSV fields as strings; the coercion step fixes every downstream aggregation in one place.</w:t>
       </w:r>
     </w:p>
     <w:p>
       <w:pPr>
-        <w:spacing w:before="240" w:after="80"/>
+        <w:spacing w:before="200" w:after="60"/>
       </w:pPr>
       <w:r>
         <w:rPr>
           <w:rFonts w:ascii="Times New Roman" w:hAnsi="Times New Roman" w:cs="Times New Roman"/>
           <w:b/>
           <w:i w:val="0"/>
-          <w:sz w:val="26"/>
+          <w:sz w:val="24"/>
         </w:rPr>
         <w:t>2.2 The embedded order document</w:t>
       </w:r>
     </w:p>
     <w:p>
       <w:pPr>
-        <w:spacing w:before="160" w:after="40"/>
+        <w:spacing w:before="120" w:after="40"/>
         <w:ind w:left="567" w:right="567"/>
         <w:jc w:val="left"/>
         <w:shd w:val="clear" w:color="auto" w:fill="F5F5F5"/>
@@ -480,7 +365,7 @@
     </w:p>
     <w:p>
       <w:pPr>
-        <w:spacing w:after="200"/>
+        <w:spacing w:after="160"/>
         <w:jc w:val="center"/>
       </w:pPr>
       <w:r>
@@ -495,7 +380,7 @@
     </w:p>
     <w:p>
       <w:pPr>
-        <w:spacing w:after="160" w:line="276" w:lineRule="auto"/>
+        <w:spacing w:after="120" w:line="276" w:lineRule="auto"/>
         <w:jc w:val="both"/>
       </w:pPr>
       <w:r>
@@ -505,41 +390,26 @@
           <w:i w:val="0"/>
           <w:sz w:val="22"/>
         </w:rPr>
-        <w:t>I decided what to embed by going through each of my 12 analytical queries and noting which fields they read. Every single one of them touches at least one customer attribute (home zone, loyalty score, app engagement). Embedding the customer as a snapshot removes a $lookup from the dominant access path and matches the analytical semantic: I want what the customer looked like at order time, not what they look like right now after a profile edit. Delivery is 1 to 1 with order so it nests directly; incidents nest inside delivery because they only ever surface in their parent context.</w:t>
+        <w:t>The order is the aggregate root because every analytical query touches at least one customer field and most touch a delivery field. Embedding customer (as a snapshot), delivery and incidents (nested inside delivery) removes a $lookup from the dominant read path. Drivers, vehicles and hubs stay referenced because they have their own query workload and embedding would duplicate them 1,250 times per order. This mixed strategy is the schema's defining choice.</w:t>
       </w:r>
     </w:p>
     <w:p>
       <w:pPr>
-        <w:spacing w:after="160" w:line="276" w:lineRule="auto"/>
-        <w:jc w:val="both"/>
-      </w:pPr>
-      <w:r>
-        <w:rPr>
-          <w:rFonts w:ascii="Times New Roman" w:hAnsi="Times New Roman" w:cs="Times New Roman"/>
-          <w:b w:val="0"/>
-          <w:i w:val="0"/>
-          <w:sz w:val="22"/>
-        </w:rPr>
-        <w:t>Drivers, vehicles and hubs stay as separate collections. Each of those entities is queried in its own right (driver performance, vehicle maintenance, hub capacity), and embedding them in every order would duplicate their attributes 1250 times. Every training score update would also invalidate the snapshots. Reference is the correct call here. This mixed embedded-and-referenced approach is what I would argue separates a thoughtful schema from a copy-paste from a relational ER diagram.</w:t>
-      </w:r>
-    </w:p>
-    <w:p>
-      <w:pPr>
-        <w:spacing w:before="240" w:after="80"/>
+        <w:spacing w:before="200" w:after="60"/>
       </w:pPr>
       <w:r>
         <w:rPr>
           <w:rFonts w:ascii="Times New Roman" w:hAnsi="Times New Roman" w:cs="Times New Roman"/>
           <w:b/>
           <w:i w:val="0"/>
-          <w:sz w:val="26"/>
+          <w:sz w:val="24"/>
         </w:rPr>
         <w:t>2.3 Zone canonicalisation</w:t>
       </w:r>
     </w:p>
     <w:p>
       <w:pPr>
-        <w:spacing w:before="160" w:after="40"/>
+        <w:spacing w:before="120" w:after="40"/>
         <w:ind w:left="567" w:right="567"/>
         <w:jc w:val="left"/>
         <w:shd w:val="clear" w:color="auto" w:fill="F5F5F5"/>
@@ -609,7 +479,7 @@
     </w:p>
     <w:p>
       <w:pPr>
-        <w:spacing w:after="200"/>
+        <w:spacing w:after="160"/>
         <w:jc w:val="center"/>
       </w:pPr>
       <w:r>
@@ -624,7 +494,7 @@
     </w:p>
     <w:p>
       <w:pPr>
-        <w:spacing w:after="160" w:line="276" w:lineRule="auto"/>
+        <w:spacing w:after="120" w:line="276" w:lineRule="auto"/>
         <w:jc w:val="both"/>
       </w:pPr>
       <w:r>
@@ -634,26 +504,26 @@
           <w:i w:val="0"/>
           <w:sz w:val="22"/>
         </w:rPr>
-        <w:t>This cleanup was not in my original plan. It surfaced when I ran Q4 on the starter pipeline and noticed Central, central, CENTRAL and Ctr all coming back as separate groups. I counted the spellings: 16 raw values that should have been 7 canonical zones. The same data quality issue bit me on Q5 a few minutes later, when the $lookup-driven failed-delivery query returned 0 rows because delivery_status was also spelt 3 different ways (Failed, FAILED, failed). A case-insensitive regex match unblocked Q5; the proper fix for the whole dataset was the canonicalisation pass above. The map collapses the 16 raw zone spellings with updateMany applied to every zone-bearing field across every collection. I ran the cleanup after the load (not at insert time) so that the raw collections remain as an audit trail of the original data, and ran it before rebuilding orders_aggregate so the embedded snapshot is already canonical when it lands.</w:t>
+        <w:t>Starter query Q4 returned Central, central, CENTRAL and Ctr as separate groups, and Q5 a minute later returned 0 failed-delivery rows because `delivery_status` also had Failed, FAILED and failed. 16 raw zone spellings collapse to 7 canonical values via `updateMany` applied to every zone-bearing field. The cleanup runs after load so the raw collections remain as an audit trail, and before `orders_aggregate` is rebuilt so embedded snapshots are already canonical.</w:t>
       </w:r>
     </w:p>
     <w:p>
       <w:pPr>
-        <w:spacing w:before="240" w:after="80"/>
+        <w:spacing w:before="200" w:after="60"/>
       </w:pPr>
       <w:r>
         <w:rPr>
           <w:rFonts w:ascii="Times New Roman" w:hAnsi="Times New Roman" w:cs="Times New Roman"/>
           <w:b/>
           <w:i w:val="0"/>
-          <w:sz w:val="26"/>
+          <w:sz w:val="24"/>
         </w:rPr>
         <w:t>2.4 The one aggregation that needs $lookup</w:t>
       </w:r>
     </w:p>
     <w:p>
       <w:pPr>
-        <w:spacing w:before="160" w:after="40"/>
+        <w:spacing w:before="120" w:after="40"/>
         <w:ind w:left="567" w:right="567"/>
         <w:jc w:val="left"/>
         <w:shd w:val="clear" w:color="auto" w:fill="F5F5F5"/>
@@ -723,7 +593,7 @@
     </w:p>
     <w:p>
       <w:pPr>
-        <w:spacing w:after="200"/>
+        <w:spacing w:after="160"/>
         <w:jc w:val="center"/>
       </w:pPr>
       <w:r>
@@ -738,7 +608,7 @@
     </w:p>
     <w:p>
       <w:pPr>
-        <w:spacing w:after="160" w:line="276" w:lineRule="auto"/>
+        <w:spacing w:after="120" w:line="276" w:lineRule="auto"/>
         <w:jc w:val="both"/>
       </w:pPr>
       <w:r>
@@ -748,111 +618,12 @@
           <w:i w:val="0"/>
           <w:sz w:val="22"/>
         </w:rPr>
-        <w:t>This is the only place in my project where $lookup is actually necessary. Drivers are not embedded, so any aggregation that touches per-driver metrics has to join. The pipeline joins orders_aggregate to drivers via the nested delivery.driver_id, unwinds the single-match driver array, groups to compute per-driver counts and rates, and returns the top 10 by volume. Every other analytical query can read its answer directly out of the embedded document, which is the design decision paying off.</w:t>
+        <w:t>Drivers are referenced rather than embedded, so per-driver metrics need a join. The pipeline joins `orders_aggregate` to `drivers` via the nested `delivery.driver_id`, unwinds the single-match array, then groups for count, average rating and failure rate. Every other analytical query reads its answer out of the embedded document.</w:t>
       </w:r>
     </w:p>
     <w:p>
       <w:pPr>
-        <w:spacing w:before="240" w:after="80"/>
-      </w:pPr>
-      <w:r>
-        <w:rPr>
-          <w:rFonts w:ascii="Times New Roman" w:hAnsi="Times New Roman" w:cs="Times New Roman"/>
-          <w:b/>
-          <w:i w:val="0"/>
-          <w:sz w:val="26"/>
-        </w:rPr>
-        <w:t>2.5 Results</w:t>
-      </w:r>
-    </w:p>
-    <w:p>
-      <w:pPr>
-        <w:spacing w:after="160" w:line="276" w:lineRule="auto"/>
-        <w:jc w:val="both"/>
-      </w:pPr>
-      <w:r>
-        <w:rPr>
-          <w:rFonts w:ascii="Times New Roman" w:hAnsi="Times New Roman" w:cs="Times New Roman"/>
-          <w:b w:val="0"/>
-          <w:i w:val="0"/>
-          <w:sz w:val="22"/>
-        </w:rPr>
-        <w:t>After the pipeline runs end to end, the cluster holds 9 raw collections (4400 rows total) and the derived orders_aggregate (1250 documents). Figure 1 shows the ZONE_MAP used by the cleanup, including the count of raw spellings folded into each canonical zone.</w:t>
-      </w:r>
-    </w:p>
-    <w:p>
-      <w:pPr>
-        <w:spacing w:before="120" w:after="40"/>
-        <w:jc w:val="center"/>
-      </w:pPr>
-      <w:r>
-        <w:drawing>
-          <wp:inline xmlns:a="http://schemas.openxmlformats.org/drawingml/2006/main" xmlns:pic="http://schemas.openxmlformats.org/drawingml/2006/picture">
-            <wp:extent cx="5400000" cy="2089857"/>
-            <wp:docPr id="1" name="Picture 1"/>
-            <wp:cNvGraphicFramePr>
-              <a:graphicFrameLocks noChangeAspect="1"/>
-            </wp:cNvGraphicFramePr>
-            <a:graphic>
-              <a:graphicData uri="http://schemas.openxmlformats.org/drawingml/2006/picture">
-                <pic:pic>
-                  <pic:nvPicPr>
-                    <pic:cNvPr id="0" name="M1_zone_map.png"/>
-                    <pic:cNvPicPr/>
-                  </pic:nvPicPr>
-                  <pic:blipFill>
-                    <a:blip r:embed="rId13"/>
-                    <a:stretch>
-                      <a:fillRect/>
-                    </a:stretch>
-                  </pic:blipFill>
-                  <pic:spPr>
-                    <a:xfrm>
-                      <a:off x="0" y="0"/>
-                      <a:ext cx="5400000" cy="2089857"/>
-                    </a:xfrm>
-                    <a:prstGeom prst="rect"/>
-                  </pic:spPr>
-                </pic:pic>
-              </a:graphicData>
-            </a:graphic>
-          </wp:inline>
-        </w:drawing>
-      </w:r>
-    </w:p>
-    <w:p>
-      <w:pPr>
-        <w:spacing w:after="200"/>
-        <w:jc w:val="center"/>
-      </w:pPr>
-      <w:r>
-        <w:rPr>
-          <w:rFonts w:ascii="Times New Roman" w:hAnsi="Times New Roman" w:cs="Times New Roman"/>
-          <w:b/>
-          <w:i w:val="0"/>
-          <w:sz w:val="20"/>
-        </w:rPr>
-        <w:t>Figure 1: Zone Canonicalisation Map (16 Raw Spellings to 7 Canonical Zones)</w:t>
-      </w:r>
-    </w:p>
-    <w:p>
-      <w:pPr>
-        <w:spacing w:after="160" w:line="276" w:lineRule="auto"/>
-        <w:jc w:val="both"/>
-      </w:pPr>
-      <w:r>
-        <w:rPr>
-          <w:rFonts w:ascii="Times New Roman" w:hAnsi="Times New Roman" w:cs="Times New Roman"/>
-          <w:b w:val="0"/>
-          <w:i w:val="0"/>
-          <w:sz w:val="22"/>
-        </w:rPr>
-        <w:t>My 12 aggregations cover every operator I expected the rubric to look for: $group, $sort, $lookup, $unwind, $project, $bucket, $cond, $ifNull, $size, plus distinct() for the data quality survey. Two findings shape the rest of the project. Failure rate varies sharply by pickup_zone (between 7% and 22% across the 7 zones) but barely moves by service_type. The top-rated drivers cluster in Central and North, which are also the worst zones for failures; that points at a zone-side problem, not a driver-side problem. Document size stays well under 100 KB even for the worst case order, so the 16 MB BSON ceiling is never threatened.</w:t>
-      </w:r>
-    </w:p>
-    <w:p>
-      <w:pPr>
-        <w:spacing w:before="320" w:after="120"/>
+        <w:spacing w:before="280" w:after="80"/>
       </w:pPr>
       <w:r>
         <w:rPr>
@@ -866,7 +637,7 @@
     </w:p>
     <w:p>
       <w:pPr>
-        <w:spacing w:after="160" w:line="276" w:lineRule="auto"/>
+        <w:spacing w:after="120" w:line="276" w:lineRule="auto"/>
         <w:jc w:val="both"/>
       </w:pPr>
       <w:r>
@@ -876,41 +647,26 @@
           <w:i w:val="0"/>
           <w:sz w:val="22"/>
         </w:rPr>
-        <w:t>The query optimisation band is worth 10 marks and asks for evidence that I understand how MongoDB's planner picks an index, why some choices win, and how to measure the effect quantitatively rather than asserting it. My substrate is the orders_aggregate collection from Section 2: 1250 documents, mean size around 8 KB, on the free-tier Atlas cluster.</w:t>
+        <w:t>Four query archetypes profiled with and without the proposed index, using `docsExamined` as the metric (executionTimeMillis is meaningless at this scale because the 1,250-document collection fits in RAM).</w:t>
       </w:r>
     </w:p>
     <w:p>
       <w:pPr>
-        <w:spacing w:after="160" w:line="276" w:lineRule="auto"/>
-        <w:jc w:val="both"/>
-      </w:pPr>
-      <w:r>
-        <w:rPr>
-          <w:rFonts w:ascii="Times New Roman" w:hAnsi="Times New Roman" w:cs="Times New Roman"/>
-          <w:b w:val="0"/>
-          <w:i w:val="0"/>
-          <w:sz w:val="22"/>
-        </w:rPr>
-        <w:t>I picked 4 query archetypes that exercise different planner code paths and that map onto queries my analytical pipeline actually uses. The experiment captures executionStats from explain() with and without the proposed index, computes the docsExamined reduction factor, and inspects the winning plan stage. I rely on docsExamined as the headline metric because executionTimeMillis is meaningless at this collection size where the working set fits in cache.</w:t>
-      </w:r>
-    </w:p>
-    <w:p>
-      <w:pPr>
-        <w:spacing w:before="240" w:after="80"/>
+        <w:spacing w:before="200" w:after="60"/>
       </w:pPr>
       <w:r>
         <w:rPr>
           <w:rFonts w:ascii="Times New Roman" w:hAnsi="Times New Roman" w:cs="Times New Roman"/>
           <w:b/>
           <w:i w:val="0"/>
-          <w:sz w:val="26"/>
+          <w:sz w:val="24"/>
         </w:rPr>
-        <w:t>3.1 Baseline: drop secondary indexes</w:t>
+        <w:t>3.1 Baseline + capture helpers</w:t>
       </w:r>
     </w:p>
     <w:p>
       <w:pPr>
-        <w:spacing w:before="160" w:after="40"/>
+        <w:spacing w:before="120" w:after="40"/>
         <w:ind w:left="567" w:right="567"/>
         <w:jc w:val="left"/>
         <w:shd w:val="clear" w:color="auto" w:fill="F5F5F5"/>
@@ -980,7 +736,7 @@
     </w:p>
     <w:p>
       <w:pPr>
-        <w:spacing w:after="200"/>
+        <w:spacing w:after="160"/>
         <w:jc w:val="center"/>
       </w:pPr>
       <w:r>
@@ -995,36 +751,21 @@
     </w:p>
     <w:p>
       <w:pPr>
-        <w:spacing w:after="160" w:line="276" w:lineRule="auto"/>
-        <w:jc w:val="both"/>
-      </w:pPr>
-      <w:r>
-        <w:rPr>
-          <w:rFonts w:ascii="Times New Roman" w:hAnsi="Times New Roman" w:cs="Times New Roman"/>
-          <w:b w:val="0"/>
-          <w:i w:val="0"/>
-          <w:sz w:val="22"/>
-        </w:rPr>
-        <w:t>My baseline strips orders_aggregate down to the mandatory _id_ index, then runs explain('executionStats') to capture the COLLSCAN plan. The capture helper pulls 5 fields out of executionStats that summarise what the planner did and how much work it cost. Resetting between archetypes guarantees a true baseline: the engine never sees an index left over from a previous archetype.</w:t>
-      </w:r>
-    </w:p>
-    <w:p>
-      <w:pPr>
-        <w:spacing w:before="240" w:after="80"/>
+        <w:spacing w:before="200" w:after="60"/>
       </w:pPr>
       <w:r>
         <w:rPr>
           <w:rFonts w:ascii="Times New Roman" w:hAnsi="Times New Roman" w:cs="Times New Roman"/>
           <w:b/>
           <w:i w:val="0"/>
-          <w:sz w:val="26"/>
+          <w:sz w:val="24"/>
         </w:rPr>
-        <w:t>3.2 The 4 query archetypes and their proposed indexes</w:t>
+        <w:t>3.2 4 archetypes and their proposed indexes</w:t>
       </w:r>
     </w:p>
     <w:p>
       <w:pPr>
-        <w:spacing w:before="160" w:after="40"/>
+        <w:spacing w:before="120" w:after="40"/>
         <w:ind w:left="567" w:right="567"/>
         <w:jc w:val="left"/>
         <w:shd w:val="clear" w:color="auto" w:fill="F5F5F5"/>
@@ -1089,12 +830,12 @@
           <w:i w:val="0"/>
           <w:sz w:val="20"/>
         </w:rPr>
-        <w:t>38-65    (QUERIES list: 4 archetypes with proposed index per archetype)</w:t>
+        <w:t>38-65    (QUERIES list, 4 archetypes with proposed index per archetype)</w:t>
       </w:r>
     </w:p>
     <w:p>
       <w:pPr>
-        <w:spacing w:after="200"/>
+        <w:spacing w:after="160"/>
         <w:jc w:val="center"/>
       </w:pPr>
       <w:r>
@@ -1104,41 +845,26 @@
           <w:i w:val="0"/>
           <w:sz w:val="20"/>
         </w:rPr>
-        <w:t>Listing 6: Queries List: 4 Archetypes With Proposed Index Per Archetype</w:t>
+        <w:t>Listing 6: Queries List, 4 Archetypes With Proposed Index Per Archetype</w:t>
       </w:r>
     </w:p>
     <w:p>
       <w:pPr>
-        <w:spacing w:after="160" w:line="276" w:lineRule="auto"/>
-        <w:jc w:val="both"/>
-      </w:pPr>
-      <w:r>
-        <w:rPr>
-          <w:rFonts w:ascii="Times New Roman" w:hAnsi="Times New Roman" w:cs="Times New Roman"/>
-          <w:b w:val="0"/>
-          <w:i w:val="0"/>
-          <w:sz w:val="22"/>
-        </w:rPr>
-        <w:t>For each archetype I declare the index I would actually ship to production. The compound index on (service_type, delivery.delivery_status) follows MongoDB's prefix rule with the more selective field first. The nested-field index on customer.loyalty_score is the one I think is most interesting, because it proves MongoDB will indexscan an embedded path if I declare the dotted notation correctly. That was the bet behind embedding the customer snapshot in the first place.</w:t>
-      </w:r>
-    </w:p>
-    <w:p>
-      <w:pPr>
-        <w:spacing w:before="240" w:after="80"/>
+        <w:spacing w:before="200" w:after="60"/>
       </w:pPr>
       <w:r>
         <w:rPr>
           <w:rFonts w:ascii="Times New Roman" w:hAnsi="Times New Roman" w:cs="Times New Roman"/>
           <w:b/>
           <w:i w:val="0"/>
-          <w:sz w:val="26"/>
+          <w:sz w:val="24"/>
         </w:rPr>
         <w:t>3.3 The experiment loop</w:t>
       </w:r>
     </w:p>
     <w:p>
       <w:pPr>
-        <w:spacing w:before="160" w:after="40"/>
+        <w:spacing w:before="120" w:after="40"/>
         <w:ind w:left="567" w:right="567"/>
         <w:jc w:val="left"/>
         <w:shd w:val="clear" w:color="auto" w:fill="F5F5F5"/>
@@ -1203,12 +929,12 @@
           <w:i w:val="0"/>
           <w:sz w:val="20"/>
         </w:rPr>
-        <w:t>114-165    (run_one + main: before vs after measurement loop)</w:t>
+        <w:t>114-165    (run_one + main, before vs after measurement loop)</w:t>
       </w:r>
     </w:p>
     <w:p>
       <w:pPr>
-        <w:spacing w:after="200"/>
+        <w:spacing w:after="160"/>
         <w:jc w:val="center"/>
       </w:pPr>
       <w:r>
@@ -1218,12 +944,12 @@
           <w:i w:val="0"/>
           <w:sz w:val="20"/>
         </w:rPr>
-        <w:t>Listing 7: Run_One + Main: Before Vs After Measurement Loop</w:t>
+        <w:t>Listing 7: Run_One + Main, Before Vs After Measurement Loop</w:t>
       </w:r>
     </w:p>
     <w:p>
       <w:pPr>
-        <w:spacing w:after="160" w:line="276" w:lineRule="auto"/>
+        <w:spacing w:after="120" w:line="276" w:lineRule="auto"/>
         <w:jc w:val="both"/>
       </w:pPr>
       <w:r>
@@ -1233,33 +959,19 @@
           <w:i w:val="0"/>
           <w:sz w:val="22"/>
         </w:rPr>
-        <w:t>The full loop runs the 4 archetypes in a single Python session so the engine cache state stays comparable across runs. Reduction is the ratio of docsExamined before to docsExamined after. If the index does its job, that ratio is large and the winning plan moves from COLLSCAN to IXSCAN.</w:t>
+        <w:t>The 4 archetypes run in a single Python session so cache state is comparable. Reduction is the ratio of `docsExamined` before to `docsExamined` after.</w:t>
       </w:r>
     </w:p>
     <w:p>
       <w:pPr>
-        <w:spacing w:before="240" w:after="80"/>
-      </w:pPr>
-      <w:r>
-        <w:rPr>
-          <w:rFonts w:ascii="Times New Roman" w:hAnsi="Times New Roman" w:cs="Times New Roman"/>
-          <w:b/>
-          <w:i w:val="0"/>
-          <w:sz w:val="26"/>
-        </w:rPr>
-        <w:t>3.4 Results</w:t>
-      </w:r>
-    </w:p>
-    <w:p>
-      <w:pPr>
-        <w:spacing w:before="120" w:after="40"/>
+        <w:spacing w:before="80" w:after="40"/>
         <w:jc w:val="center"/>
       </w:pPr>
       <w:r>
         <w:drawing>
           <wp:inline xmlns:a="http://schemas.openxmlformats.org/drawingml/2006/main" xmlns:pic="http://schemas.openxmlformats.org/drawingml/2006/picture">
             <wp:extent cx="5400000" cy="2896975"/>
-            <wp:docPr id="2" name="Picture 2"/>
+            <wp:docPr id="1" name="Picture 1"/>
             <wp:cNvGraphicFramePr>
               <a:graphicFrameLocks noChangeAspect="1"/>
             </wp:cNvGraphicFramePr>
@@ -1271,7 +983,7 @@
                     <pic:cNvPicPr/>
                   </pic:nvPicPr>
                   <pic:blipFill>
-                    <a:blip r:embed="rId14"/>
+                    <a:blip r:embed="rId13"/>
                     <a:stretch>
                       <a:fillRect/>
                     </a:stretch>
@@ -1292,7 +1004,7 @@
     </w:p>
     <w:p>
       <w:pPr>
-        <w:spacing w:after="200"/>
+        <w:spacing w:after="160"/>
         <w:jc w:val="center"/>
       </w:pPr>
       <w:r>
@@ -1302,19 +1014,19 @@
           <w:i w:val="0"/>
           <w:sz w:val="20"/>
         </w:rPr>
-        <w:t>Figure 2: The 4 Query Archetypes Profiled</w:t>
+        <w:t>Figure 1: The 4 Query Archetypes Profiled</w:t>
       </w:r>
     </w:p>
     <w:p>
       <w:pPr>
-        <w:spacing w:before="120" w:after="40"/>
+        <w:spacing w:before="80" w:after="40"/>
         <w:jc w:val="center"/>
       </w:pPr>
       <w:r>
         <w:drawing>
           <wp:inline xmlns:a="http://schemas.openxmlformats.org/drawingml/2006/main" xmlns:pic="http://schemas.openxmlformats.org/drawingml/2006/picture">
             <wp:extent cx="5400000" cy="2483808"/>
-            <wp:docPr id="3" name="Picture 3"/>
+            <wp:docPr id="2" name="Picture 2"/>
             <wp:cNvGraphicFramePr>
               <a:graphicFrameLocks noChangeAspect="1"/>
             </wp:cNvGraphicFramePr>
@@ -1326,7 +1038,7 @@
                     <pic:cNvPicPr/>
                   </pic:nvPicPr>
                   <pic:blipFill>
-                    <a:blip r:embed="rId15"/>
+                    <a:blip r:embed="rId14"/>
                     <a:stretch>
                       <a:fillRect/>
                     </a:stretch>
@@ -1347,7 +1059,7 @@
     </w:p>
     <w:p>
       <w:pPr>
-        <w:spacing w:after="200"/>
+        <w:spacing w:after="160"/>
         <w:jc w:val="center"/>
       </w:pPr>
       <w:r>
@@ -1357,12 +1069,12 @@
           <w:i w:val="0"/>
           <w:sz w:val="20"/>
         </w:rPr>
-        <w:t>Figure 3: docsExamined Before vs After Indexing, with Reduction Factors</w:t>
+        <w:t>Figure 2: docsExamined Before vs After Indexing, with Reduction Factors</w:t>
       </w:r>
     </w:p>
     <w:p>
       <w:pPr>
-        <w:spacing w:after="160" w:line="276" w:lineRule="auto"/>
+        <w:spacing w:after="120" w:line="276" w:lineRule="auto"/>
         <w:jc w:val="both"/>
       </w:pPr>
       <w:r>
@@ -1372,27 +1084,12 @@
           <w:i w:val="0"/>
           <w:sz w:val="22"/>
         </w:rPr>
-        <w:t>3 patterns jump out of Figure 3. The point lookup on order_id (Q_C) returns 1 document, so its reduction factor is the size of the collection: 1250x. The compound predicate (Q_B) wins 50x because the index narrows on the more selective field first. The single-field equality (Q_A) and the mid-cardinality equality (Q_D) win 7.6x and 5.3x because each filter cuts the collection to roughly an eighth of its size. All 4 indexed runs end up with IXSCAN as the winning stage; all 4 baselines use COLLSCAN, which is what B-tree theory predicts.</w:t>
+        <w:t>Reduction factors: 7.6x for the single-field equality, 50.0x for the compound predicate, 1,250x for the unique point lookup (1 of 1,250 documents matches), 5.3x for the mid-cardinality equality. All 4 indexed runs use IXSCAN as the winning stage; all 4 baselines use COLLSCAN. The compound index on (pickup_zone, service_type) follows MongoDB's prefix rule with the more selective field first; if the workload shifted to service_type-only filters that order would be wrong.</w:t>
       </w:r>
     </w:p>
     <w:p>
       <w:pPr>
-        <w:spacing w:after="160" w:line="276" w:lineRule="auto"/>
-        <w:jc w:val="both"/>
-      </w:pPr>
-      <w:r>
-        <w:rPr>
-          <w:rFonts w:ascii="Times New Roman" w:hAnsi="Times New Roman" w:cs="Times New Roman"/>
-          <w:b w:val="0"/>
-          <w:i w:val="0"/>
-          <w:sz w:val="22"/>
-        </w:rPr>
-        <w:t>What I cannot report credibly is execution time. The collection fits in RAM, so the engine never actually has to touch disk, and the wall-clock differences between COLLSCAN and IXSCAN are inside the noise floor of millisecond timing. At larger data volumes the same archetypes would surface absolute timing wins, but at this scale docsExamined is the more honest metric to report.</w:t>
-      </w:r>
-    </w:p>
-    <w:p>
-      <w:pPr>
-        <w:spacing w:before="320" w:after="120"/>
+        <w:spacing w:before="280" w:after="80"/>
       </w:pPr>
       <w:r>
         <w:rPr>
@@ -1406,36 +1103,21 @@
     </w:p>
     <w:p>
       <w:pPr>
-        <w:spacing w:after="160" w:line="276" w:lineRule="auto"/>
-        <w:jc w:val="both"/>
-      </w:pPr>
-      <w:r>
-        <w:rPr>
-          <w:rFonts w:ascii="Times New Roman" w:hAnsi="Times New Roman" w:cs="Times New Roman"/>
-          <w:b w:val="0"/>
-          <w:i w:val="0"/>
-          <w:sz w:val="22"/>
-        </w:rPr>
-        <w:t>SQL in R asks me to demonstrate the relational paradigm against the same data, surface a finding the document paradigm could not express as cleanly, and tie it back to R for downstream analytical use. The dataset is small (around 4400 rows total), so SQLite is the correct engine: zero install overhead for a marker, the full ANSI SQL dialect including window functions, and a single file that ships alongside the project.</w:t>
-      </w:r>
-    </w:p>
-    <w:p>
-      <w:pPr>
-        <w:spacing w:before="240" w:after="80"/>
+        <w:spacing w:before="200" w:after="60"/>
       </w:pPr>
       <w:r>
         <w:rPr>
           <w:rFonts w:ascii="Times New Roman" w:hAnsi="Times New Roman" w:cs="Times New Roman"/>
           <w:b/>
           <w:i w:val="0"/>
-          <w:sz w:val="26"/>
+          <w:sz w:val="24"/>
         </w:rPr>
-        <w:t>4.1 Building the normalised SQLite mirror</w:t>
+        <w:t>4.1 SQLite mirror with join indexes</w:t>
       </w:r>
     </w:p>
     <w:p>
       <w:pPr>
-        <w:spacing w:before="160" w:after="40"/>
+        <w:spacing w:before="120" w:after="40"/>
         <w:ind w:left="567" w:right="567"/>
         <w:jc w:val="left"/>
         <w:shd w:val="clear" w:color="auto" w:fill="F5F5F5"/>
@@ -1505,7 +1187,7 @@
     </w:p>
     <w:p>
       <w:pPr>
-        <w:spacing w:after="200"/>
+        <w:spacing w:after="160"/>
         <w:jc w:val="center"/>
       </w:pPr>
       <w:r>
@@ -1520,7 +1202,7 @@
     </w:p>
     <w:p>
       <w:pPr>
-        <w:spacing w:after="160" w:line="276" w:lineRule="auto"/>
+        <w:spacing w:after="120" w:line="276" w:lineRule="auto"/>
         <w:jc w:val="both"/>
       </w:pPr>
       <w:r>
@@ -1530,26 +1212,26 @@
           <w:i w:val="0"/>
           <w:sz w:val="22"/>
         </w:rPr>
-        <w:t>My loader reads each CSV with readr::read_csv, runs every zone-bearing column through the same canonicalisation map the MongoDB pipeline uses, and writes each table via dbWriteTable. After load it creates 6 indexes on the join keys that the analytical queries exercise. Without those indexes, EXPLAIN QUERY PLAN reports nested loop scans for the multi-table queries; with them, the same plans report SEARCH USING INDEX. The shared canonicalisation map is what makes the 8 query results match the MongoDB pipeline to the digit; if I had cleaned the data differently across paradigms, the cross-paradigm validation in Section 4.4 would have failed.</w:t>
+        <w:t>SQLite is the right engine: small data, no install overhead, full window-function support. 6 join-key indexes turn the nested-loop scans in the multi-table queries into IXSCAN. The shared zone canonicalisation map is what makes SQL S1-S8 reproduce the MongoDB results to the digit.</w:t>
       </w:r>
     </w:p>
     <w:p>
       <w:pPr>
-        <w:spacing w:before="240" w:after="80"/>
+        <w:spacing w:before="200" w:after="60"/>
       </w:pPr>
       <w:r>
         <w:rPr>
           <w:rFonts w:ascii="Times New Roman" w:hAnsi="Times New Roman" w:cs="Times New Roman"/>
           <w:b/>
           <w:i w:val="0"/>
-          <w:sz w:val="26"/>
+          <w:sz w:val="24"/>
         </w:rPr>
         <w:t>4.2 Compound-risk 3-way join</w:t>
       </w:r>
     </w:p>
     <w:p>
       <w:pPr>
-        <w:spacing w:before="160" w:after="40"/>
+        <w:spacing w:before="120" w:after="40"/>
         <w:ind w:left="567" w:right="567"/>
         <w:jc w:val="left"/>
         <w:shd w:val="clear" w:color="auto" w:fill="F5F5F5"/>
@@ -1614,12 +1296,12 @@
           <w:i w:val="0"/>
           <w:sz w:val="20"/>
         </w:rPr>
-        <w:t>76-92    (S6: top 5 orders with both a complaint and a failed delivery)</w:t>
+        <w:t>76-92    (S6: top 5 orders with complaint + failed delivery + low rating)</w:t>
       </w:r>
     </w:p>
     <w:p>
       <w:pPr>
-        <w:spacing w:after="200"/>
+        <w:spacing w:after="160"/>
         <w:jc w:val="center"/>
       </w:pPr>
       <w:r>
@@ -1629,41 +1311,26 @@
           <w:i w:val="0"/>
           <w:sz w:val="20"/>
         </w:rPr>
-        <w:t>Listing 9: S6: Top 5 Orders With Both A Complaint And A Failed Delivery</w:t>
+        <w:t>Listing 9: S6: Top 5 Orders With Complaint + Failed Delivery + Low Rating</w:t>
       </w:r>
     </w:p>
     <w:p>
       <w:pPr>
-        <w:spacing w:after="160" w:line="276" w:lineRule="auto"/>
-        <w:jc w:val="both"/>
-      </w:pPr>
-      <w:r>
-        <w:rPr>
-          <w:rFonts w:ascii="Times New Roman" w:hAnsi="Times New Roman" w:cs="Times New Roman"/>
-          <w:b w:val="0"/>
-          <w:i w:val="0"/>
-          <w:sz w:val="22"/>
-        </w:rPr>
-        <w:t>S6 surfaces the orders that combine 3 different failure indicators at once: a logged complaint, a failed delivery, and a low post-delivery rating. The relational paradigm handles this cleanly because each entity sits in its own table and the joins are explicit. In MongoDB I happen to get the same answer almost for free because complaints and deliveries are embedded inside orders_aggregate, but that is a happy consequence of my schema choice rather than a property of the document paradigm itself.</w:t>
-      </w:r>
-    </w:p>
-    <w:p>
-      <w:pPr>
-        <w:spacing w:before="240" w:after="80"/>
+        <w:spacing w:before="200" w:after="60"/>
       </w:pPr>
       <w:r>
         <w:rPr>
           <w:rFonts w:ascii="Times New Roman" w:hAnsi="Times New Roman" w:cs="Times New Roman"/>
           <w:b/>
           <w:i w:val="0"/>
-          <w:sz w:val="26"/>
+          <w:sz w:val="24"/>
         </w:rPr>
         <w:t>4.3 Window function: top N per group</w:t>
       </w:r>
     </w:p>
     <w:p>
       <w:pPr>
-        <w:spacing w:before="160" w:after="40"/>
+        <w:spacing w:before="120" w:after="40"/>
         <w:ind w:left="567" w:right="567"/>
         <w:jc w:val="left"/>
         <w:shd w:val="clear" w:color="auto" w:fill="F5F5F5"/>
@@ -1733,7 +1400,7 @@
     </w:p>
     <w:p>
       <w:pPr>
-        <w:spacing w:after="200"/>
+        <w:spacing w:after="160"/>
         <w:jc w:val="center"/>
       </w:pPr>
       <w:r>
@@ -1748,7 +1415,7 @@
     </w:p>
     <w:p>
       <w:pPr>
-        <w:spacing w:after="160" w:line="276" w:lineRule="auto"/>
+        <w:spacing w:after="120" w:line="276" w:lineRule="auto"/>
         <w:jc w:val="both"/>
       </w:pPr>
       <w:r>
@@ -1758,41 +1425,12 @@
           <w:i w:val="0"/>
           <w:sz w:val="22"/>
         </w:rPr>
-        <w:t>S9 ranks drivers within each base zone by completed deliveries and returns the top 3 per zone. The whole thing is one SQL statement. The MongoDB equivalent needs $setWindowFields or a multi-stage pipeline. This is the marquee SQL advantage and the demonstrative reason the SQL in R band carries 15 dedicated marks.</w:t>
+        <w:t>S9 ranks drivers within each base zone in one SQL statement; the MongoDB equivalent needs `$setWindowFields` or a multi-stage pipeline. This is the demonstrative SQL advantage. 4 of the 7 zone leaders are also in the overall top-rating quintile, suggesting operational productivity and customer experience correlate positively at the driver level.</w:t>
       </w:r>
     </w:p>
     <w:p>
       <w:pPr>
-        <w:spacing w:before="240" w:after="80"/>
-      </w:pPr>
-      <w:r>
-        <w:rPr>
-          <w:rFonts w:ascii="Times New Roman" w:hAnsi="Times New Roman" w:cs="Times New Roman"/>
-          <w:b/>
-          <w:i w:val="0"/>
-          <w:sz w:val="26"/>
-        </w:rPr>
-        <w:t>4.4 Cross-paradigm validation</w:t>
-      </w:r>
-    </w:p>
-    <w:p>
-      <w:pPr>
-        <w:spacing w:after="160" w:line="276" w:lineRule="auto"/>
-        <w:jc w:val="both"/>
-      </w:pPr>
-      <w:r>
-        <w:rPr>
-          <w:rFonts w:ascii="Times New Roman" w:hAnsi="Times New Roman" w:cs="Times New Roman"/>
-          <w:b w:val="0"/>
-          <w:i w:val="0"/>
-          <w:sz w:val="22"/>
-        </w:rPr>
-        <w:t>S1 through S8 produce numerically identical results to the MongoDB aggregations from notebook 01. That sounds tautological until I remind myself the data went through 2 different load paths, 2 different cleanup paths, and 2 different aggregation engines. Where SQL's GROUP BY service_type returns the same average order_value as MongoDB's $group on $service_type, I know the joins, the cleanup and the schema are correct in both pipelines. Any divergence would have flagged a bug. On the NorthStar dataset specifically, SQL is the better fit for my analytical pipeline and MongoDB is the better fit for the order-centric read pattern that queries_v2.py exercises. The choice between them in a production setting comes down to the dominant workload, not the shape of the data.</w:t>
-      </w:r>
-    </w:p>
-    <w:p>
-      <w:pPr>
-        <w:spacing w:before="320" w:after="120"/>
+        <w:spacing w:before="280" w:after="80"/>
       </w:pPr>
       <w:r>
         <w:rPr>
@@ -1806,36 +1444,21 @@
     </w:p>
     <w:p>
       <w:pPr>
-        <w:spacing w:after="160" w:line="276" w:lineRule="auto"/>
-        <w:jc w:val="both"/>
-      </w:pPr>
-      <w:r>
-        <w:rPr>
-          <w:rFonts w:ascii="Times New Roman" w:hAnsi="Times New Roman" w:cs="Times New Roman"/>
-          <w:b w:val="0"/>
-          <w:i w:val="0"/>
-          <w:sz w:val="22"/>
-        </w:rPr>
-        <w:t>R analytics is the inferential and predictive layer of the project. I work on the SQLite mirror built in Section 4, so I do not reload the CSVs. R was new to me when I started this section, so my style here leans more pipe-heavy than how I would write the equivalent in Python; I leaned on the tidyverse to keep the joins readable. The analytical tibble is a left-join of orders, deliveries, customers and complaints with a derived failed indicator. From there I produce 5 ggplot2 charts, run 4 hypothesis tests addressing specific operational questions, and fit a multivariable logistic regression of delivery failure on 6 candidate predictors.</w:t>
-      </w:r>
-    </w:p>
-    <w:p>
-      <w:pPr>
-        <w:spacing w:before="240" w:after="80"/>
+        <w:spacing w:before="200" w:after="60"/>
       </w:pPr>
       <w:r>
         <w:rPr>
           <w:rFonts w:ascii="Times New Roman" w:hAnsi="Times New Roman" w:cs="Times New Roman"/>
           <w:b/>
           <w:i w:val="0"/>
-          <w:sz w:val="26"/>
+          <w:sz w:val="24"/>
         </w:rPr>
         <w:t>5.1 Tidyverse data prep</w:t>
       </w:r>
     </w:p>
     <w:p>
       <w:pPr>
-        <w:spacing w:before="160" w:after="40"/>
+        <w:spacing w:before="120" w:after="40"/>
         <w:ind w:left="567" w:right="567"/>
         <w:jc w:val="left"/>
         <w:shd w:val="clear" w:color="auto" w:fill="F5F5F5"/>
@@ -1905,7 +1528,7 @@
     </w:p>
     <w:p>
       <w:pPr>
-        <w:spacing w:after="200"/>
+        <w:spacing w:after="160"/>
         <w:jc w:val="center"/>
       </w:pPr>
       <w:r>
@@ -1920,36 +1543,21 @@
     </w:p>
     <w:p>
       <w:pPr>
-        <w:spacing w:after="160" w:line="276" w:lineRule="auto"/>
-        <w:jc w:val="both"/>
-      </w:pPr>
-      <w:r>
-        <w:rPr>
-          <w:rFonts w:ascii="Times New Roman" w:hAnsi="Times New Roman" w:cs="Times New Roman"/>
-          <w:b w:val="0"/>
-          <w:i w:val="0"/>
-          <w:sz w:val="22"/>
-        </w:rPr>
-        <w:t>I pull the 4 tables into memory with tbl() and collect(), aggregate complaints to a per-order count, then left-join everything onto orders. The replace_na on complaint_count is deliberate: a missing complaint is informative (the customer did not complain), it is not a data quality issue. The result is a tidy 1250-row tibble with about a quarter of the rows missing a delivery, which matches the proportion of never-dispatched orders the MongoDB pipeline reported.</w:t>
-      </w:r>
-    </w:p>
-    <w:p>
-      <w:pPr>
-        <w:spacing w:before="240" w:after="80"/>
+        <w:spacing w:before="200" w:after="60"/>
       </w:pPr>
       <w:r>
         <w:rPr>
           <w:rFonts w:ascii="Times New Roman" w:hAnsi="Times New Roman" w:cs="Times New Roman"/>
           <w:b/>
           <w:i w:val="0"/>
-          <w:sz w:val="26"/>
+          <w:sz w:val="24"/>
         </w:rPr>
         <w:t>5.2 Failure heatmap</w:t>
       </w:r>
     </w:p>
     <w:p>
       <w:pPr>
-        <w:spacing w:before="160" w:after="40"/>
+        <w:spacing w:before="120" w:after="40"/>
         <w:ind w:left="567" w:right="567"/>
         <w:jc w:val="left"/>
         <w:shd w:val="clear" w:color="auto" w:fill="F5F5F5"/>
@@ -2019,7 +1627,7 @@
     </w:p>
     <w:p>
       <w:pPr>
-        <w:spacing w:after="200"/>
+        <w:spacing w:after="160"/>
         <w:jc w:val="center"/>
       </w:pPr>
       <w:r>
@@ -2034,36 +1642,21 @@
     </w:p>
     <w:p>
       <w:pPr>
-        <w:spacing w:after="160" w:line="276" w:lineRule="auto"/>
-        <w:jc w:val="both"/>
-      </w:pPr>
-      <w:r>
-        <w:rPr>
-          <w:rFonts w:ascii="Times New Roman" w:hAnsi="Times New Roman" w:cs="Times New Roman"/>
-          <w:b w:val="0"/>
-          <w:i w:val="0"/>
-          <w:sz w:val="22"/>
-        </w:rPr>
-        <w:t>geom_tile with a sequential red palette draws the failure-by-zone story before any statistical test has to prove it. I labelled each cell with the actual percentage because the eye picks out the gradient but the brain wants the number too. This chart also doubles as a sanity check; if the failed indicator or the joins were wrong, the cells would not match the MongoDB and Python versions of the same chart.</w:t>
-      </w:r>
-    </w:p>
-    <w:p>
-      <w:pPr>
-        <w:spacing w:before="240" w:after="80"/>
+        <w:spacing w:before="200" w:after="60"/>
       </w:pPr>
       <w:r>
         <w:rPr>
           <w:rFonts w:ascii="Times New Roman" w:hAnsi="Times New Roman" w:cs="Times New Roman"/>
           <w:b/>
           <w:i w:val="0"/>
-          <w:sz w:val="26"/>
+          <w:sz w:val="24"/>
         </w:rPr>
         <w:t>5.3 Hypothesis tests</w:t>
       </w:r>
     </w:p>
     <w:p>
       <w:pPr>
-        <w:spacing w:before="160" w:after="40"/>
+        <w:spacing w:before="120" w:after="40"/>
         <w:ind w:left="567" w:right="567"/>
         <w:jc w:val="left"/>
         <w:shd w:val="clear" w:color="auto" w:fill="F5F5F5"/>
@@ -2133,7 +1726,7 @@
     </w:p>
     <w:p>
       <w:pPr>
-        <w:spacing w:after="200"/>
+        <w:spacing w:after="160"/>
         <w:jc w:val="center"/>
       </w:pPr>
       <w:r>
@@ -2148,7 +1741,7 @@
     </w:p>
     <w:p>
       <w:pPr>
-        <w:spacing w:after="160" w:line="276" w:lineRule="auto"/>
+        <w:spacing w:after="120" w:line="276" w:lineRule="auto"/>
         <w:jc w:val="both"/>
       </w:pPr>
       <w:r>
@@ -2158,26 +1751,54 @@
           <w:i w:val="0"/>
           <w:sz w:val="22"/>
         </w:rPr>
-        <w:t>My 4 tests are chi square on pickup zone vs delivery status (T1, the only significant one), the same test for service type (T2), a Welch t-test on route distance for failed vs successful deliveries (T3), and a Pearson correlation between app engagement and post-delivery rating (T4). I picked Welch over Student because I cannot assume equal variances; Pearson over Spearman because the relationship is plausibly linear at this scale.</w:t>
+        <w:t xml:space="preserve">Of 4 tests only the chi square on pickup zone reaches significance: </w:t>
+      </w:r>
+      <w:r>
+        <w:rPr>
+          <w:rFonts w:ascii="Times New Roman" w:hAnsi="Times New Roman" w:cs="Times New Roman"/>
+          <w:b w:val="0"/>
+          <w:i w:val="0"/>
+          <w:sz w:val="22"/>
+        </w:rPr>
+        <w:t>X</w:t>
+      </w:r>
+      <w:r>
+        <w:rPr>
+          <w:rFonts w:ascii="Times New Roman" w:hAnsi="Times New Roman" w:cs="Times New Roman"/>
+          <w:b w:val="0"/>
+          <w:i w:val="0"/>
+          <w:sz w:val="22"/>
+          <w:vertAlign w:val="superscript"/>
+        </w:rPr>
+        <w:t>2</w:t>
+      </w:r>
+      <w:r>
+        <w:rPr>
+          <w:rFonts w:ascii="Times New Roman" w:hAnsi="Times New Roman" w:cs="Times New Roman"/>
+          <w:b w:val="0"/>
+          <w:i w:val="0"/>
+          <w:sz w:val="22"/>
+        </w:rPr>
+        <w:t xml:space="preserve"> = 26.12, df = 12, p = 0.0103. Service type, route distance and app engagement do not. The scipy implementation in Notebook 1 returns the same numbers — this is the project's strongest cross-paradigm validation, and the one time I am highlighting it in the report.</w:t>
       </w:r>
     </w:p>
     <w:p>
       <w:pPr>
-        <w:spacing w:before="240" w:after="80"/>
+        <w:spacing w:before="200" w:after="60"/>
       </w:pPr>
       <w:r>
         <w:rPr>
           <w:rFonts w:ascii="Times New Roman" w:hAnsi="Times New Roman" w:cs="Times New Roman"/>
           <w:b/>
           <w:i w:val="0"/>
-          <w:sz w:val="26"/>
+          <w:sz w:val="24"/>
         </w:rPr>
         <w:t>5.4 Logistic regression</w:t>
       </w:r>
     </w:p>
     <w:p>
       <w:pPr>
-        <w:spacing w:before="160" w:after="40"/>
+        <w:spacing w:before="120" w:after="40"/>
         <w:ind w:left="567" w:right="567"/>
         <w:jc w:val="left"/>
         <w:shd w:val="clear" w:color="auto" w:fill="F5F5F5"/>
@@ -2247,7 +1868,7 @@
     </w:p>
     <w:p>
       <w:pPr>
-        <w:spacing w:after="200"/>
+        <w:spacing w:after="160"/>
         <w:jc w:val="center"/>
       </w:pPr>
       <w:r>
@@ -2262,7 +1883,7 @@
     </w:p>
     <w:p>
       <w:pPr>
-        <w:spacing w:after="160" w:line="276" w:lineRule="auto"/>
+        <w:spacing w:after="120" w:line="276" w:lineRule="auto"/>
         <w:jc w:val="both"/>
       </w:pPr>
       <w:r>
@@ -2272,143 +1893,19 @@
           <w:i w:val="0"/>
           <w:sz w:val="22"/>
         </w:rPr>
-        <w:t>I deliberately keep all 6 predictors in the model rather than pruning to the significant ones. The marker can see the breadth of what I tested, and I would rather report a full model with mostly non-significant terms than hide what was checked. The model isolates priority_levelCritical as the single significant coefficient at the 5 percent level: critical-priority orders carry odds ratio 0.275 (95% CI 0.082 to 0.929), a 72.5% lower odds of failure than the low-priority baseline.</w:t>
+        <w:t>All 6 predictors stay in the model so the marker sees what was tested. Only `priority_levelCritical` is significant: OR 0.275 (95% CI 0.082-0.929), a 72.5% lower odds of failure than the low-priority baseline. The platform's escalation handling appears to work.</w:t>
       </w:r>
     </w:p>
     <w:p>
       <w:pPr>
-        <w:spacing w:before="240" w:after="80"/>
-      </w:pPr>
-      <w:r>
-        <w:rPr>
-          <w:rFonts w:ascii="Times New Roman" w:hAnsi="Times New Roman" w:cs="Times New Roman"/>
-          <w:b/>
-          <w:i w:val="0"/>
-          <w:sz w:val="26"/>
-        </w:rPr>
-        <w:t>5.5 Results</w:t>
-      </w:r>
-    </w:p>
-    <w:p>
-      <w:pPr>
-        <w:spacing w:before="120" w:after="40"/>
-        <w:jc w:val="center"/>
-      </w:pPr>
-      <w:r>
-        <w:drawing>
-          <wp:inline xmlns:a="http://schemas.openxmlformats.org/drawingml/2006/main" xmlns:pic="http://schemas.openxmlformats.org/drawingml/2006/picture">
-            <wp:extent cx="5400000" cy="3900000"/>
-            <wp:docPr id="4" name="Picture 4"/>
-            <wp:cNvGraphicFramePr>
-              <a:graphicFrameLocks noChangeAspect="1"/>
-            </wp:cNvGraphicFramePr>
-            <a:graphic>
-              <a:graphicData uri="http://schemas.openxmlformats.org/drawingml/2006/picture">
-                <pic:pic>
-                  <pic:nvPicPr>
-                    <pic:cNvPr id="0" name="R1_revenue_by_service.png"/>
-                    <pic:cNvPicPr/>
-                  </pic:nvPicPr>
-                  <pic:blipFill>
-                    <a:blip r:embed="rId16"/>
-                    <a:stretch>
-                      <a:fillRect/>
-                    </a:stretch>
-                  </pic:blipFill>
-                  <pic:spPr>
-                    <a:xfrm>
-                      <a:off x="0" y="0"/>
-                      <a:ext cx="5400000" cy="3900000"/>
-                    </a:xfrm>
-                    <a:prstGeom prst="rect"/>
-                  </pic:spPr>
-                </pic:pic>
-              </a:graphicData>
-            </a:graphic>
-          </wp:inline>
-        </w:drawing>
-      </w:r>
-    </w:p>
-    <w:p>
-      <w:pPr>
-        <w:spacing w:after="200"/>
-        <w:jc w:val="center"/>
-      </w:pPr>
-      <w:r>
-        <w:rPr>
-          <w:rFonts w:ascii="Times New Roman" w:hAnsi="Times New Roman" w:cs="Times New Roman"/>
-          <w:b/>
-          <w:i w:val="0"/>
-          <w:sz w:val="20"/>
-        </w:rPr>
-        <w:t>Figure 4: Order Value Distribution by Service Type</w:t>
-      </w:r>
-    </w:p>
-    <w:p>
-      <w:pPr>
-        <w:spacing w:before="120" w:after="40"/>
-        <w:jc w:val="center"/>
-      </w:pPr>
-      <w:r>
-        <w:drawing>
-          <wp:inline xmlns:a="http://schemas.openxmlformats.org/drawingml/2006/main" xmlns:pic="http://schemas.openxmlformats.org/drawingml/2006/picture">
-            <wp:extent cx="5400000" cy="3933998"/>
-            <wp:docPr id="5" name="Picture 5"/>
-            <wp:cNvGraphicFramePr>
-              <a:graphicFrameLocks noChangeAspect="1"/>
-            </wp:cNvGraphicFramePr>
-            <a:graphic>
-              <a:graphicData uri="http://schemas.openxmlformats.org/drawingml/2006/picture">
-                <pic:pic>
-                  <pic:nvPicPr>
-                    <pic:cNvPr id="0" name="R2_rating_distribution.png"/>
-                    <pic:cNvPicPr/>
-                  </pic:nvPicPr>
-                  <pic:blipFill>
-                    <a:blip r:embed="rId17"/>
-                    <a:stretch>
-                      <a:fillRect/>
-                    </a:stretch>
-                  </pic:blipFill>
-                  <pic:spPr>
-                    <a:xfrm>
-                      <a:off x="0" y="0"/>
-                      <a:ext cx="5400000" cy="3933998"/>
-                    </a:xfrm>
-                    <a:prstGeom prst="rect"/>
-                  </pic:spPr>
-                </pic:pic>
-              </a:graphicData>
-            </a:graphic>
-          </wp:inline>
-        </w:drawing>
-      </w:r>
-    </w:p>
-    <w:p>
-      <w:pPr>
-        <w:spacing w:after="200"/>
-        <w:jc w:val="center"/>
-      </w:pPr>
-      <w:r>
-        <w:rPr>
-          <w:rFonts w:ascii="Times New Roman" w:hAnsi="Times New Roman" w:cs="Times New Roman"/>
-          <w:b/>
-          <w:i w:val="0"/>
-          <w:sz w:val="20"/>
-        </w:rPr>
-        <w:t>Figure 5: Post-Delivery Rating Distribution by Service Type</w:t>
-      </w:r>
-    </w:p>
-    <w:p>
-      <w:pPr>
-        <w:spacing w:before="120" w:after="40"/>
+        <w:spacing w:before="80" w:after="40"/>
         <w:jc w:val="center"/>
       </w:pPr>
       <w:r>
         <w:drawing>
           <wp:inline xmlns:a="http://schemas.openxmlformats.org/drawingml/2006/main" xmlns:pic="http://schemas.openxmlformats.org/drawingml/2006/picture">
             <wp:extent cx="5400000" cy="4016842"/>
-            <wp:docPr id="6" name="Picture 6"/>
+            <wp:docPr id="3" name="Picture 3"/>
             <wp:cNvGraphicFramePr>
               <a:graphicFrameLocks noChangeAspect="1"/>
             </wp:cNvGraphicFramePr>
@@ -2420,7 +1917,7 @@
                     <pic:cNvPicPr/>
                   </pic:nvPicPr>
                   <pic:blipFill>
-                    <a:blip r:embed="rId18"/>
+                    <a:blip r:embed="rId15"/>
                     <a:stretch>
                       <a:fillRect/>
                     </a:stretch>
@@ -2441,7 +1938,7 @@
     </w:p>
     <w:p>
       <w:pPr>
-        <w:spacing w:after="200"/>
+        <w:spacing w:after="160"/>
         <w:jc w:val="center"/>
       </w:pPr>
       <w:r>
@@ -2451,129 +1948,19 @@
           <w:i w:val="0"/>
           <w:sz w:val="20"/>
         </w:rPr>
-        <w:t>Figure 6: Failure Rate by Pickup Zone and Service Type</w:t>
+        <w:t>Figure 3: Failure Rate by Pickup Zone and Service Type</w:t>
       </w:r>
     </w:p>
     <w:p>
       <w:pPr>
-        <w:spacing w:before="120" w:after="40"/>
-        <w:jc w:val="center"/>
-      </w:pPr>
-      <w:r>
-        <w:drawing>
-          <wp:inline xmlns:a="http://schemas.openxmlformats.org/drawingml/2006/main" xmlns:pic="http://schemas.openxmlformats.org/drawingml/2006/picture">
-            <wp:extent cx="5400000" cy="3876074"/>
-            <wp:docPr id="7" name="Picture 7"/>
-            <wp:cNvGraphicFramePr>
-              <a:graphicFrameLocks noChangeAspect="1"/>
-            </wp:cNvGraphicFramePr>
-            <a:graphic>
-              <a:graphicData uri="http://schemas.openxmlformats.org/drawingml/2006/picture">
-                <pic:pic>
-                  <pic:nvPicPr>
-                    <pic:cNvPr id="0" name="R4_distance_vs_rating.png"/>
-                    <pic:cNvPicPr/>
-                  </pic:nvPicPr>
-                  <pic:blipFill>
-                    <a:blip r:embed="rId19"/>
-                    <a:stretch>
-                      <a:fillRect/>
-                    </a:stretch>
-                  </pic:blipFill>
-                  <pic:spPr>
-                    <a:xfrm>
-                      <a:off x="0" y="0"/>
-                      <a:ext cx="5400000" cy="3876074"/>
-                    </a:xfrm>
-                    <a:prstGeom prst="rect"/>
-                  </pic:spPr>
-                </pic:pic>
-              </a:graphicData>
-            </a:graphic>
-          </wp:inline>
-        </w:drawing>
-      </w:r>
-    </w:p>
-    <w:p>
-      <w:pPr>
-        <w:spacing w:after="200"/>
-        <w:jc w:val="center"/>
-      </w:pPr>
-      <w:r>
-        <w:rPr>
-          <w:rFonts w:ascii="Times New Roman" w:hAnsi="Times New Roman" w:cs="Times New Roman"/>
-          <w:b/>
-          <w:i w:val="0"/>
-          <w:sz w:val="20"/>
-        </w:rPr>
-        <w:t>Figure 7: Route Distance vs Customer Rating, by Outcome</w:t>
-      </w:r>
-    </w:p>
-    <w:p>
-      <w:pPr>
-        <w:spacing w:before="120" w:after="40"/>
-        <w:jc w:val="center"/>
-      </w:pPr>
-      <w:r>
-        <w:drawing>
-          <wp:inline xmlns:a="http://schemas.openxmlformats.org/drawingml/2006/main" xmlns:pic="http://schemas.openxmlformats.org/drawingml/2006/picture">
-            <wp:extent cx="5400000" cy="4243337"/>
-            <wp:docPr id="8" name="Picture 8"/>
-            <wp:cNvGraphicFramePr>
-              <a:graphicFrameLocks noChangeAspect="1"/>
-            </wp:cNvGraphicFramePr>
-            <a:graphic>
-              <a:graphicData uri="http://schemas.openxmlformats.org/drawingml/2006/picture">
-                <pic:pic>
-                  <pic:nvPicPr>
-                    <pic:cNvPr id="0" name="R5_rating_by_zone.png"/>
-                    <pic:cNvPicPr/>
-                  </pic:nvPicPr>
-                  <pic:blipFill>
-                    <a:blip r:embed="rId20"/>
-                    <a:stretch>
-                      <a:fillRect/>
-                    </a:stretch>
-                  </pic:blipFill>
-                  <pic:spPr>
-                    <a:xfrm>
-                      <a:off x="0" y="0"/>
-                      <a:ext cx="5400000" cy="4243337"/>
-                    </a:xfrm>
-                    <a:prstGeom prst="rect"/>
-                  </pic:spPr>
-                </pic:pic>
-              </a:graphicData>
-            </a:graphic>
-          </wp:inline>
-        </w:drawing>
-      </w:r>
-    </w:p>
-    <w:p>
-      <w:pPr>
-        <w:spacing w:after="200"/>
-        <w:jc w:val="center"/>
-      </w:pPr>
-      <w:r>
-        <w:rPr>
-          <w:rFonts w:ascii="Times New Roman" w:hAnsi="Times New Roman" w:cs="Times New Roman"/>
-          <w:b/>
-          <w:i w:val="0"/>
-          <w:sz w:val="20"/>
-        </w:rPr>
-        <w:t>Figure 8: Customer Rating Distribution by Pickup Zone</w:t>
-      </w:r>
-    </w:p>
-    <w:p>
-      <w:pPr>
-        <w:spacing w:before="120" w:after="40"/>
+        <w:spacing w:before="80" w:after="40"/>
         <w:jc w:val="center"/>
       </w:pPr>
       <w:r>
         <w:drawing>
           <wp:inline xmlns:a="http://schemas.openxmlformats.org/drawingml/2006/main" xmlns:pic="http://schemas.openxmlformats.org/drawingml/2006/picture">
             <wp:extent cx="5400000" cy="2277224"/>
-            <wp:docPr id="9" name="Picture 9"/>
+            <wp:docPr id="4" name="Picture 4"/>
             <wp:cNvGraphicFramePr>
               <a:graphicFrameLocks noChangeAspect="1"/>
             </wp:cNvGraphicFramePr>
@@ -2585,7 +1972,7 @@
                     <pic:cNvPicPr/>
                   </pic:nvPicPr>
                   <pic:blipFill>
-                    <a:blip r:embed="rId21"/>
+                    <a:blip r:embed="rId16"/>
                     <a:stretch>
                       <a:fillRect/>
                     </a:stretch>
@@ -2606,7 +1993,7 @@
     </w:p>
     <w:p>
       <w:pPr>
-        <w:spacing w:after="200"/>
+        <w:spacing w:after="160"/>
         <w:jc w:val="center"/>
       </w:pPr>
       <w:r>
@@ -2616,19 +2003,19 @@
           <w:i w:val="0"/>
           <w:sz w:val="20"/>
         </w:rPr>
-        <w:t>Figure 9: 4 Hypothesis Tests, 1 Significant at the 5% Level</w:t>
+        <w:t>Figure 4: 4 Hypothesis Tests, 1 Significant at the 5% Level</w:t>
       </w:r>
     </w:p>
     <w:p>
       <w:pPr>
-        <w:spacing w:before="120" w:after="40"/>
+        <w:spacing w:before="80" w:after="40"/>
         <w:jc w:val="center"/>
       </w:pPr>
       <w:r>
         <w:drawing>
           <wp:inline xmlns:a="http://schemas.openxmlformats.org/drawingml/2006/main" xmlns:pic="http://schemas.openxmlformats.org/drawingml/2006/picture">
             <wp:extent cx="5400000" cy="9233808"/>
-            <wp:docPr id="10" name="Picture 10"/>
+            <wp:docPr id="5" name="Picture 5"/>
             <wp:cNvGraphicFramePr>
               <a:graphicFrameLocks noChangeAspect="1"/>
             </wp:cNvGraphicFramePr>
@@ -2640,7 +2027,7 @@
                     <pic:cNvPicPr/>
                   </pic:nvPicPr>
                   <pic:blipFill>
-                    <a:blip r:embed="rId22"/>
+                    <a:blip r:embed="rId17"/>
                     <a:stretch>
                       <a:fillRect/>
                     </a:stretch>
@@ -2661,7 +2048,7 @@
     </w:p>
     <w:p>
       <w:pPr>
-        <w:spacing w:after="200"/>
+        <w:spacing w:after="160"/>
         <w:jc w:val="center"/>
       </w:pPr>
       <w:r>
@@ -2671,27 +2058,12 @@
           <w:i w:val="0"/>
           <w:sz w:val="20"/>
         </w:rPr>
-        <w:t>Figure 10: Logistic Regression Odds Ratios with 95% Confidence Intervals</w:t>
+        <w:t>Figure 5: Logistic Regression Odds Ratios with 95% Confidence Intervals</w:t>
       </w:r>
     </w:p>
     <w:p>
       <w:pPr>
-        <w:spacing w:after="160" w:line="276" w:lineRule="auto"/>
-        <w:jc w:val="both"/>
-      </w:pPr>
-      <w:r>
-        <w:rPr>
-          <w:rFonts w:ascii="Times New Roman" w:hAnsi="Times New Roman" w:cs="Times New Roman"/>
-          <w:b w:val="0"/>
-          <w:i w:val="0"/>
-          <w:sz w:val="22"/>
-        </w:rPr>
-        <w:t>The headline finding sits in Figure 6 and Figure 9: around 1 in 5 orders dispatched from Central or North fails, against an average closer to 1 in 10 across the other 5 zones. Figure 10 confirms the regression side: critical-priority orders carry 0.275 times the odds of failure of the low-priority baseline, the confidence interval does not span 1, so the effect is real at the 5 percent level. No other coefficient reaches significance, which is consistent with the chi square pattern.</w:t>
-      </w:r>
-    </w:p>
-    <w:p>
-      <w:pPr>
-        <w:spacing w:before="320" w:after="120"/>
+        <w:spacing w:before="280" w:after="80"/>
       </w:pPr>
       <w:r>
         <w:rPr>
@@ -2705,36 +2077,21 @@
     </w:p>
     <w:p>
       <w:pPr>
-        <w:spacing w:after="160" w:line="276" w:lineRule="auto"/>
-        <w:jc w:val="both"/>
-      </w:pPr>
-      <w:r>
-        <w:rPr>
-          <w:rFonts w:ascii="Times New Roman" w:hAnsi="Times New Roman" w:cs="Times New Roman"/>
-          <w:b w:val="0"/>
-          <w:i w:val="0"/>
-          <w:sz w:val="22"/>
-        </w:rPr>
-        <w:t>The Python data processing band asks for extraction and cleansing using pandas, formal data quality validation, and a supervised machine learning model. My data source is the same 9 NorthStar CSVs that the MongoDB, SQL and R sections of the project use, so the numbers can be cross-checked against all 3 other paradigms. The structure is etl.py for the load and scorecard, analyse.py for the inferential and ML work.</w:t>
-      </w:r>
-    </w:p>
-    <w:p>
-      <w:pPr>
-        <w:spacing w:before="240" w:after="80"/>
+        <w:spacing w:before="200" w:after="60"/>
       </w:pPr>
       <w:r>
         <w:rPr>
           <w:rFonts w:ascii="Times New Roman" w:hAnsi="Times New Roman" w:cs="Times New Roman"/>
           <w:b/>
           <w:i w:val="0"/>
-          <w:sz w:val="26"/>
+          <w:sz w:val="24"/>
         </w:rPr>
         <w:t>6.1 Pandas ETL</w:t>
       </w:r>
     </w:p>
     <w:p>
       <w:pPr>
-        <w:spacing w:before="160" w:after="40"/>
+        <w:spacing w:before="120" w:after="40"/>
         <w:ind w:left="567" w:right="567"/>
         <w:jc w:val="left"/>
         <w:shd w:val="clear" w:color="auto" w:fill="F5F5F5"/>
@@ -2804,7 +2161,7 @@
     </w:p>
     <w:p>
       <w:pPr>
-        <w:spacing w:after="200"/>
+        <w:spacing w:after="160"/>
         <w:jc w:val="center"/>
       </w:pPr>
       <w:r>
@@ -2819,36 +2176,21 @@
     </w:p>
     <w:p>
       <w:pPr>
-        <w:spacing w:after="160" w:line="276" w:lineRule="auto"/>
-        <w:jc w:val="both"/>
-      </w:pPr>
-      <w:r>
-        <w:rPr>
-          <w:rFonts w:ascii="Times New Roman" w:hAnsi="Times New Roman" w:cs="Times New Roman"/>
-          <w:b w:val="0"/>
-          <w:i w:val="0"/>
-          <w:sz w:val="22"/>
-        </w:rPr>
-        <w:t>I read each CSV into a dict keyed by table name, then map every zone-bearing column through the same ZONE_MAP my MongoDB pipeline uses. Sharing the map across paradigms is what makes the cross-pipeline validation in Section 6.3 hold; if Python and MongoDB cleaned the data differently, the chi square test would no longer agree to 4 decimal places.</w:t>
-      </w:r>
-    </w:p>
-    <w:p>
-      <w:pPr>
-        <w:spacing w:before="240" w:after="80"/>
+        <w:spacing w:before="200" w:after="60"/>
       </w:pPr>
       <w:r>
         <w:rPr>
           <w:rFonts w:ascii="Times New Roman" w:hAnsi="Times New Roman" w:cs="Times New Roman"/>
           <w:b/>
           <w:i w:val="0"/>
-          <w:sz w:val="26"/>
+          <w:sz w:val="24"/>
         </w:rPr>
-        <w:t>6.2 Data quality scorecard</w:t>
+        <w:t>6.2 5-dimension data quality scorecard</w:t>
       </w:r>
     </w:p>
     <w:p>
       <w:pPr>
-        <w:spacing w:before="160" w:after="40"/>
+        <w:spacing w:before="120" w:after="40"/>
         <w:ind w:left="567" w:right="567"/>
         <w:jc w:val="left"/>
         <w:shd w:val="clear" w:color="auto" w:fill="F5F5F5"/>
@@ -2913,12 +2255,12 @@
           <w:i w:val="0"/>
           <w:sz w:val="20"/>
         </w:rPr>
-        <w:t>87-120    (quality_report: 5-dimension scorecard)</w:t>
+        <w:t>87-120    (quality_report function)</w:t>
       </w:r>
     </w:p>
     <w:p>
       <w:pPr>
-        <w:spacing w:after="200"/>
+        <w:spacing w:after="160"/>
         <w:jc w:val="center"/>
       </w:pPr>
       <w:r>
@@ -2928,12 +2270,12 @@
           <w:i w:val="0"/>
           <w:sz w:val="20"/>
         </w:rPr>
-        <w:t>Listing 16: Quality_Report: 5-Dimension Scorecard</w:t>
+        <w:t>Listing 16: Quality_Report Function</w:t>
       </w:r>
     </w:p>
     <w:p>
       <w:pPr>
-        <w:spacing w:after="160" w:line="276" w:lineRule="auto"/>
+        <w:spacing w:after="120" w:line="276" w:lineRule="auto"/>
         <w:jc w:val="both"/>
       </w:pPr>
       <w:r>
@@ -2943,26 +2285,26 @@
           <w:i w:val="0"/>
           <w:sz w:val="22"/>
         </w:rPr>
-        <w:t>I built the scorecard around the 5 things I wanted to check before I trusted the data for analysis. Rows, total NA cells, duplicate primary keys, foreign-key violations against the referenced primary keys, and the distinct zone count across every zone-bearing column. It runs once before cleanup and once after, so the diff is visible. I made the cleanup deliberately non-destructive: it never imputes or drops rows, only canonicalises strings and parses dates. That decision keeps the cleansed data faithful to the operational source of truth.</w:t>
+        <w:t>5 dimensions: rows, total NA cells, duplicate PKs, FK violations, distinct zone count. Runs once before cleanup and once after. The cleanup is deliberately non-destructive: no imputation, no row drops, only string canonicalisation and date parsing.</w:t>
       </w:r>
     </w:p>
     <w:p>
       <w:pPr>
-        <w:spacing w:before="240" w:after="80"/>
+        <w:spacing w:before="200" w:after="60"/>
       </w:pPr>
       <w:r>
         <w:rPr>
           <w:rFonts w:ascii="Times New Roman" w:hAnsi="Times New Roman" w:cs="Times New Roman"/>
           <w:b/>
           <w:i w:val="0"/>
-          <w:sz w:val="26"/>
+          <w:sz w:val="24"/>
         </w:rPr>
         <w:t>6.3 scipy chi square</w:t>
       </w:r>
     </w:p>
     <w:p>
       <w:pPr>
-        <w:spacing w:before="160" w:after="40"/>
+        <w:spacing w:before="120" w:after="40"/>
         <w:ind w:left="567" w:right="567"/>
         <w:jc w:val="left"/>
         <w:shd w:val="clear" w:color="auto" w:fill="F5F5F5"/>
@@ -3027,12 +2369,12 @@
           <w:i w:val="0"/>
           <w:sz w:val="20"/>
         </w:rPr>
-        <w:t>64-78    (chi_square_tests: 2 chi square tests mirroring the R analysis)</w:t>
+        <w:t>64-78    (chi_square_tests: 2 tests mirroring the R analysis)</w:t>
       </w:r>
     </w:p>
     <w:p>
       <w:pPr>
-        <w:spacing w:after="200"/>
+        <w:spacing w:after="160"/>
         <w:jc w:val="center"/>
       </w:pPr>
       <w:r>
@@ -3042,69 +2384,26 @@
           <w:i w:val="0"/>
           <w:sz w:val="20"/>
         </w:rPr>
-        <w:t>Listing 17: Chi_Square_Tests: 2 Chi Square Tests Mirroring The R Analysis</w:t>
+        <w:t>Listing 17: Chi_Square_Tests: 2 Tests Mirroring The R Analysis</w:t>
       </w:r>
     </w:p>
     <w:p>
       <w:pPr>
-        <w:spacing w:after="160" w:line="276" w:lineRule="auto"/>
-        <w:jc w:val="both"/>
-      </w:pPr>
-      <w:r>
-        <w:rPr>
-          <w:rFonts w:ascii="Times New Roman" w:hAnsi="Times New Roman" w:cs="Times New Roman"/>
-          <w:b w:val="0"/>
-          <w:i w:val="0"/>
-          <w:sz w:val="22"/>
-        </w:rPr>
-        <w:t xml:space="preserve">scipy.stats.chi2_contingency on the pickup zone by delivery status contingency table returns </w:t>
-      </w:r>
-      <w:r>
-        <w:rPr>
-          <w:rFonts w:ascii="Times New Roman" w:hAnsi="Times New Roman" w:cs="Times New Roman"/>
-          <w:b w:val="0"/>
-          <w:i w:val="0"/>
-          <w:sz w:val="22"/>
-        </w:rPr>
-        <w:t>X</w:t>
-      </w:r>
-      <w:r>
-        <w:rPr>
-          <w:rFonts w:ascii="Times New Roman" w:hAnsi="Times New Roman" w:cs="Times New Roman"/>
-          <w:b w:val="0"/>
-          <w:i w:val="0"/>
-          <w:sz w:val="22"/>
-          <w:vertAlign w:val="superscript"/>
-        </w:rPr>
-        <w:t>2</w:t>
-      </w:r>
-      <w:r>
-        <w:rPr>
-          <w:rFonts w:ascii="Times New Roman" w:hAnsi="Times New Roman" w:cs="Times New Roman"/>
-          <w:b w:val="0"/>
-          <w:i w:val="0"/>
-          <w:sz w:val="22"/>
-        </w:rPr>
-        <w:t xml:space="preserve"> = 26.12, dof = 12, p = 0.0103. R's chisq.test on the same data returns the same numbers. The agreement to 4 decimal places is what I needed to trust that the SQL load, the pandas joins and the cleanup are all consistent across my 2 pipelines. Any divergence would have flagged a bug in one of them and forced me to dig.</w:t>
-      </w:r>
-    </w:p>
-    <w:p>
-      <w:pPr>
-        <w:spacing w:before="240" w:after="80"/>
+        <w:spacing w:before="200" w:after="60"/>
       </w:pPr>
       <w:r>
         <w:rPr>
           <w:rFonts w:ascii="Times New Roman" w:hAnsi="Times New Roman" w:cs="Times New Roman"/>
           <w:b/>
           <w:i w:val="0"/>
-          <w:sz w:val="26"/>
+          <w:sz w:val="24"/>
         </w:rPr>
         <w:t>6.4 scikit-learn random forest</w:t>
       </w:r>
     </w:p>
     <w:p>
       <w:pPr>
-        <w:spacing w:before="160" w:after="40"/>
+        <w:spacing w:before="120" w:after="40"/>
         <w:ind w:left="567" w:right="567"/>
         <w:jc w:val="left"/>
         <w:shd w:val="clear" w:color="auto" w:fill="F5F5F5"/>
@@ -3169,12 +2468,12 @@
           <w:i w:val="0"/>
           <w:sz w:val="20"/>
         </w:rPr>
-        <w:t>79-130    (fit_random_forest: pipeline + 5-fold cross-validated ROC AUC)</w:t>
+        <w:t>79-130    (fit_random_forest: pipeline + stratified 5-fold cross-validation)</w:t>
       </w:r>
     </w:p>
     <w:p>
       <w:pPr>
-        <w:spacing w:after="200"/>
+        <w:spacing w:after="160"/>
         <w:jc w:val="center"/>
       </w:pPr>
       <w:r>
@@ -3184,12 +2483,12 @@
           <w:i w:val="0"/>
           <w:sz w:val="20"/>
         </w:rPr>
-        <w:t>Listing 18: Fit_Random_Forest: Pipeline + 5-Fold Cross-Validated Roc Auc</w:t>
+        <w:t>Listing 18: Fit_Random_Forest: Pipeline + Stratified 5-Fold Cross-Validation</w:t>
       </w:r>
     </w:p>
     <w:p>
       <w:pPr>
-        <w:spacing w:after="160" w:line="276" w:lineRule="auto"/>
+        <w:spacing w:after="120" w:line="276" w:lineRule="auto"/>
         <w:jc w:val="both"/>
       </w:pPr>
       <w:r>
@@ -3199,33 +2498,184 @@
           <w:i w:val="0"/>
           <w:sz w:val="22"/>
         </w:rPr>
-        <w:t>My classifier is a ColumnTransformer that one-hot encodes the categoricals and scales the numerics, wrapped together with a RandomForestClassifier inside one sklearn Pipeline. Stratified 5-fold cross-validation reports ROC AUC. I picked random forest specifically because it handles mixed feature types without manual preparation and because it can capture non-linear interactions the R linear logistic regression cannot see. The pair is intentional: if both find no signal, the signal is probably not there at order level.</w:t>
+        <w:t>Random forest specifically because it handles mixed feature types without manual preparation and captures non-linear interactions that the R linear logistic regression cannot. If both find no signal, the signal is not at order level. 5-fold ROC AUC: 0.487 +/- 0.064.</w:t>
       </w:r>
     </w:p>
     <w:p>
       <w:pPr>
-        <w:spacing w:before="240" w:after="80"/>
+        <w:spacing w:before="80" w:after="40"/>
+        <w:jc w:val="center"/>
+      </w:pPr>
+      <w:r>
+        <w:drawing>
+          <wp:inline xmlns:a="http://schemas.openxmlformats.org/drawingml/2006/main" xmlns:pic="http://schemas.openxmlformats.org/drawingml/2006/picture">
+            <wp:extent cx="5400000" cy="3187689"/>
+            <wp:docPr id="6" name="Picture 6"/>
+            <wp:cNvGraphicFramePr>
+              <a:graphicFrameLocks noChangeAspect="1"/>
+            </wp:cNvGraphicFramePr>
+            <a:graphic>
+              <a:graphicData uri="http://schemas.openxmlformats.org/drawingml/2006/picture">
+                <pic:pic>
+                  <pic:nvPicPr>
+                    <pic:cNvPr id="0" name="P1_feature_importance.png"/>
+                    <pic:cNvPicPr/>
+                  </pic:nvPicPr>
+                  <pic:blipFill>
+                    <a:blip r:embed="rId18"/>
+                    <a:stretch>
+                      <a:fillRect/>
+                    </a:stretch>
+                  </pic:blipFill>
+                  <pic:spPr>
+                    <a:xfrm>
+                      <a:off x="0" y="0"/>
+                      <a:ext cx="5400000" cy="3187689"/>
+                    </a:xfrm>
+                    <a:prstGeom prst="rect"/>
+                  </pic:spPr>
+                </pic:pic>
+              </a:graphicData>
+            </a:graphic>
+          </wp:inline>
+        </w:drawing>
+      </w:r>
+    </w:p>
+    <w:p>
+      <w:pPr>
+        <w:spacing w:after="160"/>
+        <w:jc w:val="center"/>
       </w:pPr>
       <w:r>
         <w:rPr>
           <w:rFonts w:ascii="Times New Roman" w:hAnsi="Times New Roman" w:cs="Times New Roman"/>
           <w:b/>
           <w:i w:val="0"/>
-          <w:sz w:val="26"/>
+          <w:sz w:val="20"/>
         </w:rPr>
-        <w:t>6.5 Results</w:t>
+        <w:t>Figure 6: Random Forest Feature Importance</w:t>
       </w:r>
     </w:p>
     <w:p>
       <w:pPr>
-        <w:spacing w:before="120" w:after="40"/>
+        <w:spacing w:before="80" w:after="40"/>
+        <w:jc w:val="center"/>
+      </w:pPr>
+      <w:r>
+        <w:drawing>
+          <wp:inline xmlns:a="http://schemas.openxmlformats.org/drawingml/2006/main" xmlns:pic="http://schemas.openxmlformats.org/drawingml/2006/picture">
+            <wp:extent cx="5400000" cy="5461998"/>
+            <wp:docPr id="7" name="Picture 7"/>
+            <wp:cNvGraphicFramePr>
+              <a:graphicFrameLocks noChangeAspect="1"/>
+            </wp:cNvGraphicFramePr>
+            <a:graphic>
+              <a:graphicData uri="http://schemas.openxmlformats.org/drawingml/2006/picture">
+                <pic:pic>
+                  <pic:nvPicPr>
+                    <pic:cNvPr id="0" name="P2_roc_curve.png"/>
+                    <pic:cNvPicPr/>
+                  </pic:nvPicPr>
+                  <pic:blipFill>
+                    <a:blip r:embed="rId19"/>
+                    <a:stretch>
+                      <a:fillRect/>
+                    </a:stretch>
+                  </pic:blipFill>
+                  <pic:spPr>
+                    <a:xfrm>
+                      <a:off x="0" y="0"/>
+                      <a:ext cx="5400000" cy="5461998"/>
+                    </a:xfrm>
+                    <a:prstGeom prst="rect"/>
+                  </pic:spPr>
+                </pic:pic>
+              </a:graphicData>
+            </a:graphic>
+          </wp:inline>
+        </w:drawing>
+      </w:r>
+    </w:p>
+    <w:p>
+      <w:pPr>
+        <w:spacing w:after="160"/>
+        <w:jc w:val="center"/>
+      </w:pPr>
+      <w:r>
+        <w:rPr>
+          <w:rFonts w:ascii="Times New Roman" w:hAnsi="Times New Roman" w:cs="Times New Roman"/>
+          <w:b/>
+          <w:i w:val="0"/>
+          <w:sz w:val="20"/>
+        </w:rPr>
+        <w:t>Figure 7: ROC Curve on the Hold-Out Test Fold</w:t>
+      </w:r>
+    </w:p>
+    <w:p>
+      <w:pPr>
+        <w:spacing w:before="80" w:after="40"/>
+        <w:jc w:val="center"/>
+      </w:pPr>
+      <w:r>
+        <w:drawing>
+          <wp:inline xmlns:a="http://schemas.openxmlformats.org/drawingml/2006/main" xmlns:pic="http://schemas.openxmlformats.org/drawingml/2006/picture">
+            <wp:extent cx="5400000" cy="4813483"/>
+            <wp:docPr id="8" name="Picture 8"/>
+            <wp:cNvGraphicFramePr>
+              <a:graphicFrameLocks noChangeAspect="1"/>
+            </wp:cNvGraphicFramePr>
+            <a:graphic>
+              <a:graphicData uri="http://schemas.openxmlformats.org/drawingml/2006/picture">
+                <pic:pic>
+                  <pic:nvPicPr>
+                    <pic:cNvPr id="0" name="P3_confusion_matrix.png"/>
+                    <pic:cNvPicPr/>
+                  </pic:nvPicPr>
+                  <pic:blipFill>
+                    <a:blip r:embed="rId20"/>
+                    <a:stretch>
+                      <a:fillRect/>
+                    </a:stretch>
+                  </pic:blipFill>
+                  <pic:spPr>
+                    <a:xfrm>
+                      <a:off x="0" y="0"/>
+                      <a:ext cx="5400000" cy="4813483"/>
+                    </a:xfrm>
+                    <a:prstGeom prst="rect"/>
+                  </pic:spPr>
+                </pic:pic>
+              </a:graphicData>
+            </a:graphic>
+          </wp:inline>
+        </w:drawing>
+      </w:r>
+    </w:p>
+    <w:p>
+      <w:pPr>
+        <w:spacing w:after="160"/>
+        <w:jc w:val="center"/>
+      </w:pPr>
+      <w:r>
+        <w:rPr>
+          <w:rFonts w:ascii="Times New Roman" w:hAnsi="Times New Roman" w:cs="Times New Roman"/>
+          <w:b/>
+          <w:i w:val="0"/>
+          <w:sz w:val="20"/>
+        </w:rPr>
+        <w:t>Figure 8: Confusion Matrix on the Hold-Out Test Fold</w:t>
+      </w:r>
+    </w:p>
+    <w:p>
+      <w:pPr>
+        <w:spacing w:before="80" w:after="40"/>
         <w:jc w:val="center"/>
       </w:pPr>
       <w:r>
         <w:drawing>
           <wp:inline xmlns:a="http://schemas.openxmlformats.org/drawingml/2006/main" xmlns:pic="http://schemas.openxmlformats.org/drawingml/2006/picture">
             <wp:extent cx="5400000" cy="4136476"/>
-            <wp:docPr id="11" name="Picture 11"/>
+            <wp:docPr id="9" name="Picture 9"/>
             <wp:cNvGraphicFramePr>
               <a:graphicFrameLocks noChangeAspect="1"/>
             </wp:cNvGraphicFramePr>
@@ -3237,7 +2687,7 @@
                     <pic:cNvPicPr/>
                   </pic:nvPicPr>
                   <pic:blipFill>
-                    <a:blip r:embed="rId23"/>
+                    <a:blip r:embed="rId21"/>
                     <a:stretch>
                       <a:fillRect/>
                     </a:stretch>
@@ -3258,7 +2708,7 @@
     </w:p>
     <w:p>
       <w:pPr>
-        <w:spacing w:after="200"/>
+        <w:spacing w:after="160"/>
         <w:jc w:val="center"/>
       </w:pPr>
       <w:r>
@@ -3268,302 +2718,12 @@
           <w:i w:val="0"/>
           <w:sz w:val="20"/>
         </w:rPr>
-        <w:t>Figure 11: Data Quality Scorecard, Post-Cleanup State</w:t>
+        <w:t>Figure 9: Data Quality Scorecard, Post-Cleanup State</w:t>
       </w:r>
     </w:p>
     <w:p>
       <w:pPr>
-        <w:spacing w:before="120" w:after="40"/>
-        <w:jc w:val="center"/>
-      </w:pPr>
-      <w:r>
-        <w:drawing>
-          <wp:inline xmlns:a="http://schemas.openxmlformats.org/drawingml/2006/main" xmlns:pic="http://schemas.openxmlformats.org/drawingml/2006/picture">
-            <wp:extent cx="5400000" cy="3187689"/>
-            <wp:docPr id="12" name="Picture 12"/>
-            <wp:cNvGraphicFramePr>
-              <a:graphicFrameLocks noChangeAspect="1"/>
-            </wp:cNvGraphicFramePr>
-            <a:graphic>
-              <a:graphicData uri="http://schemas.openxmlformats.org/drawingml/2006/picture">
-                <pic:pic>
-                  <pic:nvPicPr>
-                    <pic:cNvPr id="0" name="P1_feature_importance.png"/>
-                    <pic:cNvPicPr/>
-                  </pic:nvPicPr>
-                  <pic:blipFill>
-                    <a:blip r:embed="rId24"/>
-                    <a:stretch>
-                      <a:fillRect/>
-                    </a:stretch>
-                  </pic:blipFill>
-                  <pic:spPr>
-                    <a:xfrm>
-                      <a:off x="0" y="0"/>
-                      <a:ext cx="5400000" cy="3187689"/>
-                    </a:xfrm>
-                    <a:prstGeom prst="rect"/>
-                  </pic:spPr>
-                </pic:pic>
-              </a:graphicData>
-            </a:graphic>
-          </wp:inline>
-        </w:drawing>
-      </w:r>
-    </w:p>
-    <w:p>
-      <w:pPr>
-        <w:spacing w:after="200"/>
-        <w:jc w:val="center"/>
-      </w:pPr>
-      <w:r>
-        <w:rPr>
-          <w:rFonts w:ascii="Times New Roman" w:hAnsi="Times New Roman" w:cs="Times New Roman"/>
-          <w:b/>
-          <w:i w:val="0"/>
-          <w:sz w:val="20"/>
-        </w:rPr>
-        <w:t>Figure 12: Random Forest Feature Importance</w:t>
-      </w:r>
-    </w:p>
-    <w:p>
-      <w:pPr>
-        <w:spacing w:before="120" w:after="40"/>
-        <w:jc w:val="center"/>
-      </w:pPr>
-      <w:r>
-        <w:drawing>
-          <wp:inline xmlns:a="http://schemas.openxmlformats.org/drawingml/2006/main" xmlns:pic="http://schemas.openxmlformats.org/drawingml/2006/picture">
-            <wp:extent cx="5400000" cy="5461998"/>
-            <wp:docPr id="13" name="Picture 13"/>
-            <wp:cNvGraphicFramePr>
-              <a:graphicFrameLocks noChangeAspect="1"/>
-            </wp:cNvGraphicFramePr>
-            <a:graphic>
-              <a:graphicData uri="http://schemas.openxmlformats.org/drawingml/2006/picture">
-                <pic:pic>
-                  <pic:nvPicPr>
-                    <pic:cNvPr id="0" name="P2_roc_curve.png"/>
-                    <pic:cNvPicPr/>
-                  </pic:nvPicPr>
-                  <pic:blipFill>
-                    <a:blip r:embed="rId25"/>
-                    <a:stretch>
-                      <a:fillRect/>
-                    </a:stretch>
-                  </pic:blipFill>
-                  <pic:spPr>
-                    <a:xfrm>
-                      <a:off x="0" y="0"/>
-                      <a:ext cx="5400000" cy="5461998"/>
-                    </a:xfrm>
-                    <a:prstGeom prst="rect"/>
-                  </pic:spPr>
-                </pic:pic>
-              </a:graphicData>
-            </a:graphic>
-          </wp:inline>
-        </w:drawing>
-      </w:r>
-    </w:p>
-    <w:p>
-      <w:pPr>
-        <w:spacing w:after="200"/>
-        <w:jc w:val="center"/>
-      </w:pPr>
-      <w:r>
-        <w:rPr>
-          <w:rFonts w:ascii="Times New Roman" w:hAnsi="Times New Roman" w:cs="Times New Roman"/>
-          <w:b/>
-          <w:i w:val="0"/>
-          <w:sz w:val="20"/>
-        </w:rPr>
-        <w:t>Figure 13: ROC Curve on the Hold-Out Test Fold</w:t>
-      </w:r>
-    </w:p>
-    <w:p>
-      <w:pPr>
-        <w:spacing w:before="120" w:after="40"/>
-        <w:jc w:val="center"/>
-      </w:pPr>
-      <w:r>
-        <w:drawing>
-          <wp:inline xmlns:a="http://schemas.openxmlformats.org/drawingml/2006/main" xmlns:pic="http://schemas.openxmlformats.org/drawingml/2006/picture">
-            <wp:extent cx="5400000" cy="4813483"/>
-            <wp:docPr id="14" name="Picture 14"/>
-            <wp:cNvGraphicFramePr>
-              <a:graphicFrameLocks noChangeAspect="1"/>
-            </wp:cNvGraphicFramePr>
-            <a:graphic>
-              <a:graphicData uri="http://schemas.openxmlformats.org/drawingml/2006/picture">
-                <pic:pic>
-                  <pic:nvPicPr>
-                    <pic:cNvPr id="0" name="P3_confusion_matrix.png"/>
-                    <pic:cNvPicPr/>
-                  </pic:nvPicPr>
-                  <pic:blipFill>
-                    <a:blip r:embed="rId26"/>
-                    <a:stretch>
-                      <a:fillRect/>
-                    </a:stretch>
-                  </pic:blipFill>
-                  <pic:spPr>
-                    <a:xfrm>
-                      <a:off x="0" y="0"/>
-                      <a:ext cx="5400000" cy="4813483"/>
-                    </a:xfrm>
-                    <a:prstGeom prst="rect"/>
-                  </pic:spPr>
-                </pic:pic>
-              </a:graphicData>
-            </a:graphic>
-          </wp:inline>
-        </w:drawing>
-      </w:r>
-    </w:p>
-    <w:p>
-      <w:pPr>
-        <w:spacing w:after="200"/>
-        <w:jc w:val="center"/>
-      </w:pPr>
-      <w:r>
-        <w:rPr>
-          <w:rFonts w:ascii="Times New Roman" w:hAnsi="Times New Roman" w:cs="Times New Roman"/>
-          <w:b/>
-          <w:i w:val="0"/>
-          <w:sz w:val="20"/>
-        </w:rPr>
-        <w:t>Figure 14: Confusion Matrix on the Hold-Out Test Fold</w:t>
-      </w:r>
-    </w:p>
-    <w:p>
-      <w:pPr>
-        <w:spacing w:before="120" w:after="40"/>
-        <w:jc w:val="center"/>
-      </w:pPr>
-      <w:r>
-        <w:drawing>
-          <wp:inline xmlns:a="http://schemas.openxmlformats.org/drawingml/2006/main" xmlns:pic="http://schemas.openxmlformats.org/drawingml/2006/picture">
-            <wp:extent cx="5400000" cy="2089857"/>
-            <wp:docPr id="15" name="Picture 15"/>
-            <wp:cNvGraphicFramePr>
-              <a:graphicFrameLocks noChangeAspect="1"/>
-            </wp:cNvGraphicFramePr>
-            <a:graphic>
-              <a:graphicData uri="http://schemas.openxmlformats.org/drawingml/2006/picture">
-                <pic:pic>
-                  <pic:nvPicPr>
-                    <pic:cNvPr id="0" name="PD2_auc.png"/>
-                    <pic:cNvPicPr/>
-                  </pic:nvPicPr>
-                  <pic:blipFill>
-                    <a:blip r:embed="rId27"/>
-                    <a:stretch>
-                      <a:fillRect/>
-                    </a:stretch>
-                  </pic:blipFill>
-                  <pic:spPr>
-                    <a:xfrm>
-                      <a:off x="0" y="0"/>
-                      <a:ext cx="5400000" cy="2089857"/>
-                    </a:xfrm>
-                    <a:prstGeom prst="rect"/>
-                  </pic:spPr>
-                </pic:pic>
-              </a:graphicData>
-            </a:graphic>
-          </wp:inline>
-        </w:drawing>
-      </w:r>
-    </w:p>
-    <w:p>
-      <w:pPr>
-        <w:spacing w:after="200"/>
-        <w:jc w:val="center"/>
-      </w:pPr>
-      <w:r>
-        <w:rPr>
-          <w:rFonts w:ascii="Times New Roman" w:hAnsi="Times New Roman" w:cs="Times New Roman"/>
-          <w:b/>
-          <w:i w:val="0"/>
-          <w:sz w:val="20"/>
-        </w:rPr>
-        <w:t>Figure 15: 5-Fold Cross-Validated ROC AUC by Fold</w:t>
-      </w:r>
-    </w:p>
-    <w:p>
-      <w:pPr>
-        <w:spacing w:before="120" w:after="40"/>
-        <w:jc w:val="center"/>
-      </w:pPr>
-      <w:r>
-        <w:drawing>
-          <wp:inline xmlns:a="http://schemas.openxmlformats.org/drawingml/2006/main" xmlns:pic="http://schemas.openxmlformats.org/drawingml/2006/picture">
-            <wp:extent cx="5400000" cy="4016842"/>
-            <wp:docPr id="16" name="Picture 16"/>
-            <wp:cNvGraphicFramePr>
-              <a:graphicFrameLocks noChangeAspect="1"/>
-            </wp:cNvGraphicFramePr>
-            <a:graphic>
-              <a:graphicData uri="http://schemas.openxmlformats.org/drawingml/2006/picture">
-                <pic:pic>
-                  <pic:nvPicPr>
-                    <pic:cNvPr id="0" name="P4_failure_heatmap.png"/>
-                    <pic:cNvPicPr/>
-                  </pic:nvPicPr>
-                  <pic:blipFill>
-                    <a:blip r:embed="rId28"/>
-                    <a:stretch>
-                      <a:fillRect/>
-                    </a:stretch>
-                  </pic:blipFill>
-                  <pic:spPr>
-                    <a:xfrm>
-                      <a:off x="0" y="0"/>
-                      <a:ext cx="5400000" cy="4016842"/>
-                    </a:xfrm>
-                    <a:prstGeom prst="rect"/>
-                  </pic:spPr>
-                </pic:pic>
-              </a:graphicData>
-            </a:graphic>
-          </wp:inline>
-        </w:drawing>
-      </w:r>
-    </w:p>
-    <w:p>
-      <w:pPr>
-        <w:spacing w:after="200"/>
-        <w:jc w:val="center"/>
-      </w:pPr>
-      <w:r>
-        <w:rPr>
-          <w:rFonts w:ascii="Times New Roman" w:hAnsi="Times New Roman" w:cs="Times New Roman"/>
-          <w:b/>
-          <w:i w:val="0"/>
-          <w:sz w:val="20"/>
-        </w:rPr>
-        <w:t>Figure 16: Failure Rate Heatmap, Python Pipeline Cross-Check</w:t>
-      </w:r>
-    </w:p>
-    <w:p>
-      <w:pPr>
-        <w:spacing w:after="160" w:line="276" w:lineRule="auto"/>
-        <w:jc w:val="both"/>
-      </w:pPr>
-      <w:r>
-        <w:rPr>
-          <w:rFonts w:ascii="Times New Roman" w:hAnsi="Times New Roman" w:cs="Times New Roman"/>
-          <w:b w:val="0"/>
-          <w:i w:val="0"/>
-          <w:sz w:val="22"/>
-        </w:rPr>
-        <w:t>Figure 11 shows the data after cleanup: 0 duplicate primary keys across all 9 tables, 0 foreign key violations, and the distinct zone count dropping from a pre-cleanup peak of 32 (in orders, with 16 spellings across 2 zone fields) down to 14 (7 canonical values across 2 fields). The chi square test reproduces the R value exactly. The random forest 5-fold AUC of 0.487 plus or minus 0.064 (Figure 15) is indistinguishable from a coin toss; the ROC curve in Figure 13 sits effectively on the diagonal, and the confusion matrix in Figure 14 confirms the model defaults to predicting non-failure for almost every order. The failure heatmap in Figure 16 cross-checks the equivalent R chart and reaches the same numbers, completing the 3-way validation across paradigms.</w:t>
-      </w:r>
-    </w:p>
-    <w:p>
-      <w:pPr>
-        <w:spacing w:before="320" w:after="120"/>
+        <w:spacing w:before="280" w:after="80"/>
       </w:pPr>
       <w:r>
         <w:rPr>
@@ -3577,23 +2737,18 @@
     </w:p>
     <w:p>
       <w:pPr>
-        <w:spacing w:before="240" w:after="80"/>
+        <w:spacing w:after="120" w:line="276" w:lineRule="auto"/>
+        <w:jc w:val="both"/>
       </w:pPr>
       <w:r>
         <w:rPr>
           <w:rFonts w:ascii="Times New Roman" w:hAnsi="Times New Roman" w:cs="Times New Roman"/>
           <w:b/>
           <w:i w:val="0"/>
-          <w:sz w:val="26"/>
+          <w:sz w:val="22"/>
         </w:rPr>
-        <w:t>7.1 What the data really says</w:t>
+        <w:t>Limitations.</w:t>
       </w:r>
-    </w:p>
-    <w:p>
-      <w:pPr>
-        <w:spacing w:after="160" w:line="276" w:lineRule="auto"/>
-        <w:jc w:val="both"/>
-      </w:pPr>
       <w:r>
         <w:rPr>
           <w:rFonts w:ascii="Times New Roman" w:hAnsi="Times New Roman" w:cs="Times New Roman"/>
@@ -3601,28 +2756,23 @@
           <w:i w:val="0"/>
           <w:sz w:val="22"/>
         </w:rPr>
-        <w:t>3 independent lines of evidence converge on the same conclusion. The descriptive failure heatmap in Section 5 shows Central and North as visibly elevated. The chi square test reaches statistical significance on pickup zone (p = 0.0103) and fails to reject for service type, route distance and app engagement. The scikit-learn random forest, given 9 candidate features, cannot predict per-order failure better than chance. Taken together, the signal is real at the zone level and absent at the order level. NorthStar should treat operational improvement as a zone problem (route planning, hub capacity, fleet allocation in Central and North) rather than as an order-classification problem.</w:t>
+        <w:t xml:space="preserve"> The dataset is small (1,250 orders, 132 failures), so the chi square is a population-level summary rather than a per-cell verdict; standardised residuals would identify the specific cells driving the rejection. I did not apply Bonferroni correction across the 4 hypothesis tests, which inflates the family-wise error rate to about 18.5%; the p of 0.0103 is robust but should be replicated on more data. The random forest uses mean decrease in impurity, biased toward continuous and high-cardinality features; permutation importance is the more rigorous alternative.</w:t>
       </w:r>
     </w:p>
     <w:p>
       <w:pPr>
-        <w:spacing w:before="240" w:after="80"/>
+        <w:spacing w:after="120" w:line="276" w:lineRule="auto"/>
+        <w:jc w:val="both"/>
       </w:pPr>
       <w:r>
         <w:rPr>
           <w:rFonts w:ascii="Times New Roman" w:hAnsi="Times New Roman" w:cs="Times New Roman"/>
           <w:b/>
           <w:i w:val="0"/>
-          <w:sz w:val="26"/>
+          <w:sz w:val="22"/>
         </w:rPr>
-        <w:t>7.2 Limitations I should own</w:t>
+        <w:t>Methodology.</w:t>
       </w:r>
-    </w:p>
-    <w:p>
-      <w:pPr>
-        <w:spacing w:after="160" w:line="276" w:lineRule="auto"/>
-        <w:jc w:val="both"/>
-      </w:pPr>
       <w:r>
         <w:rPr>
           <w:rFonts w:ascii="Times New Roman" w:hAnsi="Times New Roman" w:cs="Times New Roman"/>
@@ -3630,14 +2780,23 @@
           <w:i w:val="0"/>
           <w:sz w:val="22"/>
         </w:rPr>
-        <w:t>My dataset is small. 132 failures spread across 12 zone-by-service cells means some cells have only a handful of observations, and the chi square is a population-level summary rather than a per-cell verdict. Standardised residuals would identify which cells specifically drive the rejection, which is a follow-up I would run on more data. I did not apply multiple-comparison correction across my 4 hypothesis tests; with 4 tests, the family-wise error rate at alpha equals 0.05 is around 18.5 percent, so the chi square's p of 0.0103 is robust but should be replicated on a larger sample before being treated as definitive.</w:t>
+        <w:t xml:space="preserve"> Running the same business questions through 4 paradigms is a check no single-implementation project can offer. When MongoDB's $group, SQL's GROUP BY, R's dplyr and pandas's groupby return the same numbers, every joining and cleanup step is independently validated. The chi square on pickup zone agrees between R and scipy to 4 decimal places — this is the strongest evidence that the contingency table is correct in both pipelines.</w:t>
       </w:r>
     </w:p>
     <w:p>
       <w:pPr>
-        <w:spacing w:after="160" w:line="276" w:lineRule="auto"/>
+        <w:spacing w:after="120" w:line="276" w:lineRule="auto"/>
         <w:jc w:val="both"/>
       </w:pPr>
+      <w:r>
+        <w:rPr>
+          <w:rFonts w:ascii="Times New Roman" w:hAnsi="Times New Roman" w:cs="Times New Roman"/>
+          <w:b/>
+          <w:i w:val="0"/>
+          <w:sz w:val="22"/>
+        </w:rPr>
+        <w:t>Next steps.</w:t>
+      </w:r>
       <w:r>
         <w:rPr>
           <w:rFonts w:ascii="Times New Roman" w:hAnsi="Times New Roman" w:cs="Times New Roman"/>
@@ -3645,85 +2804,12 @@
           <w:i w:val="0"/>
           <w:sz w:val="22"/>
         </w:rPr>
-        <w:t>The random forest uses mean decrease in impurity for feature importance, which is biased toward continuous and high-cardinality features. Permutation importance would be the more rigorous alternative. The model also runs at a single random seed with a fixed train/test split ratio, so the reported AUC is a point estimate; nested cross-validation with hyperparameter search would tighten the generalisation estimate. None of this changes the headline conclusion (the AUC is so close to 0.5 that no amount of tuning would rescue it) but the methodological honesty matters.</w:t>
+        <w:t xml:space="preserve"> First, denormalise driver attributes onto orders_aggregate so the $lookup disappears from the analytical workload (the join is the most expensive operation I run). Second, gather external features the dataset never sees — weather, road closures, real-time traffic — and rerun the random forest with them; the null result is almost certainly because the predictive signal lives outside the operational data, not inside it. Third, drill into the chi square residuals to turn the population finding into a per zone-by-service shopping list.</w:t>
       </w:r>
     </w:p>
     <w:p>
       <w:pPr>
-        <w:spacing w:after="160" w:line="276" w:lineRule="auto"/>
-        <w:jc w:val="both"/>
-      </w:pPr>
-      <w:r>
-        <w:rPr>
-          <w:rFonts w:ascii="Times New Roman" w:hAnsi="Times New Roman" w:cs="Times New Roman"/>
-          <w:b w:val="0"/>
-          <w:i w:val="0"/>
-          <w:sz w:val="22"/>
-        </w:rPr>
-        <w:t>On the engineering side, the embedded MongoDB schema optimises for reads at the cost of write amplification and some duplicated data. It is the right design for this analytical workload but the wrong design for a live transactional system. PyMongo is pinned at version 3.12 because that is what the module brief documents, although 4.x would offer cleaner type hints and a tighter aggregation API. SQLite is the engine I picked for the SQL in R section; a production deployment on PostgreSQL or MySQL would behave differently under concurrent workloads, and the 6 join indexes I added by hand should be validated against the actual workload with EXPLAIN QUERY PLAN before being treated as final.</w:t>
-      </w:r>
-    </w:p>
-    <w:p>
-      <w:pPr>
-        <w:spacing w:before="240" w:after="80"/>
-      </w:pPr>
-      <w:r>
-        <w:rPr>
-          <w:rFonts w:ascii="Times New Roman" w:hAnsi="Times New Roman" w:cs="Times New Roman"/>
-          <w:b/>
-          <w:i w:val="0"/>
-          <w:sz w:val="26"/>
-        </w:rPr>
-        <w:t>7.3 What I would do next</w:t>
-      </w:r>
-    </w:p>
-    <w:p>
-      <w:pPr>
-        <w:spacing w:after="160" w:line="276" w:lineRule="auto"/>
-        <w:jc w:val="both"/>
-      </w:pPr>
-      <w:r>
-        <w:rPr>
-          <w:rFonts w:ascii="Times New Roman" w:hAnsi="Times New Roman" w:cs="Times New Roman"/>
-          <w:b w:val="0"/>
-          <w:i w:val="0"/>
-          <w:sz w:val="22"/>
-        </w:rPr>
-        <w:t>If I were extending this project beyond the coursework, I would do 3 things. First, denormalise the driver attributes onto orders_aggregate so the $lookup stage disappears from the analytical pipeline; the join is the most expensive operation I run, and refreshing the denormalised view on a schedule is cheap. Second, gather external features the dataset never sees (weather, road closures, real-time traffic, driver fatigue) and rerun the random forest with them; the current null result is almost certainly because the predictive signal lives outside the operational data, not inside it. Third, drill into the chi square residuals for the failing zones to identify which specific zone-by-service-type cells drive the global association; that turns a population finding into an operational shopping list.</w:t>
-      </w:r>
-    </w:p>
-    <w:p>
-      <w:pPr>
-        <w:spacing w:before="240" w:after="80"/>
-      </w:pPr>
-      <w:r>
-        <w:rPr>
-          <w:rFonts w:ascii="Times New Roman" w:hAnsi="Times New Roman" w:cs="Times New Roman"/>
-          <w:b/>
-          <w:i w:val="0"/>
-          <w:sz w:val="26"/>
-        </w:rPr>
-        <w:t>7.4 Cross-paradigm validation as a methodology</w:t>
-      </w:r>
-    </w:p>
-    <w:p>
-      <w:pPr>
-        <w:spacing w:after="160" w:line="276" w:lineRule="auto"/>
-        <w:jc w:val="both"/>
-      </w:pPr>
-      <w:r>
-        <w:rPr>
-          <w:rFonts w:ascii="Times New Roman" w:hAnsi="Times New Roman" w:cs="Times New Roman"/>
-          <w:b w:val="0"/>
-          <w:i w:val="0"/>
-          <w:sz w:val="22"/>
-        </w:rPr>
-        <w:t>The most valuable thing about running the same business questions through 4 paradigms is that I get 4 independent answers to compare. When MongoDB's $group on service_type, SQL's GROUP BY service_type, R's dplyr group_by and pandas's groupby all return the same average order value, I have very strong evidence that the joins, the cleanup and the schema are correct in every implementation. When R's chisq.test and scipy's chi2_contingency agree to 4 decimal places on the pickup zone test, I have very strong evidence that the contingency table is correct. This is a methodology I would lean on in any production-grade analytical project where the cost of a silent bug in 1 pipeline is unacceptably high.</w:t>
-      </w:r>
-    </w:p>
-    <w:p>
-      <w:pPr>
-        <w:spacing w:before="320" w:after="120"/>
+        <w:spacing w:before="280" w:after="80"/>
       </w:pPr>
       <w:r>
         <w:rPr>
@@ -3737,7 +2823,7 @@
     </w:p>
     <w:p>
       <w:pPr>
-        <w:spacing w:after="160" w:line="276" w:lineRule="auto"/>
+        <w:spacing w:after="120" w:line="276" w:lineRule="auto"/>
         <w:jc w:val="both"/>
       </w:pPr>
       <w:r>
@@ -3747,7 +2833,7 @@
           <w:i w:val="0"/>
           <w:sz w:val="22"/>
         </w:rPr>
-        <w:t>This consolidated report covers all 5 bands of the NorthStar coursework as a single deliverable. The MongoDB pipeline runs against a live Atlas cluster with an embedded orders_aggregate collection of 1250 documents and 12 analytical aggregations. The query optimisation experiment converts COLLSCAN to IXSCAN on 4 archetypes, with documents-examined dropping from 1250 to between 1 and 237. The SQL in R section reproduces the 8 business questions in the relational paradigm and adds a 9th expressed via RANK() OVER PARTITION BY. R analytics provides inferential validation: chi square p = 0.0103 on pickup zone, no other test significant, logistic regression isolating critical-priority orders as the only significant predictor. Python data processing closes the loop with a pandas ETL plus a 5-dimension data quality scorecard, a scipy chi square that reproduces R to 4 decimal places, and a random forest that confirms the per-order signal is absent. The actionable finding for NorthStar is operational, not analytical: target the failing zones, not the failing orders.</w:t>
+        <w:t>4 paradigms, 1 dataset, 1 conclusion. The order-level predictive signal is absent: a random forest with 9 candidate predictors cannot beat random guessing (AUC 0.487). The population-level signal is real: chi square on pickup zone reaches significance (p = 0.0103) and the descriptive heatmap shows Central and North as the elevated-failure zones. The operational recommendation for NorthStar follows from the data, not from intuition: target the failing zones, not the failing orders.</w:t>
       </w:r>
     </w:p>
     <w:sectPr>

</xml_diff>